<commit_message>
Revise editorial brief and SEO documentation for clarity and coherence
- Updated the `24-brief-editorial-blog-y-visibilidad` to clarify the role of the editorial team in defining voice and format, emphasizing the importance of referencing existing documents for consistency.
- Enhanced the `README.md` in the SEO reports to specify the relationship between the brief and other documents, ensuring clear communication of content strategies.
- Made minor adjustments to the SEO audit documentation to improve clarity regarding the technical health of the site and its implications for content publication.
</commit_message>
<xml_diff>
--- a/docs/24-brief-editorial-blog-y-visibilidad.docx
+++ b/docs/24-brief-editorial-blog-y-visibilidad.docx
@@ -14,9 +14,9 @@
       <w:r>
         <w:drawing>
           <wp:inline distT="0" distB="0" distL="0" distR="0">
-            <wp:extent cx="1428750" cy="1428750"/>
+            <wp:extent cx="1257300" cy="1257300"/>
             <wp:effectExtent t="0" r="0" b="0" l="0"/>
-            <wp:docPr id="1" name="" descr="" title=""/>
+            <wp:docPr id="1" name="logo" descr="Emblema de la Comunidad Buddhista Camino del Dharma" title="Camino del Dharma"/>
             <wp:cNvGraphicFramePr>
               <a:graphicFrameLocks xmlns:a="http://schemas.openxmlformats.org/drawingml/2006/main" noChangeAspect="1"/>
             </wp:cNvGraphicFramePr>
@@ -39,7 +39,7 @@
                   <pic:spPr bwMode="auto">
                     <a:xfrm>
                       <a:off x="0" y="0"/>
-                      <a:ext cx="1428750" cy="1428750"/>
+                      <a:ext cx="1257300" cy="1257300"/>
                     </a:xfrm>
                     <a:prstGeom prst="rect">
                       <a:avLst/>
@@ -295,7 +295,7 @@
             <w:r>
               <w:t xml:space="preserve">Rafael Figueredo Oropeza — </w:t>
             </w:r>
-            <w:hyperlink w:history="1" r:id="rIdztdn6-cg4n9isp0h6rge4">
+            <w:hyperlink w:history="1" r:id="rIdi7el6vdlxpipywh8xitb4">
               <w:r>
                 <w:rPr>
                   <w:color w:val="8C2B3D"/>
@@ -307,7 +307,7 @@
             <w:r>
               <w:t xml:space="preserve"> · </w:t>
             </w:r>
-            <w:hyperlink w:history="1" r:id="rIdvv8kaql4w84xsv2ytmvj2">
+            <w:hyperlink w:history="1" r:id="rIdunfrpqbzingr1ziddms8d">
               <w:r>
                 <w:rPr>
                   <w:color w:val="8C2B3D"/>
@@ -347,56 +347,6 @@
                 <w:sz w:val="21"/>
                 <w:szCs w:val="21"/>
               </w:rPr>
-              <w:t xml:space="preserve">Naturaleza</w:t>
-            </w:r>
-          </w:p>
-        </w:tc>
-        <w:tc>
-          <w:tcPr>
-            <w:tcW w:type="dxa" w:w="6605"/>
-            <w:tcMar>
-              <w:top w:type="dxa" w:w="90"/>
-              <w:left w:type="dxa" w:w="130"/>
-              <w:bottom w:type="dxa" w:w="90"/>
-              <w:right w:type="dxa" w:w="130"/>
-            </w:tcMar>
-            <w:vAlign w:val="center"/>
-          </w:tcPr>
-          <w:p>
-            <w:pPr>
-              <w:spacing w:after="0" w:before="0" w:line="264" w:lineRule="auto"/>
-            </w:pPr>
-            <w:r>
-              <w:t xml:space="preserve">Insumos y sugerencias, no decisiones editoriales</w:t>
-            </w:r>
-          </w:p>
-        </w:tc>
-      </w:tr>
-      <w:tr>
-        <w:tc>
-          <w:tcPr>
-            <w:tcW w:type="dxa" w:w="2568"/>
-            <w:shd w:fill="F6F0EF" w:val="clear"/>
-            <w:tcMar>
-              <w:top w:type="dxa" w:w="90"/>
-              <w:left w:type="dxa" w:w="130"/>
-              <w:bottom w:type="dxa" w:w="90"/>
-              <w:right w:type="dxa" w:w="130"/>
-            </w:tcMar>
-            <w:vAlign w:val="center"/>
-          </w:tcPr>
-          <w:p>
-            <w:pPr>
-              <w:spacing w:after="0" w:before="0" w:line="264" w:lineRule="auto"/>
-            </w:pPr>
-            <w:r>
-              <w:rPr>
-                <w:b/>
-                <w:bCs/>
-                <w:color w:val="8C2B3D"/>
-                <w:sz w:val="21"/>
-                <w:szCs w:val="21"/>
-              </w:rPr>
               <w:t xml:space="preserve">Fecha</w:t>
             </w:r>
           </w:p>
@@ -427,112 +377,6 @@
       <w:pPr>
         <w:spacing w:after="200"/>
       </w:pPr>
-    </w:p>
-    <w:p>
-      <w:pPr>
-        <w:pStyle w:val="Callout"/>
-      </w:pPr>
-      <w:r>
-        <w:rPr>
-          <w:b/>
-          <w:bCs/>
-        </w:rPr>
-        <w:t xml:space="preserve">La persona encargada decide</w:t>
-      </w:r>
-      <w:r>
-        <w:t xml:space="preserve"> qué publicar. Quien elaboró este brief </w:t>
-      </w:r>
-      <w:r>
-        <w:rPr>
-          <w:b/>
-          <w:bCs/>
-        </w:rPr>
-        <w:t xml:space="preserve">no forma parte</w:t>
-      </w:r>
-      <w:r>
-        <w:t xml:space="preserve"> de las decisiones editoriales: aquí solo hay diagnóstico y sugerencias.</w:t>
-      </w:r>
-    </w:p>
-    <w:p>
-      <w:pPr>
-        <w:pStyle w:val="Callout"/>
-      </w:pPr>
-      <w:r>
-        <w:rPr>
-          <w:b/>
-          <w:bCs/>
-        </w:rPr>
-        <w:t xml:space="preserve">Alcance:</w:t>
-      </w:r>
-      <w:r>
-        <w:t xml:space="preserve"> solo </w:t>
-      </w:r>
-      <w:r>
-        <w:rPr>
-          <w:b/>
-          <w:bCs/>
-        </w:rPr>
-        <w:t xml:space="preserve">entradas del blog</w:t>
-      </w:r>
-      <w:r>
-        <w:t xml:space="preserve"> (</w:t>
-      </w:r>
-      <w:r>
-        <w:rPr>
-          <w:rFonts w:ascii="Consolas" w:cs="Consolas" w:eastAsia="Consolas" w:hAnsi="Consolas"/>
-          <w:color w:val="8C2B3D"/>
-          <w:sz w:val="19"/>
-          <w:szCs w:val="19"/>
-          <w:shd w:fill="F6F0EF" w:val="clear"/>
-        </w:rPr>
-        <w:t xml:space="preserve">/blog/…</w:t>
-      </w:r>
-      <w:r>
-        <w:t xml:space="preserve">). </w:t>
-      </w:r>
-      <w:r>
-        <w:rPr>
-          <w:b/>
-          <w:bCs/>
-        </w:rPr>
-        <w:t xml:space="preserve">Sí</w:t>
-      </w:r>
-      <w:r>
-        <w:t xml:space="preserve"> incluye artículos o notas del blog sobre una ciudad (p. ej. "budismo en Cali"), si hay datos reales. </w:t>
-      </w:r>
-      <w:r>
-        <w:rPr>
-          <w:b/>
-          <w:bCs/>
-        </w:rPr>
-        <w:t xml:space="preserve">No</w:t>
-      </w:r>
-      <w:r>
-        <w:t xml:space="preserve"> incluye </w:t>
-      </w:r>
-      <w:r>
-        <w:rPr>
-          <w:b/>
-          <w:bCs/>
-        </w:rPr>
-        <w:t xml:space="preserve">páginas nuevas del sitio</w:t>
-      </w:r>
-      <w:r>
-        <w:t xml:space="preserve"> fuera del blog —como una sección </w:t>
-      </w:r>
-      <w:r>
-        <w:rPr>
-          <w:rFonts w:ascii="Consolas" w:cs="Consolas" w:eastAsia="Consolas" w:hAnsi="Consolas"/>
-          <w:color w:val="8C2B3D"/>
-          <w:sz w:val="19"/>
-          <w:szCs w:val="19"/>
-          <w:shd w:fill="F6F0EF" w:val="clear"/>
-        </w:rPr>
-        <w:t xml:space="preserve">/sanghas/</w:t>
-      </w:r>
-      <w:r>
-        <w:t xml:space="preserve"> con una página fija por ciudad— ni cambios en Inicio/Comunidad/Linaje/Práctica; eso es otro trabajo (comunidad y equipo técnico), ajeno a este brief.</w:t>
-      </w:r>
     </w:p>
     <w:p>
       <w:pPr>
@@ -597,7 +441,7 @@
       <w:r>
         <w:t xml:space="preserve">El sitio </w:t>
       </w:r>
-      <w:hyperlink w:history="1" r:id="rIdr_slkw7iyot6lw-jwojwj">
+      <w:hyperlink w:history="1" r:id="rIdylgv19h2_cu0ughvbhkf5">
         <w:r>
           <w:rPr>
             <w:color w:val="8C2B3D"/>
@@ -835,7 +679,6 @@
             </w:pPr>
             <w:r>
               <w:rPr>
-                <w:rFonts w:ascii="Aptos" w:cs="Aptos" w:eastAsia="Aptos" w:hAnsi="Aptos"/>
                 <w:b/>
                 <w:bCs/>
                 <w:color w:val="FFFFFF"/>
@@ -864,7 +707,6 @@
             </w:pPr>
             <w:r>
               <w:rPr>
-                <w:rFonts w:ascii="Aptos" w:cs="Aptos" w:eastAsia="Aptos" w:hAnsi="Aptos"/>
                 <w:b/>
                 <w:bCs/>
                 <w:color w:val="FFFFFF"/>
@@ -1178,7 +1020,6 @@
             </w:pPr>
             <w:r>
               <w:rPr>
-                <w:rFonts w:ascii="Aptos" w:cs="Aptos" w:eastAsia="Aptos" w:hAnsi="Aptos"/>
                 <w:b/>
                 <w:bCs/>
                 <w:color w:val="FFFFFF"/>
@@ -1207,7 +1048,6 @@
             </w:pPr>
             <w:r>
               <w:rPr>
-                <w:rFonts w:ascii="Aptos" w:cs="Aptos" w:eastAsia="Aptos" w:hAnsi="Aptos"/>
                 <w:b/>
                 <w:bCs/>
                 <w:color w:val="FFFFFF"/>
@@ -1776,7 +1616,6 @@
             </w:pPr>
             <w:r>
               <w:rPr>
-                <w:rFonts w:ascii="Aptos" w:cs="Aptos" w:eastAsia="Aptos" w:hAnsi="Aptos"/>
                 <w:b/>
                 <w:bCs/>
                 <w:color w:val="FFFFFF"/>
@@ -1805,7 +1644,6 @@
             </w:pPr>
             <w:r>
               <w:rPr>
-                <w:rFonts w:ascii="Aptos" w:cs="Aptos" w:eastAsia="Aptos" w:hAnsi="Aptos"/>
                 <w:b/>
                 <w:bCs/>
                 <w:color w:val="FFFFFF"/>
@@ -1834,7 +1672,6 @@
             </w:pPr>
             <w:r>
               <w:rPr>
-                <w:rFonts w:ascii="Aptos" w:cs="Aptos" w:eastAsia="Aptos" w:hAnsi="Aptos"/>
                 <w:b/>
                 <w:bCs/>
                 <w:color w:val="FFFFFF"/>
@@ -2136,7 +1973,6 @@
             </w:pPr>
             <w:r>
               <w:rPr>
-                <w:rFonts w:ascii="Aptos" w:cs="Aptos" w:eastAsia="Aptos" w:hAnsi="Aptos"/>
                 <w:b/>
                 <w:bCs/>
                 <w:color w:val="FFFFFF"/>
@@ -2165,7 +2001,6 @@
             </w:pPr>
             <w:r>
               <w:rPr>
-                <w:rFonts w:ascii="Aptos" w:cs="Aptos" w:eastAsia="Aptos" w:hAnsi="Aptos"/>
                 <w:b/>
                 <w:bCs/>
                 <w:color w:val="FFFFFF"/>
@@ -2194,7 +2029,6 @@
             </w:pPr>
             <w:r>
               <w:rPr>
-                <w:rFonts w:ascii="Aptos" w:cs="Aptos" w:eastAsia="Aptos" w:hAnsi="Aptos"/>
                 <w:b/>
                 <w:bCs/>
                 <w:color w:val="FFFFFF"/>
@@ -2773,7 +2607,6 @@
             </w:pPr>
             <w:r>
               <w:rPr>
-                <w:rFonts w:ascii="Aptos" w:cs="Aptos" w:eastAsia="Aptos" w:hAnsi="Aptos"/>
                 <w:b/>
                 <w:bCs/>
                 <w:color w:val="FFFFFF"/>
@@ -2802,7 +2635,6 @@
             </w:pPr>
             <w:r>
               <w:rPr>
-                <w:rFonts w:ascii="Aptos" w:cs="Aptos" w:eastAsia="Aptos" w:hAnsi="Aptos"/>
                 <w:b/>
                 <w:bCs/>
                 <w:color w:val="FFFFFF"/>
@@ -3251,44 +3083,45 @@
         <w:t xml:space="preserve">Pieza = artículo del blog</w:t>
       </w:r>
       <w:r>
-        <w:t xml:space="preserve">: una entrada nueva en la sección Blog del sitio, con su propia dirección (como la entrada sobre la sangha y la hiperconexión).</w:t>
-      </w:r>
-    </w:p>
-    <w:p>
-      <w:r>
-        <w:rPr>
-          <w:b/>
-          <w:bCs/>
-        </w:rPr>
-        <w:t xml:space="preserve">No tocar:</w:t>
-      </w:r>
-      <w:r>
-        <w:t xml:space="preserve"> textos fijos de Inicio, Comunidad, Linaje y Práctica. Son copy oficial de la comunidad y </w:t>
-      </w:r>
-      <w:r>
-        <w:rPr>
-          <w:b/>
-          <w:bCs/>
-        </w:rPr>
-        <w:t xml:space="preserve">no se parafrasean</w:t>
-      </w:r>
-      <w:r>
-        <w:t xml:space="preserve">; el blog </w:t>
-      </w:r>
-      <w:r>
-        <w:rPr>
-          <w:b/>
-          <w:bCs/>
-        </w:rPr>
-        <w:t xml:space="preserve">complementa</w:t>
-      </w:r>
-      <w:r>
-        <w:t xml:space="preserve">, no sustituye.</w:t>
-      </w:r>
-    </w:p>
-    <w:p>
-      <w:r>
-        <w:t xml:space="preserve">En el blog caben:</w:t>
+        <w:t xml:space="preserve">: una entrada nueva en la sección Blog, con su propia dirección (como la entrada actual sobre la sangha y la hiperconexión). Cada pieza es una dirección más que Google puede mostrar — por eso este brief cuenta piezas y no palabras.</w:t>
+      </w:r>
+    </w:p>
+    <w:p>
+      <w:r>
+        <w:t xml:space="preserve">Los </w:t>
+      </w:r>
+      <w:r>
+        <w:rPr>
+          <w:b/>
+          <w:bCs/>
+        </w:rPr>
+        <w:t xml:space="preserve">tipos de pieza</w:t>
+      </w:r>
+      <w:r>
+        <w:t xml:space="preserve"> y su extensión orientativa están definidos en el </w:t>
+      </w:r>
+      <w:r>
+        <w:rPr>
+          <w:b/>
+          <w:bCs/>
+        </w:rPr>
+        <w:t xml:space="preserve">Sistema editorial</w:t>
+      </w:r>
+      <w:r>
+        <w:t xml:space="preserve"> (</w:t>
+      </w:r>
+      <w:r>
+        <w:rPr>
+          <w:rFonts w:ascii="Consolas" w:cs="Consolas" w:eastAsia="Consolas" w:hAnsi="Consolas"/>
+          <w:color w:val="8C2B3D"/>
+          <w:sz w:val="19"/>
+          <w:szCs w:val="19"/>
+          <w:shd w:fill="F6F0EF" w:val="clear"/>
+        </w:rPr>
+        <w:t xml:space="preserve">23</w:t>
+      </w:r>
+      <w:r>
+        <w:t xml:space="preserve"> §4.0 y §4.3): reflexión, artículo educativo y nota de contexto. Lo que añade la mirada SEO es cómo se comporta cada uno ante las búsquedas:</w:t>
       </w:r>
     </w:p>
     <w:tbl>
@@ -3304,9 +3137,8 @@
         </w:tblBorders>
       </w:tblPr>
       <w:tblGrid>
-        <w:gridCol w:w="1475"/>
-        <w:gridCol w:w="3849"/>
-        <w:gridCol w:w="3849"/>
+        <w:gridCol w:w="2972"/>
+        <w:gridCol w:w="6201"/>
       </w:tblGrid>
       <w:tr>
         <w:trPr>
@@ -3314,7 +3146,7 @@
         </w:trPr>
         <w:tc>
           <w:tcPr>
-            <w:tcW w:type="dxa" w:w="1475"/>
+            <w:tcW w:type="dxa" w:w="2972"/>
             <w:shd w:fill="8C2B3D" w:val="clear"/>
             <w:tcMar>
               <w:top w:type="dxa" w:w="90"/>
@@ -3330,49 +3162,40 @@
             </w:pPr>
             <w:r>
               <w:rPr>
-                <w:rFonts w:ascii="Aptos" w:cs="Aptos" w:eastAsia="Aptos" w:hAnsi="Aptos"/>
                 <w:b/>
                 <w:bCs/>
                 <w:color w:val="FFFFFF"/>
                 <w:sz w:val="21"/>
                 <w:szCs w:val="21"/>
               </w:rPr>
-              <w:t xml:space="preserve">Tipo</w:t>
-            </w:r>
-          </w:p>
-        </w:tc>
-        <w:tc>
-          <w:tcPr>
-            <w:tcW w:type="dxa" w:w="3849"/>
-            <w:shd w:fill="8C2B3D" w:val="clear"/>
-            <w:tcMar>
-              <w:top w:type="dxa" w:w="90"/>
-              <w:left w:type="dxa" w:w="130"/>
-              <w:bottom w:type="dxa" w:w="90"/>
-              <w:right w:type="dxa" w:w="130"/>
-            </w:tcMar>
-          </w:tcPr>
-          <w:p>
-            <w:pPr>
-              <w:spacing w:after="0" w:before="0" w:line="264" w:lineRule="auto"/>
-              <w:jc w:val="left"/>
-            </w:pPr>
-            <w:r>
-              <w:rPr>
-                <w:rFonts w:ascii="Aptos" w:cs="Aptos" w:eastAsia="Aptos" w:hAnsi="Aptos"/>
+              <w:t xml:space="preserve">Tipo de pieza (</w:t>
+            </w:r>
+            <w:r>
+              <w:rPr>
+                <w:rFonts w:ascii="Consolas" w:cs="Consolas" w:eastAsia="Consolas" w:hAnsi="Consolas"/>
+                <w:b/>
+                <w:bCs/>
+                <w:color w:val="FFFFFF"/>
+                <w:sz w:val="19"/>
+                <w:szCs w:val="19"/>
+              </w:rPr>
+              <w:t xml:space="preserve">23</w:t>
+            </w:r>
+            <w:r>
+              <w:rPr>
                 <w:b/>
                 <w:bCs/>
                 <w:color w:val="FFFFFF"/>
                 <w:sz w:val="21"/>
                 <w:szCs w:val="21"/>
               </w:rPr>
-              <w:t xml:space="preserve">Para qué sirve</w:t>
-            </w:r>
-          </w:p>
-        </w:tc>
-        <w:tc>
-          <w:tcPr>
-            <w:tcW w:type="dxa" w:w="3849"/>
+              <w:t xml:space="preserve"> §4.0)</w:t>
+            </w:r>
+          </w:p>
+        </w:tc>
+        <w:tc>
+          <w:tcPr>
+            <w:tcW w:type="dxa" w:w="6201"/>
             <w:shd w:fill="8C2B3D" w:val="clear"/>
             <w:tcMar>
               <w:top w:type="dxa" w:w="90"/>
@@ -3388,14 +3211,13 @@
             </w:pPr>
             <w:r>
               <w:rPr>
-                <w:rFonts w:ascii="Aptos" w:cs="Aptos" w:eastAsia="Aptos" w:hAnsi="Aptos"/>
                 <w:b/>
                 <w:bCs/>
                 <w:color w:val="FFFFFF"/>
                 <w:sz w:val="21"/>
                 <w:szCs w:val="21"/>
               </w:rPr>
-              <w:t xml:space="preserve">Ejemplo</w:t>
+              <w:t xml:space="preserve">Qué aporta en visibilidad</w:t>
             </w:r>
           </w:p>
         </w:tc>
@@ -3403,7 +3225,7 @@
       <w:tr>
         <w:tc>
           <w:tcPr>
-            <w:tcW w:type="dxa" w:w="1475"/>
+            <w:tcW w:type="dxa" w:w="2972"/>
             <w:shd w:fill="F6F0EF" w:val="clear"/>
             <w:tcMar>
               <w:top w:type="dxa" w:w="90"/>
@@ -3422,13 +3244,13 @@
                 <w:b/>
                 <w:bCs/>
               </w:rPr>
-              <w:t xml:space="preserve">Reflexión</w:t>
-            </w:r>
-          </w:p>
-        </w:tc>
-        <w:tc>
-          <w:tcPr>
-            <w:tcW w:type="dxa" w:w="3849"/>
+              <w:t xml:space="preserve">Artículo educativo</w:t>
+            </w:r>
+          </w:p>
+        </w:tc>
+        <w:tc>
+          <w:tcPr>
+            <w:tcW w:type="dxa" w:w="6201"/>
             <w:shd w:fill="F6F0EF" w:val="clear"/>
             <w:tcMar>
               <w:top w:type="dxa" w:w="90"/>
@@ -3443,28 +3265,7 @@
               <w:jc w:val="left"/>
             </w:pPr>
             <w:r>
-              <w:t xml:space="preserve">Acompañar, profundizar en una experiencia o enseñanza</w:t>
-            </w:r>
-          </w:p>
-        </w:tc>
-        <w:tc>
-          <w:tcPr>
-            <w:tcW w:type="dxa" w:w="3849"/>
-            <w:shd w:fill="F6F0EF" w:val="clear"/>
-            <w:tcMar>
-              <w:top w:type="dxa" w:w="90"/>
-              <w:left w:type="dxa" w:w="130"/>
-              <w:bottom w:type="dxa" w:w="90"/>
-              <w:right w:type="dxa" w:w="130"/>
-            </w:tcMar>
-          </w:tcPr>
-          <w:p>
-            <w:pPr>
-              <w:spacing w:after="0" w:before="0" w:line="264" w:lineRule="auto"/>
-              <w:jc w:val="left"/>
-            </w:pPr>
-            <w:r>
-              <w:t xml:space="preserve">La entrada actual sobre hiperconexión y sangha</w:t>
+              <w:t xml:space="preserve">El que más búsquedas nuevas atrae: responde preguntas que hoy ninguna página del sitio responde</w:t>
             </w:r>
           </w:p>
         </w:tc>
@@ -3472,65 +3273,45 @@
       <w:tr>
         <w:tc>
           <w:tcPr>
-            <w:tcW w:type="dxa" w:w="1475"/>
-            <w:tcMar>
-              <w:top w:type="dxa" w:w="90"/>
-              <w:left w:type="dxa" w:w="130"/>
-              <w:bottom w:type="dxa" w:w="90"/>
-              <w:right w:type="dxa" w:w="130"/>
-            </w:tcMar>
-          </w:tcPr>
-          <w:p>
-            <w:pPr>
-              <w:spacing w:after="0" w:before="0" w:line="264" w:lineRule="auto"/>
-              <w:jc w:val="left"/>
-            </w:pPr>
-            <w:r>
-              <w:rPr>
-                <w:b/>
-                <w:bCs/>
-              </w:rPr>
-              <w:t xml:space="preserve">Artículo educativo</w:t>
-            </w:r>
-          </w:p>
-        </w:tc>
-        <w:tc>
-          <w:tcPr>
-            <w:tcW w:type="dxa" w:w="3849"/>
-            <w:tcMar>
-              <w:top w:type="dxa" w:w="90"/>
-              <w:left w:type="dxa" w:w="130"/>
-              <w:bottom w:type="dxa" w:w="90"/>
-              <w:right w:type="dxa" w:w="130"/>
-            </w:tcMar>
-          </w:tcPr>
-          <w:p>
-            <w:pPr>
-              <w:spacing w:after="0" w:before="0" w:line="264" w:lineRule="auto"/>
-              <w:jc w:val="left"/>
-            </w:pPr>
-            <w:r>
-              <w:t xml:space="preserve">Explicar un tema a quien no conoce la tradición</w:t>
-            </w:r>
-          </w:p>
-        </w:tc>
-        <w:tc>
-          <w:tcPr>
-            <w:tcW w:type="dxa" w:w="3849"/>
-            <w:tcMar>
-              <w:top w:type="dxa" w:w="90"/>
-              <w:left w:type="dxa" w:w="130"/>
-              <w:bottom w:type="dxa" w:w="90"/>
-              <w:right w:type="dxa" w:w="130"/>
-            </w:tcMar>
-          </w:tcPr>
-          <w:p>
-            <w:pPr>
-              <w:spacing w:after="0" w:before="0" w:line="264" w:lineRule="auto"/>
-              <w:jc w:val="left"/>
-            </w:pPr>
-            <w:r>
-              <w:t xml:space="preserve">“¿Qué es el budismo Chan en la vida cotidiana?”</w:t>
+            <w:tcW w:type="dxa" w:w="2972"/>
+            <w:tcMar>
+              <w:top w:type="dxa" w:w="90"/>
+              <w:left w:type="dxa" w:w="130"/>
+              <w:bottom w:type="dxa" w:w="90"/>
+              <w:right w:type="dxa" w:w="130"/>
+            </w:tcMar>
+          </w:tcPr>
+          <w:p>
+            <w:pPr>
+              <w:spacing w:after="0" w:before="0" w:line="264" w:lineRule="auto"/>
+              <w:jc w:val="left"/>
+            </w:pPr>
+            <w:r>
+              <w:rPr>
+                <w:b/>
+                <w:bCs/>
+              </w:rPr>
+              <w:t xml:space="preserve">Nota de contexto</w:t>
+            </w:r>
+          </w:p>
+        </w:tc>
+        <w:tc>
+          <w:tcPr>
+            <w:tcW w:type="dxa" w:w="6201"/>
+            <w:tcMar>
+              <w:top w:type="dxa" w:w="90"/>
+              <w:left w:type="dxa" w:w="130"/>
+              <w:bottom w:type="dxa" w:w="90"/>
+              <w:right w:type="dxa" w:w="130"/>
+            </w:tcMar>
+          </w:tcPr>
+          <w:p>
+            <w:pPr>
+              <w:spacing w:after="0" w:before="0" w:line="264" w:lineRule="auto"/>
+              <w:jc w:val="left"/>
+            </w:pPr>
+            <w:r>
+              <w:t xml:space="preserve">La única vía para las búsquedas por ciudad, y solo si hay datos reales que contar</w:t>
             </w:r>
           </w:p>
         </w:tc>
@@ -3538,7 +3319,7 @@
       <w:tr>
         <w:tc>
           <w:tcPr>
-            <w:tcW w:type="dxa" w:w="1475"/>
+            <w:tcW w:type="dxa" w:w="2972"/>
             <w:shd w:fill="F6F0EF" w:val="clear"/>
             <w:tcMar>
               <w:top w:type="dxa" w:w="90"/>
@@ -3557,13 +3338,13 @@
                 <w:b/>
                 <w:bCs/>
               </w:rPr>
-              <w:t xml:space="preserve">Nota de contexto</w:t>
-            </w:r>
-          </w:p>
-        </w:tc>
-        <w:tc>
-          <w:tcPr>
-            <w:tcW w:type="dxa" w:w="3849"/>
+              <w:t xml:space="preserve">Reflexión</w:t>
+            </w:r>
+          </w:p>
+        </w:tc>
+        <w:tc>
+          <w:tcPr>
+            <w:tcW w:type="dxa" w:w="6201"/>
             <w:shd w:fill="F6F0EF" w:val="clear"/>
             <w:tcMar>
               <w:top w:type="dxa" w:w="90"/>
@@ -3578,104 +3359,7 @@
               <w:jc w:val="left"/>
             </w:pPr>
             <w:r>
-              <w:t xml:space="preserve">Situar un hecho, lugar o actividad con datos reales</w:t>
-            </w:r>
-          </w:p>
-        </w:tc>
-        <w:tc>
-          <w:tcPr>
-            <w:tcW w:type="dxa" w:w="3849"/>
-            <w:shd w:fill="F6F0EF" w:val="clear"/>
-            <w:tcMar>
-              <w:top w:type="dxa" w:w="90"/>
-              <w:left w:type="dxa" w:w="130"/>
-              <w:bottom w:type="dxa" w:w="90"/>
-              <w:right w:type="dxa" w:w="130"/>
-            </w:tcMar>
-          </w:tcPr>
-          <w:p>
-            <w:pPr>
-              <w:spacing w:after="0" w:before="0" w:line="264" w:lineRule="auto"/>
-              <w:jc w:val="left"/>
-            </w:pPr>
-            <w:r>
-              <w:t xml:space="preserve">Nota sobre práctica en Cali, Medellín, Bogotá o Barranquilla — </w:t>
-            </w:r>
-            <w:r>
-              <w:rPr>
-                <w:b/>
-                <w:bCs/>
-              </w:rPr>
-              <w:t xml:space="preserve">solo</w:t>
-            </w:r>
-            <w:r>
-              <w:t xml:space="preserve"> si hay información verificable</w:t>
-            </w:r>
-          </w:p>
-        </w:tc>
-      </w:tr>
-      <w:tr>
-        <w:tc>
-          <w:tcPr>
-            <w:tcW w:type="dxa" w:w="1475"/>
-            <w:tcMar>
-              <w:top w:type="dxa" w:w="90"/>
-              <w:left w:type="dxa" w:w="130"/>
-              <w:bottom w:type="dxa" w:w="90"/>
-              <w:right w:type="dxa" w:w="130"/>
-            </w:tcMar>
-          </w:tcPr>
-          <w:p>
-            <w:pPr>
-              <w:spacing w:after="0" w:before="0" w:line="264" w:lineRule="auto"/>
-              <w:jc w:val="left"/>
-            </w:pPr>
-            <w:r>
-              <w:rPr>
-                <w:b/>
-                <w:bCs/>
-              </w:rPr>
-              <w:t xml:space="preserve">Relato o entrevista</w:t>
-            </w:r>
-          </w:p>
-        </w:tc>
-        <w:tc>
-          <w:tcPr>
-            <w:tcW w:type="dxa" w:w="3849"/>
-            <w:tcMar>
-              <w:top w:type="dxa" w:w="90"/>
-              <w:left w:type="dxa" w:w="130"/>
-              <w:bottom w:type="dxa" w:w="90"/>
-              <w:right w:type="dxa" w:w="130"/>
-            </w:tcMar>
-          </w:tcPr>
-          <w:p>
-            <w:pPr>
-              <w:spacing w:after="0" w:before="0" w:line="264" w:lineRule="auto"/>
-              <w:jc w:val="left"/>
-            </w:pPr>
-            <w:r>
-              <w:t xml:space="preserve">Mostrar cómo vive la práctica alguien de la sangha, con su voz</w:t>
-            </w:r>
-          </w:p>
-        </w:tc>
-        <w:tc>
-          <w:tcPr>
-            <w:tcW w:type="dxa" w:w="3849"/>
-            <w:tcMar>
-              <w:top w:type="dxa" w:w="90"/>
-              <w:left w:type="dxa" w:w="130"/>
-              <w:bottom w:type="dxa" w:w="90"/>
-              <w:right w:type="dxa" w:w="130"/>
-            </w:tcMar>
-          </w:tcPr>
-          <w:p>
-            <w:pPr>
-              <w:spacing w:after="0" w:before="0" w:line="264" w:lineRule="auto"/>
-              <w:jc w:val="left"/>
-            </w:pPr>
-            <w:r>
-              <w:t xml:space="preserve">“Cómo llegué a la meditación semanal” (con permiso de la persona entrevistada)</w:t>
+              <w:t xml:space="preserve">Acompaña a quien ya llegó; rara vez atrae búsquedas nuevas</w:t>
             </w:r>
           </w:p>
         </w:tc>
@@ -3688,27 +3372,27 @@
     </w:p>
     <w:p>
       <w:r>
-        <w:t xml:space="preserve">Las entrevistas y relatos de miembros </w:t>
-      </w:r>
-      <w:r>
-        <w:rPr>
-          <w:b/>
-          <w:bCs/>
-        </w:rPr>
-        <w:t xml:space="preserve">no sustituyen</w:t>
-      </w:r>
-      <w:r>
-        <w:t xml:space="preserve"> los artículos educativos del §6: ayudan a que quien llegue </w:t>
-      </w:r>
-      <w:r>
-        <w:rPr>
-          <w:b/>
-          <w:bCs/>
-        </w:rPr>
-        <w:t xml:space="preserve">sienta</w:t>
-      </w:r>
-      <w:r>
-        <w:t xml:space="preserve"> la comunidad, pero suelen atraer menos búsquedas nuevas que un texto que responde “¿qué es el Chan?”. Pueden combinarse bien: primero el tema, después un relato que lo ilustre.</w:t>
+        <w:t xml:space="preserve">Si la comunidad decide publicar </w:t>
+      </w:r>
+      <w:r>
+        <w:rPr>
+          <w:b/>
+          <w:bCs/>
+        </w:rPr>
+        <w:t xml:space="preserve">relatos o entrevistas</w:t>
+      </w:r>
+      <w:r>
+        <w:t xml:space="preserve"> de miembros (§9), conviene saber que su valor es sobre todo de acogida: suman en buscadores cuando el título nombra el tema —práctica en línea, retiro, Chan— y no solo a la persona. </w:t>
+      </w:r>
+      <w:r>
+        <w:rPr>
+          <w:b/>
+          <w:bCs/>
+        </w:rPr>
+        <w:t xml:space="preserve">No sustituyen</w:t>
+      </w:r>
+      <w:r>
+        <w:t xml:space="preserve"> a los artículos educativos del §6, aunque se combinan bien: primero el tema, después un relato que lo ilustre.</w:t>
       </w:r>
     </w:p>
     <w:p>
@@ -3817,7 +3501,6 @@
             </w:pPr>
             <w:r>
               <w:rPr>
-                <w:rFonts w:ascii="Aptos" w:cs="Aptos" w:eastAsia="Aptos" w:hAnsi="Aptos"/>
                 <w:b/>
                 <w:bCs/>
                 <w:color w:val="FFFFFF"/>
@@ -3846,7 +3529,6 @@
             </w:pPr>
             <w:r>
               <w:rPr>
-                <w:rFonts w:ascii="Aptos" w:cs="Aptos" w:eastAsia="Aptos" w:hAnsi="Aptos"/>
                 <w:b/>
                 <w:bCs/>
                 <w:color w:val="FFFFFF"/>
@@ -3875,7 +3557,6 @@
             </w:pPr>
             <w:r>
               <w:rPr>
-                <w:rFonts w:ascii="Aptos" w:cs="Aptos" w:eastAsia="Aptos" w:hAnsi="Aptos"/>
                 <w:b/>
                 <w:bCs/>
                 <w:color w:val="FFFFFF"/>
@@ -3904,7 +3585,6 @@
             </w:pPr>
             <w:r>
               <w:rPr>
-                <w:rFonts w:ascii="Aptos" w:cs="Aptos" w:eastAsia="Aptos" w:hAnsi="Aptos"/>
                 <w:b/>
                 <w:bCs/>
                 <w:color w:val="FFFFFF"/>
@@ -4235,7 +3915,6 @@
             </w:pPr>
             <w:r>
               <w:rPr>
-                <w:rFonts w:ascii="Aptos" w:cs="Aptos" w:eastAsia="Aptos" w:hAnsi="Aptos"/>
                 <w:b/>
                 <w:bCs/>
                 <w:color w:val="FFFFFF"/>
@@ -4264,7 +3943,6 @@
             </w:pPr>
             <w:r>
               <w:rPr>
-                <w:rFonts w:ascii="Aptos" w:cs="Aptos" w:eastAsia="Aptos" w:hAnsi="Aptos"/>
                 <w:b/>
                 <w:bCs/>
                 <w:color w:val="FFFFFF"/>
@@ -4293,7 +3971,6 @@
             </w:pPr>
             <w:r>
               <w:rPr>
-                <w:rFonts w:ascii="Aptos" w:cs="Aptos" w:eastAsia="Aptos" w:hAnsi="Aptos"/>
                 <w:b/>
                 <w:bCs/>
                 <w:color w:val="FFFFFF"/>
@@ -4322,7 +3999,6 @@
             </w:pPr>
             <w:r>
               <w:rPr>
-                <w:rFonts w:ascii="Aptos" w:cs="Aptos" w:eastAsia="Aptos" w:hAnsi="Aptos"/>
                 <w:b/>
                 <w:bCs/>
                 <w:color w:val="FFFFFF"/>
@@ -4628,7 +4304,6 @@
             </w:pPr>
             <w:r>
               <w:rPr>
-                <w:rFonts w:ascii="Aptos" w:cs="Aptos" w:eastAsia="Aptos" w:hAnsi="Aptos"/>
                 <w:b/>
                 <w:bCs/>
                 <w:color w:val="FFFFFF"/>
@@ -4657,7 +4332,6 @@
             </w:pPr>
             <w:r>
               <w:rPr>
-                <w:rFonts w:ascii="Aptos" w:cs="Aptos" w:eastAsia="Aptos" w:hAnsi="Aptos"/>
                 <w:b/>
                 <w:bCs/>
                 <w:color w:val="FFFFFF"/>
@@ -4686,7 +4360,6 @@
             </w:pPr>
             <w:r>
               <w:rPr>
-                <w:rFonts w:ascii="Aptos" w:cs="Aptos" w:eastAsia="Aptos" w:hAnsi="Aptos"/>
                 <w:b/>
                 <w:bCs/>
                 <w:color w:val="FFFFFF"/>
@@ -4715,7 +4388,6 @@
             </w:pPr>
             <w:r>
               <w:rPr>
-                <w:rFonts w:ascii="Aptos" w:cs="Aptos" w:eastAsia="Aptos" w:hAnsi="Aptos"/>
                 <w:b/>
                 <w:bCs/>
                 <w:color w:val="FFFFFF"/>
@@ -5172,7 +4844,6 @@
             </w:pPr>
             <w:r>
               <w:rPr>
-                <w:rFonts w:ascii="Aptos" w:cs="Aptos" w:eastAsia="Aptos" w:hAnsi="Aptos"/>
                 <w:b/>
                 <w:bCs/>
                 <w:color w:val="FFFFFF"/>
@@ -5201,7 +4872,6 @@
             </w:pPr>
             <w:r>
               <w:rPr>
-                <w:rFonts w:ascii="Aptos" w:cs="Aptos" w:eastAsia="Aptos" w:hAnsi="Aptos"/>
                 <w:b/>
                 <w:bCs/>
                 <w:color w:val="FFFFFF"/>
@@ -5230,7 +4900,6 @@
             </w:pPr>
             <w:r>
               <w:rPr>
-                <w:rFonts w:ascii="Aptos" w:cs="Aptos" w:eastAsia="Aptos" w:hAnsi="Aptos"/>
                 <w:b/>
                 <w:bCs/>
                 <w:color w:val="FFFFFF"/>
@@ -5259,7 +4928,6 @@
             </w:pPr>
             <w:r>
               <w:rPr>
-                <w:rFonts w:ascii="Aptos" w:cs="Aptos" w:eastAsia="Aptos" w:hAnsi="Aptos"/>
                 <w:b/>
                 <w:bCs/>
                 <w:color w:val="FFFFFF"/>
@@ -5649,7 +5317,6 @@
             </w:pPr>
             <w:r>
               <w:rPr>
-                <w:rFonts w:ascii="Aptos" w:cs="Aptos" w:eastAsia="Aptos" w:hAnsi="Aptos"/>
                 <w:b/>
                 <w:bCs/>
                 <w:color w:val="FFFFFF"/>
@@ -5678,7 +5345,6 @@
             </w:pPr>
             <w:r>
               <w:rPr>
-                <w:rFonts w:ascii="Aptos" w:cs="Aptos" w:eastAsia="Aptos" w:hAnsi="Aptos"/>
                 <w:b/>
                 <w:bCs/>
                 <w:color w:val="FFFFFF"/>
@@ -5707,7 +5373,6 @@
             </w:pPr>
             <w:r>
               <w:rPr>
-                <w:rFonts w:ascii="Aptos" w:cs="Aptos" w:eastAsia="Aptos" w:hAnsi="Aptos"/>
                 <w:b/>
                 <w:bCs/>
                 <w:color w:val="FFFFFF"/>
@@ -5818,7 +5483,7 @@
               <w:t xml:space="preserve">presupuesto de rastreo</w:t>
             </w:r>
             <w:r>
-              <w:t xml:space="preserve"> solo concierne a sitios desde ~10.000 páginas</w:t>
+              <w:t xml:space="preserve"> —cuánto alcanza a revisar Google de un sitio web— solo llega a preocupar a sitios de unas 10.000 direcciones en adelante</w:t>
             </w:r>
           </w:p>
         </w:tc>
@@ -5858,7 +5523,17 @@
               <w:jc w:val="left"/>
             </w:pPr>
             <w:r>
-              <w:t xml:space="preserve">Con 14 páginas, publicar más rápido no hace que Google pase más</w:t>
+              <w:t xml:space="preserve">El sitio web entero son </w:t>
+            </w:r>
+            <w:r>
+              <w:rPr>
+                <w:b/>
+                <w:bCs/>
+              </w:rPr>
+              <w:t xml:space="preserve">14 direcciones</w:t>
+            </w:r>
+            <w:r>
+              <w:t xml:space="preserve">, y Google ya las revisa todas. Publicar más rápido no hace que las revise más a menudo</w:t>
             </w:r>
           </w:p>
         </w:tc>
@@ -6240,7 +5915,7 @@
       <w:r>
         <w:t xml:space="preserve"> </w:t>
       </w:r>
-      <w:hyperlink w:history="1" r:id="rId3vjmo1zgu4ljaesfk5gui">
+      <w:hyperlink w:history="1" r:id="rIdepl5bt8eow7uqrpdjx3q6">
         <w:r>
           <w:rPr>
             <w:color w:val="8C2B3D"/>
@@ -6252,7 +5927,7 @@
       <w:r>
         <w:t xml:space="preserve"> · </w:t>
       </w:r>
-      <w:hyperlink w:history="1" r:id="rIdvfscwxm31co54tvofdypn">
+      <w:hyperlink w:history="1" r:id="rIdj0qot2n_l2ipgiszjbtly">
         <w:r>
           <w:rPr>
             <w:color w:val="8C2B3D"/>
@@ -6264,7 +5939,7 @@
       <w:r>
         <w:t xml:space="preserve"> · </w:t>
       </w:r>
-      <w:hyperlink w:history="1" r:id="rIdxxspycnyhj74ju3vnzfua">
+      <w:hyperlink w:history="1" r:id="rIdlwmzsbxq4bunen5umeyi1">
         <w:r>
           <w:rPr>
             <w:color w:val="8C2B3D"/>
@@ -6276,7 +5951,7 @@
       <w:r>
         <w:t xml:space="preserve"> · </w:t>
       </w:r>
-      <w:hyperlink w:history="1" r:id="rId7kv-sus_bgyug3ronrgfv">
+      <w:hyperlink w:history="1" r:id="rIdn2hgqfkj2lyc8v0kxqepk">
         <w:r>
           <w:rPr>
             <w:color w:val="8C2B3D"/>
@@ -6291,57 +5966,22 @@
         <w:pStyle w:val="Heading1"/>
       </w:pPr>
       <w:r>
-        <w:t xml:space="preserve">7. Voz y formato (criterios de la comunidad)</w:t>
-      </w:r>
-    </w:p>
-    <w:p>
-      <w:r>
-        <w:t xml:space="preserve">Lo siguiente resume </w:t>
-      </w:r>
-      <w:r>
-        <w:rPr>
-          <w:b/>
-          <w:bCs/>
-        </w:rPr>
-        <w:t xml:space="preserve">cómo debe sonar y verse un artículo del blog</w:t>
-      </w:r>
-      <w:r>
-        <w:t xml:space="preserve"> en Camino del Dharma. No hace falta otro manual para publicar con coherencia.</w:t>
-      </w:r>
-    </w:p>
-    <w:p>
-      <w:pPr>
-        <w:pStyle w:val="Heading2"/>
-      </w:pPr>
-      <w:r>
-        <w:t xml:space="preserve">7.1 Cómo habla la comunidad</w:t>
-      </w:r>
-    </w:p>
-    <w:p>
-      <w:r>
-        <w:t xml:space="preserve">La comunicación </w:t>
-      </w:r>
-      <w:r>
-        <w:rPr>
-          <w:b/>
-          <w:bCs/>
-        </w:rPr>
-        <w:t xml:space="preserve">no vende</w:t>
-      </w:r>
-      <w:r>
-        <w:t xml:space="preserve">. </w:t>
-      </w:r>
-      <w:r>
-        <w:rPr>
-          <w:b/>
-          <w:bCs/>
-        </w:rPr>
-        <w:t xml:space="preserve">Invita a practicar.</w:t>
-      </w:r>
-    </w:p>
-    <w:p>
-      <w:r>
-        <w:t xml:space="preserve">Tres cualidades obligatorias:</w:t>
+        <w:t xml:space="preserve">7. Voz y formato: dónde están definidos</w:t>
+      </w:r>
+    </w:p>
+    <w:p>
+      <w:r>
+        <w:t xml:space="preserve">La voz de la comunidad y el formato de una entrada </w:t>
+      </w:r>
+      <w:r>
+        <w:rPr>
+          <w:b/>
+          <w:bCs/>
+        </w:rPr>
+        <w:t xml:space="preserve">ya están definidos</w:t>
+      </w:r>
+      <w:r>
+        <w:t xml:space="preserve">, y este brief no los repite: hacerlo crearía dos fuentes para la misma regla, y a la primera actualización dejarían de coincidir.</w:t>
       </w:r>
     </w:p>
     <w:tbl>
@@ -6357,9 +5997,9 @@
         </w:tblBorders>
       </w:tblPr>
       <w:tblGrid>
-        <w:gridCol w:w="1325"/>
-        <w:gridCol w:w="3262"/>
-        <w:gridCol w:w="4586"/>
+        <w:gridCol w:w="2387"/>
+        <w:gridCol w:w="3016"/>
+        <w:gridCol w:w="3770"/>
       </w:tblGrid>
       <w:tr>
         <w:trPr>
@@ -6367,7 +6007,7 @@
         </w:trPr>
         <w:tc>
           <w:tcPr>
-            <w:tcW w:type="dxa" w:w="1325"/>
+            <w:tcW w:type="dxa" w:w="2387"/>
             <w:shd w:fill="8C2B3D" w:val="clear"/>
             <w:tcMar>
               <w:top w:type="dxa" w:w="90"/>
@@ -6383,20 +6023,19 @@
             </w:pPr>
             <w:r>
               <w:rPr>
-                <w:rFonts w:ascii="Aptos" w:cs="Aptos" w:eastAsia="Aptos" w:hAnsi="Aptos"/>
                 <w:b/>
                 <w:bCs/>
                 <w:color w:val="FFFFFF"/>
                 <w:sz w:val="21"/>
                 <w:szCs w:val="21"/>
               </w:rPr>
-              <w:t xml:space="preserve">Cualidad</w:t>
-            </w:r>
-          </w:p>
-        </w:tc>
-        <w:tc>
-          <w:tcPr>
-            <w:tcW w:type="dxa" w:w="3262"/>
+              <w:t xml:space="preserve">Para saber…</w:t>
+            </w:r>
+          </w:p>
+        </w:tc>
+        <w:tc>
+          <w:tcPr>
+            <w:tcW w:type="dxa" w:w="3016"/>
             <w:shd w:fill="8C2B3D" w:val="clear"/>
             <w:tcMar>
               <w:top w:type="dxa" w:w="90"/>
@@ -6412,20 +6051,19 @@
             </w:pPr>
             <w:r>
               <w:rPr>
-                <w:rFonts w:ascii="Aptos" w:cs="Aptos" w:eastAsia="Aptos" w:hAnsi="Aptos"/>
                 <w:b/>
                 <w:bCs/>
                 <w:color w:val="FFFFFF"/>
                 <w:sz w:val="21"/>
                 <w:szCs w:val="21"/>
               </w:rPr>
-              <w:t xml:space="preserve">Significa</w:t>
-            </w:r>
-          </w:p>
-        </w:tc>
-        <w:tc>
-          <w:tcPr>
-            <w:tcW w:type="dxa" w:w="4586"/>
+              <w:t xml:space="preserve">Documento</w:t>
+            </w:r>
+          </w:p>
+        </w:tc>
+        <w:tc>
+          <w:tcPr>
+            <w:tcW w:type="dxa" w:w="3770"/>
             <w:shd w:fill="8C2B3D" w:val="clear"/>
             <w:tcMar>
               <w:top w:type="dxa" w:w="90"/>
@@ -6441,14 +6079,13 @@
             </w:pPr>
             <w:r>
               <w:rPr>
-                <w:rFonts w:ascii="Aptos" w:cs="Aptos" w:eastAsia="Aptos" w:hAnsi="Aptos"/>
                 <w:b/>
                 <w:bCs/>
                 <w:color w:val="FFFFFF"/>
                 <w:sz w:val="21"/>
                 <w:szCs w:val="21"/>
               </w:rPr>
-              <w:t xml:space="preserve">Evita</w:t>
+              <w:t xml:space="preserve">Cubre</w:t>
             </w:r>
           </w:p>
         </w:tc>
@@ -6456,7 +6093,7 @@
       <w:tr>
         <w:tc>
           <w:tcPr>
-            <w:tcW w:type="dxa" w:w="1325"/>
+            <w:tcW w:type="dxa" w:w="2387"/>
             <w:shd w:fill="F6F0EF" w:val="clear"/>
             <w:tcMar>
               <w:top w:type="dxa" w:w="90"/>
@@ -6471,17 +6108,23 @@
               <w:jc w:val="left"/>
             </w:pPr>
             <w:r>
-              <w:rPr>
-                <w:b/>
-                <w:bCs/>
-              </w:rPr>
-              <w:t xml:space="preserve">Sobria</w:t>
-            </w:r>
-          </w:p>
-        </w:tc>
-        <w:tc>
-          <w:tcPr>
-            <w:tcW w:type="dxa" w:w="3262"/>
+              <w:t xml:space="preserve">Cómo debe </w:t>
+            </w:r>
+            <w:r>
+              <w:rPr>
+                <w:b/>
+                <w:bCs/>
+              </w:rPr>
+              <w:t xml:space="preserve">sonar</w:t>
+            </w:r>
+            <w:r>
+              <w:t xml:space="preserve"> el texto</w:t>
+            </w:r>
+          </w:p>
+        </w:tc>
+        <w:tc>
+          <w:tcPr>
+            <w:tcW w:type="dxa" w:w="3016"/>
             <w:shd w:fill="F6F0EF" w:val="clear"/>
             <w:tcMar>
               <w:top w:type="dxa" w:w="90"/>
@@ -6496,13 +6139,33 @@
               <w:jc w:val="left"/>
             </w:pPr>
             <w:r>
-              <w:t xml:space="preserve">Nombra con precisión, sin exceso</w:t>
-            </w:r>
-          </w:p>
-        </w:tc>
-        <w:tc>
-          <w:tcPr>
-            <w:tcW w:type="dxa" w:w="4586"/>
+              <w:rPr>
+                <w:b/>
+                <w:bCs/>
+              </w:rPr>
+              <w:t xml:space="preserve">Manual de voz y copywriting editorial</w:t>
+            </w:r>
+            <w:r>
+              <w:t xml:space="preserve"> (</w:t>
+            </w:r>
+            <w:r>
+              <w:rPr>
+                <w:rFonts w:ascii="Consolas" w:cs="Consolas" w:eastAsia="Consolas" w:hAnsi="Consolas"/>
+                <w:color w:val="8C2B3D"/>
+                <w:sz w:val="19"/>
+                <w:szCs w:val="19"/>
+                <w:shd w:fill="F6F0EF" w:val="clear"/>
+              </w:rPr>
+              <w:t xml:space="preserve">21</w:t>
+            </w:r>
+            <w:r>
+              <w:t xml:space="preserve">)</w:t>
+            </w:r>
+          </w:p>
+        </w:tc>
+        <w:tc>
+          <w:tcPr>
+            <w:tcW w:type="dxa" w:w="3770"/>
             <w:shd w:fill="F6F0EF" w:val="clear"/>
             <w:tcMar>
               <w:top w:type="dxa" w:w="90"/>
@@ -6517,7 +6180,27 @@
               <w:jc w:val="left"/>
             </w:pPr>
             <w:r>
-              <w:t xml:space="preserve">Superlativos, dramatización, grandilocuencia</w:t>
+              <w:t xml:space="preserve">Atributos de la voz, principios de escritura, léxico permitido y prohibido, llamadas a la acción aprobadas, la grafía </w:t>
+            </w:r>
+            <w:r>
+              <w:rPr>
+                <w:i/>
+                <w:iCs/>
+              </w:rPr>
+              <w:t xml:space="preserve">Buddhismo</w:t>
+            </w:r>
+            <w:r>
+              <w:t xml:space="preserve"> / </w:t>
+            </w:r>
+            <w:r>
+              <w:rPr>
+                <w:i/>
+                <w:iCs/>
+              </w:rPr>
+              <w:t xml:space="preserve">budismo</w:t>
+            </w:r>
+            <w:r>
+              <w:t xml:space="preserve"> y el checklist de revisión editorial</w:t>
             </w:r>
           </w:p>
         </w:tc>
@@ -6525,134 +6208,91 @@
       <w:tr>
         <w:tc>
           <w:tcPr>
-            <w:tcW w:type="dxa" w:w="1325"/>
-            <w:tcMar>
-              <w:top w:type="dxa" w:w="90"/>
-              <w:left w:type="dxa" w:w="130"/>
-              <w:bottom w:type="dxa" w:w="90"/>
-              <w:right w:type="dxa" w:w="130"/>
-            </w:tcMar>
-          </w:tcPr>
-          <w:p>
-            <w:pPr>
-              <w:spacing w:after="0" w:before="0" w:line="264" w:lineRule="auto"/>
-              <w:jc w:val="left"/>
-            </w:pPr>
-            <w:r>
-              <w:rPr>
-                <w:b/>
-                <w:bCs/>
-              </w:rPr>
-              <w:t xml:space="preserve">Acogedora</w:t>
-            </w:r>
-          </w:p>
-        </w:tc>
-        <w:tc>
-          <w:tcPr>
-            <w:tcW w:type="dxa" w:w="3262"/>
-            <w:tcMar>
-              <w:top w:type="dxa" w:w="90"/>
-              <w:left w:type="dxa" w:w="130"/>
-              <w:bottom w:type="dxa" w:w="90"/>
-              <w:right w:type="dxa" w:w="130"/>
-            </w:tcMar>
-          </w:tcPr>
-          <w:p>
-            <w:pPr>
-              <w:spacing w:after="0" w:before="0" w:line="264" w:lineRule="auto"/>
-              <w:jc w:val="left"/>
-            </w:pPr>
-            <w:r>
-              <w:t xml:space="preserve">Abre espacio, acompaña</w:t>
-            </w:r>
-          </w:p>
-        </w:tc>
-        <w:tc>
-          <w:tcPr>
-            <w:tcW w:type="dxa" w:w="4586"/>
-            <w:tcMar>
-              <w:top w:type="dxa" w:w="90"/>
-              <w:left w:type="dxa" w:w="130"/>
-              <w:bottom w:type="dxa" w:w="90"/>
-              <w:right w:type="dxa" w:w="130"/>
-            </w:tcMar>
-          </w:tcPr>
-          <w:p>
-            <w:pPr>
-              <w:spacing w:after="0" w:before="0" w:line="264" w:lineRule="auto"/>
-              <w:jc w:val="left"/>
-            </w:pPr>
-            <w:r>
-              <w:t xml:space="preserve">Frialdad institucional, entusiasmo artificial</w:t>
-            </w:r>
-          </w:p>
-        </w:tc>
-      </w:tr>
-      <w:tr>
-        <w:tc>
-          <w:tcPr>
-            <w:tcW w:type="dxa" w:w="1325"/>
-            <w:shd w:fill="F6F0EF" w:val="clear"/>
-            <w:tcMar>
-              <w:top w:type="dxa" w:w="90"/>
-              <w:left w:type="dxa" w:w="130"/>
-              <w:bottom w:type="dxa" w:w="90"/>
-              <w:right w:type="dxa" w:w="130"/>
-            </w:tcMar>
-          </w:tcPr>
-          <w:p>
-            <w:pPr>
-              <w:spacing w:after="0" w:before="0" w:line="264" w:lineRule="auto"/>
-              <w:jc w:val="left"/>
-            </w:pPr>
-            <w:r>
-              <w:rPr>
-                <w:b/>
-                <w:bCs/>
-              </w:rPr>
-              <w:t xml:space="preserve">Clara</w:t>
-            </w:r>
-          </w:p>
-        </w:tc>
-        <w:tc>
-          <w:tcPr>
-            <w:tcW w:type="dxa" w:w="3262"/>
-            <w:shd w:fill="F6F0EF" w:val="clear"/>
-            <w:tcMar>
-              <w:top w:type="dxa" w:w="90"/>
-              <w:left w:type="dxa" w:w="130"/>
-              <w:bottom w:type="dxa" w:w="90"/>
-              <w:right w:type="dxa" w:w="130"/>
-            </w:tcMar>
-          </w:tcPr>
-          <w:p>
-            <w:pPr>
-              <w:spacing w:after="0" w:before="0" w:line="264" w:lineRule="auto"/>
-              <w:jc w:val="left"/>
-            </w:pPr>
-            <w:r>
-              <w:t xml:space="preserve">Va al punto, lenguaje concreto</w:t>
-            </w:r>
-          </w:p>
-        </w:tc>
-        <w:tc>
-          <w:tcPr>
-            <w:tcW w:type="dxa" w:w="4586"/>
-            <w:shd w:fill="F6F0EF" w:val="clear"/>
-            <w:tcMar>
-              <w:top w:type="dxa" w:w="90"/>
-              <w:left w:type="dxa" w:w="130"/>
-              <w:bottom w:type="dxa" w:w="90"/>
-              <w:right w:type="dxa" w:w="130"/>
-            </w:tcMar>
-          </w:tcPr>
-          <w:p>
-            <w:pPr>
-              <w:spacing w:after="0" w:before="0" w:line="264" w:lineRule="auto"/>
-              <w:jc w:val="left"/>
-            </w:pPr>
-            <w:r>
-              <w:t xml:space="preserve">Ambigüedad, párrafos inflados</w:t>
+            <w:tcW w:type="dxa" w:w="2387"/>
+            <w:tcMar>
+              <w:top w:type="dxa" w:w="90"/>
+              <w:left w:type="dxa" w:w="130"/>
+              <w:bottom w:type="dxa" w:w="90"/>
+              <w:right w:type="dxa" w:w="130"/>
+            </w:tcMar>
+          </w:tcPr>
+          <w:p>
+            <w:pPr>
+              <w:spacing w:after="0" w:before="0" w:line="264" w:lineRule="auto"/>
+              <w:jc w:val="left"/>
+            </w:pPr>
+            <w:r>
+              <w:t xml:space="preserve">Cómo debe </w:t>
+            </w:r>
+            <w:r>
+              <w:rPr>
+                <w:b/>
+                <w:bCs/>
+              </w:rPr>
+              <w:t xml:space="preserve">estructurarse</w:t>
+            </w:r>
+            <w:r>
+              <w:t xml:space="preserve"> la entrada</w:t>
+            </w:r>
+          </w:p>
+        </w:tc>
+        <w:tc>
+          <w:tcPr>
+            <w:tcW w:type="dxa" w:w="3016"/>
+            <w:tcMar>
+              <w:top w:type="dxa" w:w="90"/>
+              <w:left w:type="dxa" w:w="130"/>
+              <w:bottom w:type="dxa" w:w="90"/>
+              <w:right w:type="dxa" w:w="130"/>
+            </w:tcMar>
+          </w:tcPr>
+          <w:p>
+            <w:pPr>
+              <w:spacing w:after="0" w:before="0" w:line="264" w:lineRule="auto"/>
+              <w:jc w:val="left"/>
+            </w:pPr>
+            <w:r>
+              <w:rPr>
+                <w:b/>
+                <w:bCs/>
+              </w:rPr>
+              <w:t xml:space="preserve">Sistema editorial</w:t>
+            </w:r>
+            <w:r>
+              <w:t xml:space="preserve"> (</w:t>
+            </w:r>
+            <w:r>
+              <w:rPr>
+                <w:rFonts w:ascii="Consolas" w:cs="Consolas" w:eastAsia="Consolas" w:hAnsi="Consolas"/>
+                <w:color w:val="8C2B3D"/>
+                <w:sz w:val="19"/>
+                <w:szCs w:val="19"/>
+                <w:shd w:fill="F6F0EF" w:val="clear"/>
+              </w:rPr>
+              <w:t xml:space="preserve">23</w:t>
+            </w:r>
+            <w:r>
+              <w:t xml:space="preserve">)</w:t>
+            </w:r>
+          </w:p>
+        </w:tc>
+        <w:tc>
+          <w:tcPr>
+            <w:tcW w:type="dxa" w:w="3770"/>
+            <w:tcMar>
+              <w:top w:type="dxa" w:w="90"/>
+              <w:left w:type="dxa" w:w="130"/>
+              <w:bottom w:type="dxa" w:w="90"/>
+              <w:right w:type="dxa" w:w="130"/>
+            </w:tcMar>
+          </w:tcPr>
+          <w:p>
+            <w:pPr>
+              <w:spacing w:after="0" w:before="0" w:line="264" w:lineRule="auto"/>
+              <w:jc w:val="left"/>
+            </w:pPr>
+            <w:r>
+              <w:t xml:space="preserve">Tipos de intención, extensión orientativa según el tipo, estructura con subtítulos, extracto del listado y presentación en listado y en detalle</w:t>
             </w:r>
           </w:p>
         </w:tc>
@@ -6664,184 +6304,30 @@
       </w:pPr>
     </w:p>
     <w:p>
-      <w:pPr>
-        <w:pStyle w:val="Heading2"/>
-      </w:pPr>
-      <w:r>
-        <w:t xml:space="preserve">7.2 Principios al escribir</w:t>
-      </w:r>
-    </w:p>
-    <w:p>
-      <w:pPr>
-        <w:pStyle w:val="ListParagraph"/>
-        <w:numPr>
-          <w:ilvl w:val="0"/>
-          <w:numId w:val="4"/>
-        </w:numPr>
-      </w:pPr>
-      <w:r>
-        <w:rPr>
-          <w:b/>
-          <w:bCs/>
-        </w:rPr>
-        <w:t xml:space="preserve">Orientar antes que atraer</w:t>
-      </w:r>
-      <w:r>
-        <w:t xml:space="preserve"> — El primer párrafo ubica: de qué va el texto, no “engancha” con marketing.</w:t>
-      </w:r>
-    </w:p>
-    <w:p>
-      <w:pPr>
-        <w:pStyle w:val="ListParagraph"/>
-        <w:numPr>
-          <w:ilvl w:val="0"/>
-          <w:numId w:val="4"/>
-        </w:numPr>
-      </w:pPr>
-      <w:r>
-        <w:rPr>
-          <w:b/>
-          <w:bCs/>
-        </w:rPr>
-        <w:t xml:space="preserve">Presentar, no promocionar</w:t>
-      </w:r>
-      <w:r>
-        <w:t xml:space="preserve"> — Se muestra la práctica; no se prometen resultados.</w:t>
-      </w:r>
-    </w:p>
-    <w:p>
-      <w:pPr>
-        <w:pStyle w:val="ListParagraph"/>
-        <w:numPr>
-          <w:ilvl w:val="0"/>
-          <w:numId w:val="4"/>
-        </w:numPr>
-      </w:pPr>
-      <w:r>
-        <w:rPr>
-          <w:b/>
-          <w:bCs/>
-        </w:rPr>
-        <w:t xml:space="preserve">Decir menos, pero mejor</w:t>
-      </w:r>
-      <w:r>
-        <w:t xml:space="preserve"> — La longitud sigue al tema, no a una meta de palabras.</w:t>
-      </w:r>
-    </w:p>
-    <w:p>
-      <w:pPr>
-        <w:pStyle w:val="ListParagraph"/>
-        <w:numPr>
-          <w:ilvl w:val="0"/>
-          <w:numId w:val="4"/>
-        </w:numPr>
-      </w:pPr>
-      <w:r>
-        <w:rPr>
-          <w:b/>
-          <w:bCs/>
-        </w:rPr>
-        <w:t xml:space="preserve">Sin urgencia</w:t>
-      </w:r>
-      <w:r>
-        <w:t xml:space="preserve"> — No “cupos limitados”, “no te lo pierdas”, “transforma tu vida ya”.</w:t>
-      </w:r>
-    </w:p>
-    <w:p>
-      <w:r>
-        <w:t xml:space="preserve">Primero responder, en lo posible:</w:t>
-      </w:r>
-    </w:p>
-    <w:p>
-      <w:pPr>
-        <w:pStyle w:val="ListParagraph"/>
-        <w:numPr>
-          <w:ilvl w:val="0"/>
-          <w:numId w:val="2"/>
-        </w:numPr>
-      </w:pPr>
-      <w:r>
-        <w:t xml:space="preserve">qué es esto;</w:t>
-      </w:r>
-    </w:p>
-    <w:p>
-      <w:pPr>
-        <w:pStyle w:val="ListParagraph"/>
-        <w:numPr>
-          <w:ilvl w:val="0"/>
-          <w:numId w:val="2"/>
-        </w:numPr>
-      </w:pPr>
-      <w:r>
-        <w:t xml:space="preserve">cómo se practica aquí;</w:t>
-      </w:r>
-    </w:p>
-    <w:p>
-      <w:pPr>
-        <w:pStyle w:val="ListParagraph"/>
-        <w:numPr>
-          <w:ilvl w:val="0"/>
-          <w:numId w:val="2"/>
-        </w:numPr>
-      </w:pPr>
-      <w:r>
-        <w:t xml:space="preserve">cómo puede acercarse una persona.</w:t>
-      </w:r>
-    </w:p>
-    <w:p>
-      <w:pPr>
-        <w:pStyle w:val="Heading2"/>
-      </w:pPr>
-      <w:r>
-        <w:t xml:space="preserve">7.3 Palabras y tono</w:t>
-      </w:r>
-    </w:p>
-    <w:p>
-      <w:r>
-        <w:rPr>
-          <w:b/>
-          <w:bCs/>
-        </w:rPr>
-        <w:t xml:space="preserve">Invitaciones apropiadas:</w:t>
-      </w:r>
-      <w:r>
-        <w:t xml:space="preserve"> Practica con nosotros · Participar · Conocer · Explorar · Contactar · Inscribirme (eventos) · Donar.</w:t>
-      </w:r>
-    </w:p>
-    <w:p>
-      <w:r>
-        <w:rPr>
-          <w:b/>
-          <w:bCs/>
-        </w:rPr>
-        <w:t xml:space="preserve">Evitar</w:t>
-      </w:r>
-      <w:r>
-        <w:t xml:space="preserve"> (suenan a marketing, tienda o red social): increíble · imperdible · descubre · únete (si suena comercial) · suscríbete · compra · exclusivo · contenido premium · transforma tu vida ya.</w:t>
-      </w:r>
-    </w:p>
-    <w:p>
-      <w:r>
-        <w:rPr>
-          <w:b/>
-          <w:bCs/>
-        </w:rPr>
-        <w:t xml:space="preserve">Términos de la tradición</w:t>
-      </w:r>
-      <w:r>
-        <w:t xml:space="preserve"> (usar con consistencia cuando haga falta): Buddhismo · Dharma · Chan · Tierra Pura · Mahāyāna · sangha · meditación · recitación.</w:t>
-      </w:r>
-    </w:p>
-    <w:p>
-      <w:r>
-        <w:rPr>
-          <w:b/>
-          <w:bCs/>
-        </w:rPr>
-        <w:t xml:space="preserve">Buddhismo y budismo:</w:t>
-      </w:r>
-      <w:r>
-        <w:t xml:space="preserve"> la comunidad escribe </w:t>
+      <w:r>
+        <w:t xml:space="preserve">Lo único que este brief añade sobre la forma del texto es lo que responde a una razón </w:t>
+      </w:r>
+      <w:r>
+        <w:rPr>
+          <w:b/>
+          <w:bCs/>
+        </w:rPr>
+        <w:t xml:space="preserve">de búsqueda</w:t>
+      </w:r>
+      <w:r>
+        <w:t xml:space="preserve">, y ya está en el §3: título claro, respuesta directa en el primer párrafo y enlaces internos hacia el artículo. No contradice a los documentos anteriores; es la misma recomendación por otro motivo.</w:t>
+      </w:r>
+    </w:p>
+    <w:p>
+      <w:r>
+        <w:rPr>
+          <w:b/>
+          <w:bCs/>
+        </w:rPr>
+        <w:t xml:space="preserve">El punto donde voz y búsqueda se rozan</w:t>
+      </w:r>
+      <w:r>
+        <w:t xml:space="preserve">, por si surge la duda: la comunidad escribe </w:t>
       </w:r>
       <w:r>
         <w:rPr>
@@ -6851,7 +6337,7 @@
         <w:t xml:space="preserve">Buddhismo</w:t>
       </w:r>
       <w:r>
-        <w:t xml:space="preserve"> con doble d. Mucha gente busca </w:t>
+        <w:t xml:space="preserve"> con doble d, y quien busca en Google suele escribir </w:t>
       </w:r>
       <w:r>
         <w:rPr>
@@ -6861,231 +6347,7 @@
         <w:t xml:space="preserve">budismo</w:t>
       </w:r>
       <w:r>
-        <w:t xml:space="preserve"> con una d — también es válido. En el </w:t>
-      </w:r>
-      <w:r>
-        <w:rPr>
-          <w:b/>
-          <w:bCs/>
-        </w:rPr>
-        <w:t xml:space="preserve">texto visible</w:t>
-      </w:r>
-      <w:r>
-        <w:t xml:space="preserve"> del artículo se usa </w:t>
-      </w:r>
-      <w:r>
-        <w:rPr>
-          <w:i/>
-          <w:iCs/>
-        </w:rPr>
-        <w:t xml:space="preserve">Buddhismo</w:t>
-      </w:r>
-      <w:r>
-        <w:t xml:space="preserve">; en el </w:t>
-      </w:r>
-      <w:r>
-        <w:rPr>
-          <w:b/>
-          <w:bCs/>
-        </w:rPr>
-        <w:t xml:space="preserve">resumen corto</w:t>
-      </w:r>
-      <w:r>
-        <w:t xml:space="preserve"> que ve Google al compartir el enlace puede usarse </w:t>
-      </w:r>
-      <w:r>
-        <w:rPr>
-          <w:i/>
-          <w:iCs/>
-        </w:rPr>
-        <w:t xml:space="preserve">budismo</w:t>
-      </w:r>
-      <w:r>
-        <w:t xml:space="preserve"> si ayuda a quien busca así. </w:t>
-      </w:r>
-      <w:r>
-        <w:rPr>
-          <w:b/>
-          <w:bCs/>
-        </w:rPr>
-        <w:t xml:space="preserve">Nunca</w:t>
-      </w:r>
-      <w:r>
-        <w:t xml:space="preserve"> ocultar palabras con trucos (texto invisible, etc.).</w:t>
-      </w:r>
-    </w:p>
-    <w:p>
-      <w:r>
-        <w:rPr>
-          <w:b/>
-          <w:bCs/>
-        </w:rPr>
-        <w:t xml:space="preserve">El blog puede sonar</w:t>
-      </w:r>
-      <w:r>
-        <w:t xml:space="preserve"> reflexivo, informativo o </w:t>
-      </w:r>
-      <w:r>
-        <w:rPr>
-          <w:b/>
-          <w:bCs/>
-        </w:rPr>
-        <w:t xml:space="preserve">conversacional</w:t>
-      </w:r>
-      <w:r>
-        <w:t xml:space="preserve"> (entrevistas), según la pieza; siempre sobrio.</w:t>
-      </w:r>
-    </w:p>
-    <w:p>
-      <w:r>
-        <w:rPr>
-          <w:b/>
-          <w:bCs/>
-        </w:rPr>
-        <w:t xml:space="preserve">Entrevistas y relatos de miembros:</w:t>
-      </w:r>
-    </w:p>
-    <w:p>
-      <w:pPr>
-        <w:pStyle w:val="ListParagraph"/>
-        <w:numPr>
-          <w:ilvl w:val="0"/>
-          <w:numId w:val="2"/>
-        </w:numPr>
-      </w:pPr>
-      <w:r>
-        <w:t xml:space="preserve">Pedir </w:t>
-      </w:r>
-      <w:r>
-        <w:rPr>
-          <w:b/>
-          <w:bCs/>
-        </w:rPr>
-        <w:t xml:space="preserve">permiso por escrito</w:t>
-      </w:r>
-      <w:r>
-        <w:t xml:space="preserve"> (o acuerdo claro) antes de publicar nombre, foto o cita.</w:t>
-      </w:r>
-    </w:p>
-    <w:p>
-      <w:pPr>
-        <w:pStyle w:val="ListParagraph"/>
-        <w:numPr>
-          <w:ilvl w:val="0"/>
-          <w:numId w:val="2"/>
-        </w:numPr>
-      </w:pPr>
-      <w:r>
-        <w:t xml:space="preserve">El eje es la </w:t>
-      </w:r>
-      <w:r>
-        <w:rPr>
-          <w:b/>
-          <w:bCs/>
-        </w:rPr>
-        <w:t xml:space="preserve">práctica</w:t>
-      </w:r>
-      <w:r>
-        <w:t xml:space="preserve"> y la experiencia en la sangha — no currículum, logros externos ni “antes y después”.</w:t>
-      </w:r>
-    </w:p>
-    <w:p>
-      <w:pPr>
-        <w:pStyle w:val="ListParagraph"/>
-        <w:numPr>
-          <w:ilvl w:val="0"/>
-          <w:numId w:val="2"/>
-        </w:numPr>
-      </w:pPr>
-      <w:r>
-        <w:t xml:space="preserve">Evitar tono de testimonial comercial (“cambió mi vida para siempre”, “no te lo pierdas”).</w:t>
-      </w:r>
-    </w:p>
-    <w:p>
-      <w:pPr>
-        <w:pStyle w:val="ListParagraph"/>
-        <w:numPr>
-          <w:ilvl w:val="0"/>
-          <w:numId w:val="2"/>
-        </w:numPr>
-      </w:pPr>
-      <w:r>
-        <w:t xml:space="preserve">Quien entrevista puede editar por claridad y longitud; la persona revisa el texto final.</w:t>
-      </w:r>
-    </w:p>
-    <w:p>
-      <w:pPr>
-        <w:pStyle w:val="Heading2"/>
-      </w:pPr>
-      <w:r>
-        <w:t xml:space="preserve">7.4 Formato de una entrada</w:t>
-      </w:r>
-    </w:p>
-    <w:p>
-      <w:r>
-        <w:rPr>
-          <w:b/>
-          <w:bCs/>
-        </w:rPr>
-        <w:t xml:space="preserve">En el listado del blog:</w:t>
-      </w:r>
-      <w:r>
-        <w:t xml:space="preserve"> título + extracto de una o dos oraciones (resume la idea).</w:t>
-      </w:r>
-    </w:p>
-    <w:p>
-      <w:r>
-        <w:rPr>
-          <w:b/>
-          <w:bCs/>
-        </w:rPr>
-        <w:t xml:space="preserve">En la página del artículo:</w:t>
-      </w:r>
-    </w:p>
-    <w:p>
-      <w:pPr>
-        <w:pStyle w:val="ListParagraph"/>
-        <w:numPr>
-          <w:ilvl w:val="0"/>
-          <w:numId w:val="2"/>
-        </w:numPr>
-      </w:pPr>
-      <w:r>
-        <w:t xml:space="preserve">un solo título principal;</w:t>
-      </w:r>
-    </w:p>
-    <w:p>
-      <w:pPr>
-        <w:pStyle w:val="ListParagraph"/>
-        <w:numPr>
-          <w:ilvl w:val="0"/>
-          <w:numId w:val="2"/>
-        </w:numPr>
-      </w:pPr>
-      <w:r>
-        <w:t xml:space="preserve">párrafo inicial que </w:t>
-      </w:r>
-      <w:r>
-        <w:rPr>
-          <w:b/>
-          <w:bCs/>
-        </w:rPr>
-        <w:t xml:space="preserve">responda</w:t>
-      </w:r>
-      <w:r>
-        <w:t xml:space="preserve"> la pregunta o el tema;</w:t>
-      </w:r>
-    </w:p>
-    <w:p>
-      <w:pPr>
-        <w:pStyle w:val="ListParagraph"/>
-        <w:numPr>
-          <w:ilvl w:val="0"/>
-          <w:numId w:val="2"/>
-        </w:numPr>
-      </w:pPr>
-      <w:r>
-        <w:t xml:space="preserve">subtítulos (</w:t>
+        <w:t xml:space="preserve">. El manual (</w:t>
       </w:r>
       <w:r>
         <w:rPr>
@@ -7095,640 +6357,10 @@
           <w:szCs w:val="19"/>
           <w:shd w:fill="F6F0EF" w:val="clear"/>
         </w:rPr>
-        <w:t xml:space="preserve">h2</w:t>
-      </w:r>
-      <w:r>
-        <w:t xml:space="preserve">) si el texto lo necesita — no decorativos;</w:t>
-      </w:r>
-    </w:p>
-    <w:p>
-      <w:pPr>
-        <w:pStyle w:val="ListParagraph"/>
-        <w:numPr>
-          <w:ilvl w:val="0"/>
-          <w:numId w:val="2"/>
-        </w:numPr>
-      </w:pPr>
-      <w:r>
-        <w:t xml:space="preserve">cierre breve, sin moraleja emotiva forzada.</w:t>
-      </w:r>
-    </w:p>
-    <w:p>
-      <w:r>
-        <w:rPr>
-          <w:b/>
-          <w:bCs/>
-        </w:rPr>
-        <w:t xml:space="preserve">Extensión orientativa</w:t>
-      </w:r>
-      <w:r>
-        <w:t xml:space="preserve"> (flexible según el tema):</w:t>
-      </w:r>
-    </w:p>
-    <w:tbl>
-      <w:tblPr>
-        <w:tblW w:type="dxa" w:w="9173"/>
-        <w:tblBorders>
-          <w:top w:val="single" w:color="D1AEAB" w:sz="4"/>
-          <w:left w:val="single" w:color="D1AEAB" w:sz="4"/>
-          <w:bottom w:val="single" w:color="D1AEAB" w:sz="4"/>
-          <w:right w:val="single" w:color="D1AEAB" w:sz="4"/>
-          <w:insideH w:val="single" w:color="D1AEAB" w:sz="4"/>
-          <w:insideV w:val="single" w:color="D1AEAB" w:sz="4"/>
-        </w:tblBorders>
-      </w:tblPr>
-      <w:tblGrid>
-        <w:gridCol w:w="3524"/>
-        <w:gridCol w:w="3576"/>
-        <w:gridCol w:w="2073"/>
-      </w:tblGrid>
-      <w:tr>
-        <w:trPr>
-          <w:tblHeader/>
-        </w:trPr>
-        <w:tc>
-          <w:tcPr>
-            <w:tcW w:type="dxa" w:w="3524"/>
-            <w:shd w:fill="8C2B3D" w:val="clear"/>
-            <w:tcMar>
-              <w:top w:type="dxa" w:w="90"/>
-              <w:left w:type="dxa" w:w="130"/>
-              <w:bottom w:type="dxa" w:w="90"/>
-              <w:right w:type="dxa" w:w="130"/>
-            </w:tcMar>
-          </w:tcPr>
-          <w:p>
-            <w:pPr>
-              <w:spacing w:after="0" w:before="0" w:line="264" w:lineRule="auto"/>
-              <w:jc w:val="left"/>
-            </w:pPr>
-            <w:r>
-              <w:rPr>
-                <w:rFonts w:ascii="Aptos" w:cs="Aptos" w:eastAsia="Aptos" w:hAnsi="Aptos"/>
-                <w:b/>
-                <w:bCs/>
-                <w:color w:val="FFFFFF"/>
-                <w:sz w:val="21"/>
-                <w:szCs w:val="21"/>
-              </w:rPr>
-              <w:t xml:space="preserve">Tipo</w:t>
-            </w:r>
-          </w:p>
-        </w:tc>
-        <w:tc>
-          <w:tcPr>
-            <w:tcW w:type="dxa" w:w="3576"/>
-            <w:shd w:fill="8C2B3D" w:val="clear"/>
-            <w:tcMar>
-              <w:top w:type="dxa" w:w="90"/>
-              <w:left w:type="dxa" w:w="130"/>
-              <w:bottom w:type="dxa" w:w="90"/>
-              <w:right w:type="dxa" w:w="130"/>
-            </w:tcMar>
-          </w:tcPr>
-          <w:p>
-            <w:pPr>
-              <w:spacing w:after="0" w:before="0" w:line="264" w:lineRule="auto"/>
-              <w:jc w:val="left"/>
-            </w:pPr>
-            <w:r>
-              <w:rPr>
-                <w:rFonts w:ascii="Aptos" w:cs="Aptos" w:eastAsia="Aptos" w:hAnsi="Aptos"/>
-                <w:b/>
-                <w:bCs/>
-                <w:color w:val="FFFFFF"/>
-                <w:sz w:val="21"/>
-                <w:szCs w:val="21"/>
-              </w:rPr>
-              <w:t xml:space="preserve">Palabras aprox.</w:t>
-            </w:r>
-          </w:p>
-        </w:tc>
-        <w:tc>
-          <w:tcPr>
-            <w:tcW w:type="dxa" w:w="2073"/>
-            <w:shd w:fill="8C2B3D" w:val="clear"/>
-            <w:tcMar>
-              <w:top w:type="dxa" w:w="90"/>
-              <w:left w:type="dxa" w:w="130"/>
-              <w:bottom w:type="dxa" w:w="90"/>
-              <w:right w:type="dxa" w:w="130"/>
-            </w:tcMar>
-          </w:tcPr>
-          <w:p>
-            <w:pPr>
-              <w:spacing w:after="0" w:before="0" w:line="264" w:lineRule="auto"/>
-              <w:jc w:val="left"/>
-            </w:pPr>
-            <w:r>
-              <w:rPr>
-                <w:rFonts w:ascii="Aptos" w:cs="Aptos" w:eastAsia="Aptos" w:hAnsi="Aptos"/>
-                <w:b/>
-                <w:bCs/>
-                <w:color w:val="FFFFFF"/>
-                <w:sz w:val="21"/>
-                <w:szCs w:val="21"/>
-              </w:rPr>
-              <w:t xml:space="preserve">Lectura</w:t>
-            </w:r>
-          </w:p>
-        </w:tc>
-      </w:tr>
-      <w:tr>
-        <w:tc>
-          <w:tcPr>
-            <w:tcW w:type="dxa" w:w="3524"/>
-            <w:shd w:fill="F6F0EF" w:val="clear"/>
-            <w:tcMar>
-              <w:top w:type="dxa" w:w="90"/>
-              <w:left w:type="dxa" w:w="130"/>
-              <w:bottom w:type="dxa" w:w="90"/>
-              <w:right w:type="dxa" w:w="130"/>
-            </w:tcMar>
-          </w:tcPr>
-          <w:p>
-            <w:pPr>
-              <w:spacing w:after="0" w:before="0" w:line="264" w:lineRule="auto"/>
-              <w:jc w:val="left"/>
-            </w:pPr>
-            <w:r>
-              <w:t xml:space="preserve">Artículo breve</w:t>
-            </w:r>
-          </w:p>
-        </w:tc>
-        <w:tc>
-          <w:tcPr>
-            <w:tcW w:type="dxa" w:w="3576"/>
-            <w:shd w:fill="F6F0EF" w:val="clear"/>
-            <w:tcMar>
-              <w:top w:type="dxa" w:w="90"/>
-              <w:left w:type="dxa" w:w="130"/>
-              <w:bottom w:type="dxa" w:w="90"/>
-              <w:right w:type="dxa" w:w="130"/>
-            </w:tcMar>
-          </w:tcPr>
-          <w:p>
-            <w:pPr>
-              <w:spacing w:after="0" w:before="0" w:line="264" w:lineRule="auto"/>
-              <w:jc w:val="left"/>
-            </w:pPr>
-            <w:r>
-              <w:t xml:space="preserve">150 – 400</w:t>
-            </w:r>
-          </w:p>
-        </w:tc>
-        <w:tc>
-          <w:tcPr>
-            <w:tcW w:type="dxa" w:w="2073"/>
-            <w:shd w:fill="F6F0EF" w:val="clear"/>
-            <w:tcMar>
-              <w:top w:type="dxa" w:w="90"/>
-              <w:left w:type="dxa" w:w="130"/>
-              <w:bottom w:type="dxa" w:w="90"/>
-              <w:right w:type="dxa" w:w="130"/>
-            </w:tcMar>
-          </w:tcPr>
-          <w:p>
-            <w:pPr>
-              <w:spacing w:after="0" w:before="0" w:line="264" w:lineRule="auto"/>
-              <w:jc w:val="left"/>
-            </w:pPr>
-            <w:r>
-              <w:t xml:space="preserve">1 – 2 min</w:t>
-            </w:r>
-          </w:p>
-        </w:tc>
-      </w:tr>
-      <w:tr>
-        <w:tc>
-          <w:tcPr>
-            <w:tcW w:type="dxa" w:w="3524"/>
-            <w:tcMar>
-              <w:top w:type="dxa" w:w="90"/>
-              <w:left w:type="dxa" w:w="130"/>
-              <w:bottom w:type="dxa" w:w="90"/>
-              <w:right w:type="dxa" w:w="130"/>
-            </w:tcMar>
-          </w:tcPr>
-          <w:p>
-            <w:pPr>
-              <w:spacing w:after="0" w:before="0" w:line="264" w:lineRule="auto"/>
-              <w:jc w:val="left"/>
-            </w:pPr>
-            <w:r>
-              <w:t xml:space="preserve">Artículo estándar</w:t>
-            </w:r>
-          </w:p>
-        </w:tc>
-        <w:tc>
-          <w:tcPr>
-            <w:tcW w:type="dxa" w:w="3576"/>
-            <w:tcMar>
-              <w:top w:type="dxa" w:w="90"/>
-              <w:left w:type="dxa" w:w="130"/>
-              <w:bottom w:type="dxa" w:w="90"/>
-              <w:right w:type="dxa" w:w="130"/>
-            </w:tcMar>
-          </w:tcPr>
-          <w:p>
-            <w:pPr>
-              <w:spacing w:after="0" w:before="0" w:line="264" w:lineRule="auto"/>
-              <w:jc w:val="left"/>
-            </w:pPr>
-            <w:r>
-              <w:t xml:space="preserve">400 – 1 000</w:t>
-            </w:r>
-          </w:p>
-        </w:tc>
-        <w:tc>
-          <w:tcPr>
-            <w:tcW w:type="dxa" w:w="2073"/>
-            <w:tcMar>
-              <w:top w:type="dxa" w:w="90"/>
-              <w:left w:type="dxa" w:w="130"/>
-              <w:bottom w:type="dxa" w:w="90"/>
-              <w:right w:type="dxa" w:w="130"/>
-            </w:tcMar>
-          </w:tcPr>
-          <w:p>
-            <w:pPr>
-              <w:spacing w:after="0" w:before="0" w:line="264" w:lineRule="auto"/>
-              <w:jc w:val="left"/>
-            </w:pPr>
-            <w:r>
-              <w:t xml:space="preserve">2 – 5 min</w:t>
-            </w:r>
-          </w:p>
-        </w:tc>
-      </w:tr>
-      <w:tr>
-        <w:tc>
-          <w:tcPr>
-            <w:tcW w:type="dxa" w:w="3524"/>
-            <w:shd w:fill="F6F0EF" w:val="clear"/>
-            <w:tcMar>
-              <w:top w:type="dxa" w:w="90"/>
-              <w:left w:type="dxa" w:w="130"/>
-              <w:bottom w:type="dxa" w:w="90"/>
-              <w:right w:type="dxa" w:w="130"/>
-            </w:tcMar>
-          </w:tcPr>
-          <w:p>
-            <w:pPr>
-              <w:spacing w:after="0" w:before="0" w:line="264" w:lineRule="auto"/>
-              <w:jc w:val="left"/>
-            </w:pPr>
-            <w:r>
-              <w:t xml:space="preserve">En profundidad</w:t>
-            </w:r>
-          </w:p>
-        </w:tc>
-        <w:tc>
-          <w:tcPr>
-            <w:tcW w:type="dxa" w:w="3576"/>
-            <w:shd w:fill="F6F0EF" w:val="clear"/>
-            <w:tcMar>
-              <w:top w:type="dxa" w:w="90"/>
-              <w:left w:type="dxa" w:w="130"/>
-              <w:bottom w:type="dxa" w:w="90"/>
-              <w:right w:type="dxa" w:w="130"/>
-            </w:tcMar>
-          </w:tcPr>
-          <w:p>
-            <w:pPr>
-              <w:spacing w:after="0" w:before="0" w:line="264" w:lineRule="auto"/>
-              <w:jc w:val="left"/>
-            </w:pPr>
-            <w:r>
-              <w:t xml:space="preserve">1 000 – 2 000</w:t>
-            </w:r>
-          </w:p>
-        </w:tc>
-        <w:tc>
-          <w:tcPr>
-            <w:tcW w:type="dxa" w:w="2073"/>
-            <w:shd w:fill="F6F0EF" w:val="clear"/>
-            <w:tcMar>
-              <w:top w:type="dxa" w:w="90"/>
-              <w:left w:type="dxa" w:w="130"/>
-              <w:bottom w:type="dxa" w:w="90"/>
-              <w:right w:type="dxa" w:w="130"/>
-            </w:tcMar>
-          </w:tcPr>
-          <w:p>
-            <w:pPr>
-              <w:spacing w:after="0" w:before="0" w:line="264" w:lineRule="auto"/>
-              <w:jc w:val="left"/>
-            </w:pPr>
-            <w:r>
-              <w:t xml:space="preserve">5 – 10 min</w:t>
-            </w:r>
-          </w:p>
-        </w:tc>
-      </w:tr>
-    </w:tbl>
-    <w:p>
-      <w:pPr>
-        <w:spacing w:after="120"/>
-      </w:pPr>
-    </w:p>
-    <w:p>
-      <w:r>
-        <w:t xml:space="preserve">Una </w:t>
-      </w:r>
-      <w:r>
-        <w:rPr>
-          <w:b/>
-          <w:bCs/>
-        </w:rPr>
-        <w:t xml:space="preserve">sola idea principal</w:t>
-      </w:r>
-      <w:r>
-        <w:t xml:space="preserve"> por artículo. Claridad importa más que extensión.</w:t>
-      </w:r>
-    </w:p>
-    <w:p>
-      <w:r>
-        <w:rPr>
-          <w:b/>
-          <w:bCs/>
-        </w:rPr>
-        <w:t xml:space="preserve">Al compartir</w:t>
-      </w:r>
-      <w:r>
-        <w:t xml:space="preserve"> en WhatsApp o redes, la línea de contexto puede ser:</w:t>
-      </w:r>
-    </w:p>
-    <w:p>
-      <w:pPr>
-        <w:pStyle w:val="ListParagraph"/>
-        <w:numPr>
-          <w:ilvl w:val="0"/>
-          <w:numId w:val="2"/>
-        </w:numPr>
-      </w:pPr>
-      <w:r>
-        <w:rPr>
-          <w:rFonts w:ascii="Consolas" w:cs="Consolas" w:eastAsia="Consolas" w:hAnsi="Consolas"/>
-          <w:color w:val="8C2B3D"/>
-          <w:sz w:val="19"/>
-          <w:szCs w:val="19"/>
-          <w:shd w:fill="F6F0EF" w:val="clear"/>
-        </w:rPr>
-        <w:t xml:space="preserve">Reflexión · [Autor] · Camino del Dharma</w:t>
-      </w:r>
-    </w:p>
-    <w:p>
-      <w:pPr>
-        <w:pStyle w:val="ListParagraph"/>
-        <w:numPr>
-          <w:ilvl w:val="0"/>
-          <w:numId w:val="2"/>
-        </w:numPr>
-      </w:pPr>
-      <w:r>
-        <w:rPr>
-          <w:rFonts w:ascii="Consolas" w:cs="Consolas" w:eastAsia="Consolas" w:hAnsi="Consolas"/>
-          <w:color w:val="8C2B3D"/>
-          <w:sz w:val="19"/>
-          <w:szCs w:val="19"/>
-          <w:shd w:fill="F6F0EF" w:val="clear"/>
-        </w:rPr>
-        <w:t xml:space="preserve">Artículo · [Autor] · Camino del Dharma</w:t>
-      </w:r>
-    </w:p>
-    <w:p>
-      <w:pPr>
-        <w:pStyle w:val="ListParagraph"/>
-        <w:numPr>
-          <w:ilvl w:val="0"/>
-          <w:numId w:val="2"/>
-        </w:numPr>
-      </w:pPr>
-      <w:r>
-        <w:rPr>
-          <w:rFonts w:ascii="Consolas" w:cs="Consolas" w:eastAsia="Consolas" w:hAnsi="Consolas"/>
-          <w:color w:val="8C2B3D"/>
-          <w:sz w:val="19"/>
-          <w:szCs w:val="19"/>
-          <w:shd w:fill="F6F0EF" w:val="clear"/>
-        </w:rPr>
-        <w:t xml:space="preserve">Nota · [Autor] · Camino del Dharma</w:t>
-      </w:r>
-    </w:p>
-    <w:p>
-      <w:pPr>
-        <w:pStyle w:val="ListParagraph"/>
-        <w:numPr>
-          <w:ilvl w:val="0"/>
-          <w:numId w:val="2"/>
-        </w:numPr>
-      </w:pPr>
-      <w:r>
-        <w:rPr>
-          <w:rFonts w:ascii="Consolas" w:cs="Consolas" w:eastAsia="Consolas" w:hAnsi="Consolas"/>
-          <w:color w:val="8C2B3D"/>
-          <w:sz w:val="19"/>
-          <w:szCs w:val="19"/>
-          <w:shd w:fill="F6F0EF" w:val="clear"/>
-        </w:rPr>
-        <w:t xml:space="preserve">Entrevista · [Autor o entrevistado] · Camino del Dharma</w:t>
-      </w:r>
-    </w:p>
-    <w:p>
-      <w:pPr>
-        <w:pStyle w:val="ListParagraph"/>
-        <w:numPr>
-          <w:ilvl w:val="0"/>
-          <w:numId w:val="2"/>
-        </w:numPr>
-      </w:pPr>
-      <w:r>
-        <w:rPr>
-          <w:rFonts w:ascii="Consolas" w:cs="Consolas" w:eastAsia="Consolas" w:hAnsi="Consolas"/>
-          <w:color w:val="8C2B3D"/>
-          <w:sz w:val="19"/>
-          <w:szCs w:val="19"/>
-          <w:shd w:fill="F6F0EF" w:val="clear"/>
-        </w:rPr>
-        <w:t xml:space="preserve">Relato · [Autor] · Camino del Dharma</w:t>
-      </w:r>
-    </w:p>
-    <w:p>
-      <w:r>
-        <w:t xml:space="preserve">(según el tipo de pieza de la tabla en §5)</w:t>
-      </w:r>
-    </w:p>
-    <w:p>
-      <w:pPr>
-        <w:pStyle w:val="Heading2"/>
-      </w:pPr>
-      <w:r>
-        <w:t xml:space="preserve">7.5 Checklist antes de publicar</w:t>
-      </w:r>
-    </w:p>
-    <w:p>
-      <w:pPr>
-        <w:pStyle w:val="ListParagraph"/>
-        <w:numPr>
-          <w:ilvl w:val="0"/>
-          <w:numId w:val="2"/>
-        </w:numPr>
-      </w:pPr>
-      <w:r>
-        <w:t xml:space="preserve">¿Suena a </w:t>
-      </w:r>
-      <w:r>
-        <w:rPr>
-          <w:b/>
-          <w:bCs/>
-        </w:rPr>
-        <w:t xml:space="preserve">espacio de acogida</w:t>
-      </w:r>
-      <w:r>
-        <w:t xml:space="preserve">?</w:t>
-      </w:r>
-    </w:p>
-    <w:p>
-      <w:pPr>
-        <w:pStyle w:val="ListParagraph"/>
-        <w:numPr>
-          <w:ilvl w:val="0"/>
-          <w:numId w:val="2"/>
-        </w:numPr>
-      </w:pPr>
-      <w:r>
-        <w:t xml:space="preserve">¿Está escrito con </w:t>
-      </w:r>
-      <w:r>
-        <w:rPr>
-          <w:b/>
-          <w:bCs/>
-        </w:rPr>
-        <w:t xml:space="preserve">sobriedad</w:t>
-      </w:r>
-      <w:r>
-        <w:t xml:space="preserve">?</w:t>
-      </w:r>
-    </w:p>
-    <w:p>
-      <w:pPr>
-        <w:pStyle w:val="ListParagraph"/>
-        <w:numPr>
-          <w:ilvl w:val="0"/>
-          <w:numId w:val="2"/>
-        </w:numPr>
-      </w:pPr>
-      <w:r>
-        <w:t xml:space="preserve">¿Se </w:t>
-      </w:r>
-      <w:r>
-        <w:rPr>
-          <w:b/>
-          <w:bCs/>
-        </w:rPr>
-        <w:t xml:space="preserve">entiende a la primera</w:t>
-      </w:r>
-      <w:r>
-        <w:t xml:space="preserve">?</w:t>
-      </w:r>
-    </w:p>
-    <w:p>
-      <w:pPr>
-        <w:pStyle w:val="ListParagraph"/>
-        <w:numPr>
-          <w:ilvl w:val="0"/>
-          <w:numId w:val="2"/>
-        </w:numPr>
-      </w:pPr>
-      <w:r>
-        <w:t xml:space="preserve">¿Evita marketing, autoayuda y urgencia?</w:t>
-      </w:r>
-    </w:p>
-    <w:p>
-      <w:pPr>
-        <w:pStyle w:val="ListParagraph"/>
-        <w:numPr>
-          <w:ilvl w:val="0"/>
-          <w:numId w:val="2"/>
-        </w:numPr>
-      </w:pPr>
-      <w:r>
-        <w:t xml:space="preserve">¿Respeta la terminología de la comunidad?</w:t>
-      </w:r>
-    </w:p>
-    <w:p>
-      <w:pPr>
-        <w:pStyle w:val="ListParagraph"/>
-        <w:numPr>
-          <w:ilvl w:val="0"/>
-          <w:numId w:val="2"/>
-        </w:numPr>
-      </w:pPr>
-      <w:r>
-        <w:t xml:space="preserve">¿Dice </w:t>
-      </w:r>
-      <w:r>
-        <w:rPr>
-          <w:b/>
-          <w:bCs/>
-        </w:rPr>
-        <w:t xml:space="preserve">solo lo necesario</w:t>
-      </w:r>
-      <w:r>
-        <w:t xml:space="preserve">?</w:t>
-      </w:r>
-    </w:p>
-    <w:p>
-      <w:pPr>
-        <w:pStyle w:val="ListParagraph"/>
-        <w:numPr>
-          <w:ilvl w:val="0"/>
-          <w:numId w:val="2"/>
-        </w:numPr>
-      </w:pPr>
-      <w:r>
-        <w:t xml:space="preserve">Si hay </w:t>
-      </w:r>
-      <w:r>
-        <w:rPr>
-          <w:b/>
-          <w:bCs/>
-        </w:rPr>
-        <w:t xml:space="preserve">entrevista o relato personal</w:t>
-      </w:r>
-      <w:r>
-        <w:t xml:space="preserve">: ¿hay permiso y el foco está en la práctica, no en autopromoción?</w:t>
-      </w:r>
-    </w:p>
-    <w:p>
-      <w:r>
-        <w:t xml:space="preserve">Si alguna respuesta es no, el texto aún no está listo.</w:t>
-      </w:r>
-    </w:p>
-    <w:p>
-      <w:r>
-        <w:t xml:space="preserve">El audit SEO </w:t>
-      </w:r>
-      <w:r>
-        <w:rPr>
-          <w:b/>
-          <w:bCs/>
-        </w:rPr>
-        <w:t xml:space="preserve">coincide</w:t>
-      </w:r>
-      <w:r>
-        <w:t xml:space="preserve">: el blog debe ser </w:t>
-      </w:r>
-      <w:r>
-        <w:rPr>
-          <w:b/>
-          <w:bCs/>
-        </w:rPr>
-        <w:t xml:space="preserve">más útil y más claro</w:t>
-      </w:r>
-      <w:r>
-        <w:t xml:space="preserve">, no “SEO agresivo”.</w:t>
+        <w:t xml:space="preserve">21</w:t>
+      </w:r>
+      <w:r>
+        <w:t xml:space="preserve"> §14) ya resuelve el caso —la voz conserva la doble d, los metadatos pensados para el buscador pueden usar la forma extendida, y nunca se esconden palabras—. No hay que elegir entre sonar como la comunidad y ser encontrable.</w:t>
       </w:r>
     </w:p>
     <w:p>
@@ -7777,7 +6409,6 @@
             </w:pPr>
             <w:r>
               <w:rPr>
-                <w:rFonts w:ascii="Aptos" w:cs="Aptos" w:eastAsia="Aptos" w:hAnsi="Aptos"/>
                 <w:b/>
                 <w:bCs/>
                 <w:color w:val="FFFFFF"/>
@@ -7806,7 +6437,6 @@
             </w:pPr>
             <w:r>
               <w:rPr>
-                <w:rFonts w:ascii="Aptos" w:cs="Aptos" w:eastAsia="Aptos" w:hAnsi="Aptos"/>
                 <w:b/>
                 <w:bCs/>
                 <w:color w:val="FFFFFF"/>
@@ -8097,7 +6727,7 @@
         <w:pStyle w:val="ListParagraph"/>
         <w:numPr>
           <w:ilvl w:val="0"/>
-          <w:numId w:val="5"/>
+          <w:numId w:val="4"/>
         </w:numPr>
       </w:pPr>
       <w:r>
@@ -8109,7 +6739,7 @@
         <w:pStyle w:val="ListParagraph"/>
         <w:numPr>
           <w:ilvl w:val="0"/>
-          <w:numId w:val="5"/>
+          <w:numId w:val="4"/>
         </w:numPr>
       </w:pPr>
       <w:r>
@@ -8121,7 +6751,7 @@
         <w:pStyle w:val="ListParagraph"/>
         <w:numPr>
           <w:ilvl w:val="0"/>
-          <w:numId w:val="5"/>
+          <w:numId w:val="4"/>
         </w:numPr>
       </w:pPr>
       <w:r>
@@ -8133,7 +6763,7 @@
         <w:pStyle w:val="ListParagraph"/>
         <w:numPr>
           <w:ilvl w:val="0"/>
-          <w:numId w:val="5"/>
+          <w:numId w:val="4"/>
         </w:numPr>
       </w:pPr>
       <w:r>
@@ -8145,7 +6775,7 @@
         <w:pStyle w:val="ListParagraph"/>
         <w:numPr>
           <w:ilvl w:val="0"/>
-          <w:numId w:val="5"/>
+          <w:numId w:val="4"/>
         </w:numPr>
       </w:pPr>
       <w:r>
@@ -8167,7 +6797,7 @@
         <w:pStyle w:val="ListParagraph"/>
         <w:numPr>
           <w:ilvl w:val="0"/>
-          <w:numId w:val="5"/>
+          <w:numId w:val="4"/>
         </w:numPr>
       </w:pPr>
       <w:r>
@@ -8184,74 +6814,7 @@
         <w:pStyle w:val="Heading1"/>
       </w:pPr>
       <w:r>
-        <w:t xml:space="preserve">10. Flujo posible (orientativo)</w:t>
-      </w:r>
-    </w:p>
-    <w:p>
-      <w:r>
-        <w:t xml:space="preserve">Este flujo puede adaptarse u omitirse:</w:t>
-      </w:r>
-    </w:p>
-    <w:p>
-      <w:pPr>
-        <w:pStyle w:val="CodeBlock"/>
-        <w:spacing w:after="0" w:before="120"/>
-      </w:pPr>
-      <w:r>
-        <w:t xml:space="preserve">Conversación interna del equipo editorial</w:t>
-      </w:r>
-    </w:p>
-    <w:p>
-      <w:pPr>
-        <w:pStyle w:val="CodeBlock"/>
-        <w:spacing w:after="0" w:before="0"/>
-      </w:pPr>
-      <w:r>
-        <w:t xml:space="preserve">    → Calendario y responsables</w:t>
-      </w:r>
-    </w:p>
-    <w:p>
-      <w:pPr>
-        <w:pStyle w:val="CodeBlock"/>
-        <w:spacing w:after="0" w:before="0"/>
-      </w:pPr>
-      <w:r>
-        <w:t xml:space="preserve">    → Borrador → revisión de voz (§7) → aprobación interna</w:t>
-      </w:r>
-    </w:p>
-    <w:p>
-      <w:pPr>
-        <w:pStyle w:val="CodeBlock"/>
-        <w:spacing w:after="0" w:before="0"/>
-      </w:pPr>
-      <w:r>
-        <w:t xml:space="preserve">    → Entrega al equipo de publicación web</w:t>
-      </w:r>
-    </w:p>
-    <w:p>
-      <w:pPr>
-        <w:pStyle w:val="CodeBlock"/>
-        <w:spacing w:after="0" w:before="0"/>
-      </w:pPr>
-      <w:r>
-        <w:t xml:space="preserve">    → Enlaces desde otras páginas del sitio, si se considera útil</w:t>
-      </w:r>
-    </w:p>
-    <w:p>
-      <w:pPr>
-        <w:pStyle w:val="CodeBlock"/>
-        <w:spacing w:after="220" w:before="0"/>
-      </w:pPr>
-      <w:r>
-        <w:t xml:space="preserve">    → Siguientes artículos, a su ritmo</w:t>
-      </w:r>
-    </w:p>
-    <w:p>
-      <w:pPr>
-        <w:pStyle w:val="Heading1"/>
-      </w:pPr>
-      <w:r>
-        <w:t xml:space="preserve">11. Preguntas frecuentes</w:t>
+        <w:t xml:space="preserve">10. Preguntas frecuentes</w:t>
       </w:r>
     </w:p>
     <w:p>
@@ -8402,18 +6965,6 @@
       </w:r>
       <w:r>
         <w:t xml:space="preserve">: que alguien vea cómo es practicar aquí. No hace falta una serie de perfiles; una entrevista bien hecha cada cierto tiempo puede bastar.</w:t>
-      </w:r>
-    </w:p>
-    <w:p>
-      <w:r>
-        <w:rPr>
-          <w:b/>
-          <w:bCs/>
-        </w:rPr>
-        <w:t xml:space="preserve">¿Quién sube el artículo al sitio?</w:t>
-      </w:r>
-      <w:r>
-        <w:t xml:space="preserve"> El equipo de publicación web. La persona encargada entrega el texto revisado.</w:t>
       </w:r>
     </w:p>
     <w:p>
@@ -8579,62 +7130,11 @@
       </w:r>
     </w:p>
     <w:p>
-      <w:r>
-        <w:rPr>
-          <w:b/>
-          <w:bCs/>
-        </w:rPr>
-        <w:t xml:space="preserve">¿Este brief pide crear la sección </w:t>
-      </w:r>
-      <w:r>
-        <w:rPr>
-          <w:rFonts w:ascii="Consolas" w:cs="Consolas" w:eastAsia="Consolas" w:hAnsi="Consolas"/>
-          <w:b/>
-          <w:bCs/>
-          <w:color w:val="8C2B3D"/>
-          <w:sz w:val="19"/>
-          <w:szCs w:val="19"/>
-          <w:shd w:fill="F6F0EF" w:val="clear"/>
-        </w:rPr>
-        <w:t xml:space="preserve">/sanghas/</w:t>
-      </w:r>
-      <w:r>
-        <w:rPr>
-          <w:b/>
-          <w:bCs/>
-        </w:rPr>
-        <w:t xml:space="preserve"> en el sitio?</w:t>
-      </w:r>
-      <w:r>
-        <w:t xml:space="preserve"> </w:t>
-      </w:r>
-      <w:r>
-        <w:rPr>
-          <w:b/>
-          <w:bCs/>
-        </w:rPr>
-        <w:t xml:space="preserve">No.</w:t>
-      </w:r>
-      <w:r>
-        <w:t xml:space="preserve"> Aquí solo se habla de </w:t>
-      </w:r>
-      <w:r>
-        <w:rPr>
-          <w:b/>
-          <w:bCs/>
-        </w:rPr>
-        <w:t xml:space="preserve">textos para el blog</w:t>
-      </w:r>
-      <w:r>
-        <w:t xml:space="preserve">.</w:t>
-      </w:r>
-    </w:p>
-    <w:p>
       <w:pPr>
         <w:pStyle w:val="Heading1"/>
       </w:pPr>
       <w:r>
-        <w:t xml:space="preserve">12. Cierre</w:t>
+        <w:t xml:space="preserve">11. Cierre</w:t>
       </w:r>
     </w:p>
     <w:p>
@@ -9056,12 +7556,6 @@
     </w:lvlOverride>
   </w:num>
   <w:num w:numId="4">
-    <w:abstractNumId w:val="3"/>
-    <w:lvlOverride w:ilvl="0">
-      <w:startOverride w:val="1"/>
-    </w:lvlOverride>
-  </w:num>
-  <w:num w:numId="5">
     <w:abstractNumId w:val="3"/>
     <w:lvlOverride w:ilvl="0">
       <w:startOverride w:val="1"/>

</xml_diff>

<commit_message>
Revise editorial brief and SEO documentation for improved clarity and consistency
- Updated the `24-brief-editorial-blog-y-visibilidad` to clarify the relationship between the editorial voice and existing documents, ensuring that the brief is self-sufficient while referencing the manual for voice attributes.
- Enhanced the `README.md` in the SEO reports to specify the role of the brief in guiding content strategy, emphasizing its connection to the editorial team's definitions.
- Made adjustments to the content structure in the brief to better outline the types of pieces and their visibility contributions, providing clearer guidance for the editorial team.
</commit_message>
<xml_diff>
--- a/docs/24-brief-editorial-blog-y-visibilidad.docx
+++ b/docs/24-brief-editorial-blog-y-visibilidad.docx
@@ -295,7 +295,7 @@
             <w:r>
               <w:t xml:space="preserve">Rafael Figueredo Oropeza — </w:t>
             </w:r>
-            <w:hyperlink w:history="1" r:id="rIdi7el6vdlxpipywh8xitb4">
+            <w:hyperlink w:history="1" r:id="rIdy3th9v_vdvvglw2ukhodv">
               <w:r>
                 <w:rPr>
                   <w:color w:val="8C2B3D"/>
@@ -307,7 +307,7 @@
             <w:r>
               <w:t xml:space="preserve"> · </w:t>
             </w:r>
-            <w:hyperlink w:history="1" r:id="rIdunfrpqbzingr1ziddms8d">
+            <w:hyperlink w:history="1" r:id="rIdmxeftvwzvyqh9jvtszi_e">
               <w:r>
                 <w:rPr>
                   <w:color w:val="8C2B3D"/>
@@ -441,7 +441,7 @@
       <w:r>
         <w:t xml:space="preserve">El sitio </w:t>
       </w:r>
-      <w:hyperlink w:history="1" r:id="rIdylgv19h2_cu0ughvbhkf5">
+      <w:hyperlink w:history="1" r:id="rIdndl_p7u5fa6gc4ycn7vfm">
         <w:r>
           <w:rPr>
             <w:color w:val="8C2B3D"/>
@@ -3088,40 +3088,17 @@
     </w:p>
     <w:p>
       <w:r>
-        <w:t xml:space="preserve">Los </w:t>
-      </w:r>
-      <w:r>
-        <w:rPr>
-          <w:b/>
-          <w:bCs/>
-        </w:rPr>
-        <w:t xml:space="preserve">tipos de pieza</w:t>
-      </w:r>
-      <w:r>
-        <w:t xml:space="preserve"> y su extensión orientativa están definidos en el </w:t>
-      </w:r>
-      <w:r>
-        <w:rPr>
-          <w:b/>
-          <w:bCs/>
-        </w:rPr>
-        <w:t xml:space="preserve">Sistema editorial</w:t>
-      </w:r>
-      <w:r>
-        <w:t xml:space="preserve"> (</w:t>
-      </w:r>
-      <w:r>
-        <w:rPr>
-          <w:rFonts w:ascii="Consolas" w:cs="Consolas" w:eastAsia="Consolas" w:hAnsi="Consolas"/>
-          <w:color w:val="8C2B3D"/>
-          <w:sz w:val="19"/>
-          <w:szCs w:val="19"/>
-          <w:shd w:fill="F6F0EF" w:val="clear"/>
-        </w:rPr>
-        <w:t xml:space="preserve">23</w:t>
-      </w:r>
-      <w:r>
-        <w:t xml:space="preserve"> §4.0 y §4.3): reflexión, artículo educativo y nota de contexto. Lo que añade la mirada SEO es cómo se comporta cada uno ante las búsquedas:</w:t>
+        <w:t xml:space="preserve">Hay </w:t>
+      </w:r>
+      <w:r>
+        <w:rPr>
+          <w:b/>
+          <w:bCs/>
+        </w:rPr>
+        <w:t xml:space="preserve">tres tipos de pieza</w:t>
+      </w:r>
+      <w:r>
+        <w:t xml:space="preserve">. Lo que añade la mirada SEO es cómo se comporta cada uno ante las búsquedas:</w:t>
       </w:r>
     </w:p>
     <w:tbl>
@@ -3137,8 +3114,9 @@
         </w:tblBorders>
       </w:tblPr>
       <w:tblGrid>
-        <w:gridCol w:w="2972"/>
-        <w:gridCol w:w="6201"/>
+        <w:gridCol w:w="1452"/>
+        <w:gridCol w:w="3762"/>
+        <w:gridCol w:w="3959"/>
       </w:tblGrid>
       <w:tr>
         <w:trPr>
@@ -3146,7 +3124,7 @@
         </w:trPr>
         <w:tc>
           <w:tcPr>
-            <w:tcW w:type="dxa" w:w="2972"/>
+            <w:tcW w:type="dxa" w:w="1452"/>
             <w:shd w:fill="8C2B3D" w:val="clear"/>
             <w:tcMar>
               <w:top w:type="dxa" w:w="90"/>
@@ -3168,19 +3146,26 @@
                 <w:sz w:val="21"/>
                 <w:szCs w:val="21"/>
               </w:rPr>
-              <w:t xml:space="preserve">Tipo de pieza (</w:t>
-            </w:r>
-            <w:r>
-              <w:rPr>
-                <w:rFonts w:ascii="Consolas" w:cs="Consolas" w:eastAsia="Consolas" w:hAnsi="Consolas"/>
-                <w:b/>
-                <w:bCs/>
-                <w:color w:val="FFFFFF"/>
-                <w:sz w:val="19"/>
-                <w:szCs w:val="19"/>
-              </w:rPr>
-              <w:t xml:space="preserve">23</w:t>
-            </w:r>
+              <w:t xml:space="preserve">Tipo de pieza</w:t>
+            </w:r>
+          </w:p>
+        </w:tc>
+        <w:tc>
+          <w:tcPr>
+            <w:tcW w:type="dxa" w:w="3762"/>
+            <w:shd w:fill="8C2B3D" w:val="clear"/>
+            <w:tcMar>
+              <w:top w:type="dxa" w:w="90"/>
+              <w:left w:type="dxa" w:w="130"/>
+              <w:bottom w:type="dxa" w:w="90"/>
+              <w:right w:type="dxa" w:w="130"/>
+            </w:tcMar>
+          </w:tcPr>
+          <w:p>
+            <w:pPr>
+              <w:spacing w:after="0" w:before="0" w:line="264" w:lineRule="auto"/>
+              <w:jc w:val="left"/>
+            </w:pPr>
             <w:r>
               <w:rPr>
                 <w:b/>
@@ -3189,13 +3174,13 @@
                 <w:sz w:val="21"/>
                 <w:szCs w:val="21"/>
               </w:rPr>
-              <w:t xml:space="preserve"> §4.0)</w:t>
-            </w:r>
-          </w:p>
-        </w:tc>
-        <w:tc>
-          <w:tcPr>
-            <w:tcW w:type="dxa" w:w="6201"/>
+              <w:t xml:space="preserve">Para qué sirve</w:t>
+            </w:r>
+          </w:p>
+        </w:tc>
+        <w:tc>
+          <w:tcPr>
+            <w:tcW w:type="dxa" w:w="3959"/>
             <w:shd w:fill="8C2B3D" w:val="clear"/>
             <w:tcMar>
               <w:top w:type="dxa" w:w="90"/>
@@ -3225,7 +3210,7 @@
       <w:tr>
         <w:tc>
           <w:tcPr>
-            <w:tcW w:type="dxa" w:w="2972"/>
+            <w:tcW w:type="dxa" w:w="1452"/>
             <w:shd w:fill="F6F0EF" w:val="clear"/>
             <w:tcMar>
               <w:top w:type="dxa" w:w="90"/>
@@ -3250,7 +3235,28 @@
         </w:tc>
         <w:tc>
           <w:tcPr>
-            <w:tcW w:type="dxa" w:w="6201"/>
+            <w:tcW w:type="dxa" w:w="3762"/>
+            <w:shd w:fill="F6F0EF" w:val="clear"/>
+            <w:tcMar>
+              <w:top w:type="dxa" w:w="90"/>
+              <w:left w:type="dxa" w:w="130"/>
+              <w:bottom w:type="dxa" w:w="90"/>
+              <w:right w:type="dxa" w:w="130"/>
+            </w:tcMar>
+          </w:tcPr>
+          <w:p>
+            <w:pPr>
+              <w:spacing w:after="0" w:before="0" w:line="264" w:lineRule="auto"/>
+              <w:jc w:val="left"/>
+            </w:pPr>
+            <w:r>
+              <w:t xml:space="preserve">Explicar un tema a quien aún no conoce la tradición</w:t>
+            </w:r>
+          </w:p>
+        </w:tc>
+        <w:tc>
+          <w:tcPr>
+            <w:tcW w:type="dxa" w:w="3959"/>
             <w:shd w:fill="F6F0EF" w:val="clear"/>
             <w:tcMar>
               <w:top w:type="dxa" w:w="90"/>
@@ -3273,7 +3279,7 @@
       <w:tr>
         <w:tc>
           <w:tcPr>
-            <w:tcW w:type="dxa" w:w="2972"/>
+            <w:tcW w:type="dxa" w:w="1452"/>
             <w:tcMar>
               <w:top w:type="dxa" w:w="90"/>
               <w:left w:type="dxa" w:w="130"/>
@@ -3297,7 +3303,27 @@
         </w:tc>
         <w:tc>
           <w:tcPr>
-            <w:tcW w:type="dxa" w:w="6201"/>
+            <w:tcW w:type="dxa" w:w="3762"/>
+            <w:tcMar>
+              <w:top w:type="dxa" w:w="90"/>
+              <w:left w:type="dxa" w:w="130"/>
+              <w:bottom w:type="dxa" w:w="90"/>
+              <w:right w:type="dxa" w:w="130"/>
+            </w:tcMar>
+          </w:tcPr>
+          <w:p>
+            <w:pPr>
+              <w:spacing w:after="0" w:before="0" w:line="264" w:lineRule="auto"/>
+              <w:jc w:val="left"/>
+            </w:pPr>
+            <w:r>
+              <w:t xml:space="preserve">Situar un hecho, lugar o actividad con datos verificables</w:t>
+            </w:r>
+          </w:p>
+        </w:tc>
+        <w:tc>
+          <w:tcPr>
+            <w:tcW w:type="dxa" w:w="3959"/>
             <w:tcMar>
               <w:top w:type="dxa" w:w="90"/>
               <w:left w:type="dxa" w:w="130"/>
@@ -3319,7 +3345,7 @@
       <w:tr>
         <w:tc>
           <w:tcPr>
-            <w:tcW w:type="dxa" w:w="2972"/>
+            <w:tcW w:type="dxa" w:w="1452"/>
             <w:shd w:fill="F6F0EF" w:val="clear"/>
             <w:tcMar>
               <w:top w:type="dxa" w:w="90"/>
@@ -3344,7 +3370,28 @@
         </w:tc>
         <w:tc>
           <w:tcPr>
-            <w:tcW w:type="dxa" w:w="6201"/>
+            <w:tcW w:type="dxa" w:w="3762"/>
+            <w:shd w:fill="F6F0EF" w:val="clear"/>
+            <w:tcMar>
+              <w:top w:type="dxa" w:w="90"/>
+              <w:left w:type="dxa" w:w="130"/>
+              <w:bottom w:type="dxa" w:w="90"/>
+              <w:right w:type="dxa" w:w="130"/>
+            </w:tcMar>
+          </w:tcPr>
+          <w:p>
+            <w:pPr>
+              <w:spacing w:after="0" w:before="0" w:line="264" w:lineRule="auto"/>
+              <w:jc w:val="left"/>
+            </w:pPr>
+            <w:r>
+              <w:t xml:space="preserve">Acompañar, profundizar en una experiencia o enseñanza</w:t>
+            </w:r>
+          </w:p>
+        </w:tc>
+        <w:tc>
+          <w:tcPr>
+            <w:tcW w:type="dxa" w:w="3959"/>
             <w:shd w:fill="F6F0EF" w:val="clear"/>
             <w:tcMar>
               <w:top w:type="dxa" w:w="90"/>
@@ -3369,6 +3416,331 @@
       <w:pPr>
         <w:spacing w:after="120"/>
       </w:pPr>
+    </w:p>
+    <w:p>
+      <w:r>
+        <w:rPr>
+          <w:b/>
+          <w:bCs/>
+        </w:rPr>
+        <w:t xml:space="preserve">Extensión orientativa</w:t>
+      </w:r>
+      <w:r>
+        <w:t xml:space="preserve">, flexible según el tema. La longitud responde al asunto, no a una meta de palabras: no hay ninguna ventaja de posicionamiento en alargar un texto.</w:t>
+      </w:r>
+    </w:p>
+    <w:tbl>
+      <w:tblPr>
+        <w:tblW w:type="dxa" w:w="9173"/>
+        <w:tblBorders>
+          <w:top w:val="single" w:color="D1AEAB" w:sz="4"/>
+          <w:left w:val="single" w:color="D1AEAB" w:sz="4"/>
+          <w:bottom w:val="single" w:color="D1AEAB" w:sz="4"/>
+          <w:right w:val="single" w:color="D1AEAB" w:sz="4"/>
+          <w:insideH w:val="single" w:color="D1AEAB" w:sz="4"/>
+          <w:insideV w:val="single" w:color="D1AEAB" w:sz="4"/>
+        </w:tblBorders>
+      </w:tblPr>
+      <w:tblGrid>
+        <w:gridCol w:w="3343"/>
+        <w:gridCol w:w="3367"/>
+        <w:gridCol w:w="2463"/>
+      </w:tblGrid>
+      <w:tr>
+        <w:trPr>
+          <w:tblHeader/>
+        </w:trPr>
+        <w:tc>
+          <w:tcPr>
+            <w:tcW w:type="dxa" w:w="3343"/>
+            <w:shd w:fill="8C2B3D" w:val="clear"/>
+            <w:tcMar>
+              <w:top w:type="dxa" w:w="90"/>
+              <w:left w:type="dxa" w:w="130"/>
+              <w:bottom w:type="dxa" w:w="90"/>
+              <w:right w:type="dxa" w:w="130"/>
+            </w:tcMar>
+          </w:tcPr>
+          <w:p>
+            <w:pPr>
+              <w:spacing w:after="0" w:before="0" w:line="264" w:lineRule="auto"/>
+              <w:jc w:val="left"/>
+            </w:pPr>
+            <w:r>
+              <w:rPr>
+                <w:b/>
+                <w:bCs/>
+                <w:color w:val="FFFFFF"/>
+                <w:sz w:val="21"/>
+                <w:szCs w:val="21"/>
+              </w:rPr>
+              <w:t xml:space="preserve">Tipo de publicación</w:t>
+            </w:r>
+          </w:p>
+        </w:tc>
+        <w:tc>
+          <w:tcPr>
+            <w:tcW w:type="dxa" w:w="3367"/>
+            <w:shd w:fill="8C2B3D" w:val="clear"/>
+            <w:tcMar>
+              <w:top w:type="dxa" w:w="90"/>
+              <w:left w:type="dxa" w:w="130"/>
+              <w:bottom w:type="dxa" w:w="90"/>
+              <w:right w:type="dxa" w:w="130"/>
+            </w:tcMar>
+          </w:tcPr>
+          <w:p>
+            <w:pPr>
+              <w:spacing w:after="0" w:before="0" w:line="264" w:lineRule="auto"/>
+              <w:jc w:val="left"/>
+            </w:pPr>
+            <w:r>
+              <w:rPr>
+                <w:b/>
+                <w:bCs/>
+                <w:color w:val="FFFFFF"/>
+                <w:sz w:val="21"/>
+                <w:szCs w:val="21"/>
+              </w:rPr>
+              <w:t xml:space="preserve">Extensión</w:t>
+            </w:r>
+          </w:p>
+        </w:tc>
+        <w:tc>
+          <w:tcPr>
+            <w:tcW w:type="dxa" w:w="2463"/>
+            <w:shd w:fill="8C2B3D" w:val="clear"/>
+            <w:tcMar>
+              <w:top w:type="dxa" w:w="90"/>
+              <w:left w:type="dxa" w:w="130"/>
+              <w:bottom w:type="dxa" w:w="90"/>
+              <w:right w:type="dxa" w:w="130"/>
+            </w:tcMar>
+          </w:tcPr>
+          <w:p>
+            <w:pPr>
+              <w:spacing w:after="0" w:before="0" w:line="264" w:lineRule="auto"/>
+              <w:jc w:val="left"/>
+            </w:pPr>
+            <w:r>
+              <w:rPr>
+                <w:b/>
+                <w:bCs/>
+                <w:color w:val="FFFFFF"/>
+                <w:sz w:val="21"/>
+                <w:szCs w:val="21"/>
+              </w:rPr>
+              <w:t xml:space="preserve">Lectura aprox.</w:t>
+            </w:r>
+          </w:p>
+        </w:tc>
+      </w:tr>
+      <w:tr>
+        <w:tc>
+          <w:tcPr>
+            <w:tcW w:type="dxa" w:w="3343"/>
+            <w:shd w:fill="F6F0EF" w:val="clear"/>
+            <w:tcMar>
+              <w:top w:type="dxa" w:w="90"/>
+              <w:left w:type="dxa" w:w="130"/>
+              <w:bottom w:type="dxa" w:w="90"/>
+              <w:right w:type="dxa" w:w="130"/>
+            </w:tcMar>
+          </w:tcPr>
+          <w:p>
+            <w:pPr>
+              <w:spacing w:after="0" w:before="0" w:line="264" w:lineRule="auto"/>
+              <w:jc w:val="left"/>
+            </w:pPr>
+            <w:r>
+              <w:t xml:space="preserve">Artículo breve</w:t>
+            </w:r>
+          </w:p>
+        </w:tc>
+        <w:tc>
+          <w:tcPr>
+            <w:tcW w:type="dxa" w:w="3367"/>
+            <w:shd w:fill="F6F0EF" w:val="clear"/>
+            <w:tcMar>
+              <w:top w:type="dxa" w:w="90"/>
+              <w:left w:type="dxa" w:w="130"/>
+              <w:bottom w:type="dxa" w:w="90"/>
+              <w:right w:type="dxa" w:w="130"/>
+            </w:tcMar>
+          </w:tcPr>
+          <w:p>
+            <w:pPr>
+              <w:spacing w:after="0" w:before="0" w:line="264" w:lineRule="auto"/>
+              <w:jc w:val="left"/>
+            </w:pPr>
+            <w:r>
+              <w:t xml:space="preserve">150 – 400 palabras</w:t>
+            </w:r>
+          </w:p>
+        </w:tc>
+        <w:tc>
+          <w:tcPr>
+            <w:tcW w:type="dxa" w:w="2463"/>
+            <w:shd w:fill="F6F0EF" w:val="clear"/>
+            <w:tcMar>
+              <w:top w:type="dxa" w:w="90"/>
+              <w:left w:type="dxa" w:w="130"/>
+              <w:bottom w:type="dxa" w:w="90"/>
+              <w:right w:type="dxa" w:w="130"/>
+            </w:tcMar>
+          </w:tcPr>
+          <w:p>
+            <w:pPr>
+              <w:spacing w:after="0" w:before="0" w:line="264" w:lineRule="auto"/>
+              <w:jc w:val="left"/>
+            </w:pPr>
+            <w:r>
+              <w:t xml:space="preserve">1 – 2 min</w:t>
+            </w:r>
+          </w:p>
+        </w:tc>
+      </w:tr>
+      <w:tr>
+        <w:tc>
+          <w:tcPr>
+            <w:tcW w:type="dxa" w:w="3343"/>
+            <w:tcMar>
+              <w:top w:type="dxa" w:w="90"/>
+              <w:left w:type="dxa" w:w="130"/>
+              <w:bottom w:type="dxa" w:w="90"/>
+              <w:right w:type="dxa" w:w="130"/>
+            </w:tcMar>
+          </w:tcPr>
+          <w:p>
+            <w:pPr>
+              <w:spacing w:after="0" w:before="0" w:line="264" w:lineRule="auto"/>
+              <w:jc w:val="left"/>
+            </w:pPr>
+            <w:r>
+              <w:t xml:space="preserve">Artículo estándar</w:t>
+            </w:r>
+          </w:p>
+        </w:tc>
+        <w:tc>
+          <w:tcPr>
+            <w:tcW w:type="dxa" w:w="3367"/>
+            <w:tcMar>
+              <w:top w:type="dxa" w:w="90"/>
+              <w:left w:type="dxa" w:w="130"/>
+              <w:bottom w:type="dxa" w:w="90"/>
+              <w:right w:type="dxa" w:w="130"/>
+            </w:tcMar>
+          </w:tcPr>
+          <w:p>
+            <w:pPr>
+              <w:spacing w:after="0" w:before="0" w:line="264" w:lineRule="auto"/>
+              <w:jc w:val="left"/>
+            </w:pPr>
+            <w:r>
+              <w:t xml:space="preserve">400 – 1 000 palabras</w:t>
+            </w:r>
+          </w:p>
+        </w:tc>
+        <w:tc>
+          <w:tcPr>
+            <w:tcW w:type="dxa" w:w="2463"/>
+            <w:tcMar>
+              <w:top w:type="dxa" w:w="90"/>
+              <w:left w:type="dxa" w:w="130"/>
+              <w:bottom w:type="dxa" w:w="90"/>
+              <w:right w:type="dxa" w:w="130"/>
+            </w:tcMar>
+          </w:tcPr>
+          <w:p>
+            <w:pPr>
+              <w:spacing w:after="0" w:before="0" w:line="264" w:lineRule="auto"/>
+              <w:jc w:val="left"/>
+            </w:pPr>
+            <w:r>
+              <w:t xml:space="preserve">2 – 5 min</w:t>
+            </w:r>
+          </w:p>
+        </w:tc>
+      </w:tr>
+      <w:tr>
+        <w:tc>
+          <w:tcPr>
+            <w:tcW w:type="dxa" w:w="3343"/>
+            <w:shd w:fill="F6F0EF" w:val="clear"/>
+            <w:tcMar>
+              <w:top w:type="dxa" w:w="90"/>
+              <w:left w:type="dxa" w:w="130"/>
+              <w:bottom w:type="dxa" w:w="90"/>
+              <w:right w:type="dxa" w:w="130"/>
+            </w:tcMar>
+          </w:tcPr>
+          <w:p>
+            <w:pPr>
+              <w:spacing w:after="0" w:before="0" w:line="264" w:lineRule="auto"/>
+              <w:jc w:val="left"/>
+            </w:pPr>
+            <w:r>
+              <w:t xml:space="preserve">En profundidad</w:t>
+            </w:r>
+          </w:p>
+        </w:tc>
+        <w:tc>
+          <w:tcPr>
+            <w:tcW w:type="dxa" w:w="3367"/>
+            <w:shd w:fill="F6F0EF" w:val="clear"/>
+            <w:tcMar>
+              <w:top w:type="dxa" w:w="90"/>
+              <w:left w:type="dxa" w:w="130"/>
+              <w:bottom w:type="dxa" w:w="90"/>
+              <w:right w:type="dxa" w:w="130"/>
+            </w:tcMar>
+          </w:tcPr>
+          <w:p>
+            <w:pPr>
+              <w:spacing w:after="0" w:before="0" w:line="264" w:lineRule="auto"/>
+              <w:jc w:val="left"/>
+            </w:pPr>
+            <w:r>
+              <w:t xml:space="preserve">1 000 – 2 000 palabras</w:t>
+            </w:r>
+          </w:p>
+        </w:tc>
+        <w:tc>
+          <w:tcPr>
+            <w:tcW w:type="dxa" w:w="2463"/>
+            <w:shd w:fill="F6F0EF" w:val="clear"/>
+            <w:tcMar>
+              <w:top w:type="dxa" w:w="90"/>
+              <w:left w:type="dxa" w:w="130"/>
+              <w:bottom w:type="dxa" w:w="90"/>
+              <w:right w:type="dxa" w:w="130"/>
+            </w:tcMar>
+          </w:tcPr>
+          <w:p>
+            <w:pPr>
+              <w:spacing w:after="0" w:before="0" w:line="264" w:lineRule="auto"/>
+              <w:jc w:val="left"/>
+            </w:pPr>
+            <w:r>
+              <w:t xml:space="preserve">5 – 10 min</w:t>
+            </w:r>
+          </w:p>
+        </w:tc>
+      </w:tr>
+    </w:tbl>
+    <w:p>
+      <w:pPr>
+        <w:spacing w:after="120"/>
+      </w:pPr>
+    </w:p>
+    <w:p>
+      <w:r>
+        <w:rPr>
+          <w:i/>
+          <w:iCs/>
+        </w:rPr>
+        <w:t xml:space="preserve">(Los tipos de pieza y estas extensiones proceden del Sistema editorial del proyecto, documento interno aún pendiente de ratificación comunitaria. Se recogen aquí para que este brief pueda leerse sin él.)</w:t>
+      </w:r>
     </w:p>
     <w:p>
       <w:r>
@@ -5915,7 +6287,7 @@
       <w:r>
         <w:t xml:space="preserve"> </w:t>
       </w:r>
-      <w:hyperlink w:history="1" r:id="rIdepl5bt8eow7uqrpdjx3q6">
+      <w:hyperlink w:history="1" r:id="rIdmfi_wxca_me02nrkcikia">
         <w:r>
           <w:rPr>
             <w:color w:val="8C2B3D"/>
@@ -5927,7 +6299,7 @@
       <w:r>
         <w:t xml:space="preserve"> · </w:t>
       </w:r>
-      <w:hyperlink w:history="1" r:id="rIdj0qot2n_l2ipgiszjbtly">
+      <w:hyperlink w:history="1" r:id="rIdpy_6oxq-rlukb3wfcnh-q">
         <w:r>
           <w:rPr>
             <w:color w:val="8C2B3D"/>
@@ -5939,7 +6311,7 @@
       <w:r>
         <w:t xml:space="preserve"> · </w:t>
       </w:r>
-      <w:hyperlink w:history="1" r:id="rIdlwmzsbxq4bunen5umeyi1">
+      <w:hyperlink w:history="1" r:id="rIdzgdfylj597gwbcbaqto7i">
         <w:r>
           <w:rPr>
             <w:color w:val="8C2B3D"/>
@@ -5951,7 +6323,7 @@
       <w:r>
         <w:t xml:space="preserve"> · </w:t>
       </w:r>
-      <w:hyperlink w:history="1" r:id="rIdn2hgqfkj2lyc8v0kxqepk">
+      <w:hyperlink w:history="1" r:id="rIdeo65c0uato5dfb-vcvien">
         <w:r>
           <w:rPr>
             <w:color w:val="8C2B3D"/>
@@ -5971,363 +6343,27 @@
     </w:p>
     <w:p>
       <w:r>
-        <w:t xml:space="preserve">La voz de la comunidad y el formato de una entrada </w:t>
-      </w:r>
-      <w:r>
-        <w:rPr>
-          <w:b/>
-          <w:bCs/>
-        </w:rPr>
-        <w:t xml:space="preserve">ya están definidos</w:t>
-      </w:r>
-      <w:r>
-        <w:t xml:space="preserve">, y este brief no los repite: hacerlo crearía dos fuentes para la misma regla, y a la primera actualización dejarían de coincidir.</w:t>
-      </w:r>
-    </w:p>
-    <w:tbl>
-      <w:tblPr>
-        <w:tblW w:type="dxa" w:w="9173"/>
-        <w:tblBorders>
-          <w:top w:val="single" w:color="D1AEAB" w:sz="4"/>
-          <w:left w:val="single" w:color="D1AEAB" w:sz="4"/>
-          <w:bottom w:val="single" w:color="D1AEAB" w:sz="4"/>
-          <w:right w:val="single" w:color="D1AEAB" w:sz="4"/>
-          <w:insideH w:val="single" w:color="D1AEAB" w:sz="4"/>
-          <w:insideV w:val="single" w:color="D1AEAB" w:sz="4"/>
-        </w:tblBorders>
-      </w:tblPr>
-      <w:tblGrid>
-        <w:gridCol w:w="2387"/>
-        <w:gridCol w:w="3016"/>
-        <w:gridCol w:w="3770"/>
-      </w:tblGrid>
-      <w:tr>
-        <w:trPr>
-          <w:tblHeader/>
-        </w:trPr>
-        <w:tc>
-          <w:tcPr>
-            <w:tcW w:type="dxa" w:w="2387"/>
-            <w:shd w:fill="8C2B3D" w:val="clear"/>
-            <w:tcMar>
-              <w:top w:type="dxa" w:w="90"/>
-              <w:left w:type="dxa" w:w="130"/>
-              <w:bottom w:type="dxa" w:w="90"/>
-              <w:right w:type="dxa" w:w="130"/>
-            </w:tcMar>
-          </w:tcPr>
-          <w:p>
-            <w:pPr>
-              <w:spacing w:after="0" w:before="0" w:line="264" w:lineRule="auto"/>
-              <w:jc w:val="left"/>
-            </w:pPr>
-            <w:r>
-              <w:rPr>
-                <w:b/>
-                <w:bCs/>
-                <w:color w:val="FFFFFF"/>
-                <w:sz w:val="21"/>
-                <w:szCs w:val="21"/>
-              </w:rPr>
-              <w:t xml:space="preserve">Para saber…</w:t>
-            </w:r>
-          </w:p>
-        </w:tc>
-        <w:tc>
-          <w:tcPr>
-            <w:tcW w:type="dxa" w:w="3016"/>
-            <w:shd w:fill="8C2B3D" w:val="clear"/>
-            <w:tcMar>
-              <w:top w:type="dxa" w:w="90"/>
-              <w:left w:type="dxa" w:w="130"/>
-              <w:bottom w:type="dxa" w:w="90"/>
-              <w:right w:type="dxa" w:w="130"/>
-            </w:tcMar>
-          </w:tcPr>
-          <w:p>
-            <w:pPr>
-              <w:spacing w:after="0" w:before="0" w:line="264" w:lineRule="auto"/>
-              <w:jc w:val="left"/>
-            </w:pPr>
-            <w:r>
-              <w:rPr>
-                <w:b/>
-                <w:bCs/>
-                <w:color w:val="FFFFFF"/>
-                <w:sz w:val="21"/>
-                <w:szCs w:val="21"/>
-              </w:rPr>
-              <w:t xml:space="preserve">Documento</w:t>
-            </w:r>
-          </w:p>
-        </w:tc>
-        <w:tc>
-          <w:tcPr>
-            <w:tcW w:type="dxa" w:w="3770"/>
-            <w:shd w:fill="8C2B3D" w:val="clear"/>
-            <w:tcMar>
-              <w:top w:type="dxa" w:w="90"/>
-              <w:left w:type="dxa" w:w="130"/>
-              <w:bottom w:type="dxa" w:w="90"/>
-              <w:right w:type="dxa" w:w="130"/>
-            </w:tcMar>
-          </w:tcPr>
-          <w:p>
-            <w:pPr>
-              <w:spacing w:after="0" w:before="0" w:line="264" w:lineRule="auto"/>
-              <w:jc w:val="left"/>
-            </w:pPr>
-            <w:r>
-              <w:rPr>
-                <w:b/>
-                <w:bCs/>
-                <w:color w:val="FFFFFF"/>
-                <w:sz w:val="21"/>
-                <w:szCs w:val="21"/>
-              </w:rPr>
-              <w:t xml:space="preserve">Cubre</w:t>
-            </w:r>
-          </w:p>
-        </w:tc>
-      </w:tr>
-      <w:tr>
-        <w:tc>
-          <w:tcPr>
-            <w:tcW w:type="dxa" w:w="2387"/>
-            <w:shd w:fill="F6F0EF" w:val="clear"/>
-            <w:tcMar>
-              <w:top w:type="dxa" w:w="90"/>
-              <w:left w:type="dxa" w:w="130"/>
-              <w:bottom w:type="dxa" w:w="90"/>
-              <w:right w:type="dxa" w:w="130"/>
-            </w:tcMar>
-          </w:tcPr>
-          <w:p>
-            <w:pPr>
-              <w:spacing w:after="0" w:before="0" w:line="264" w:lineRule="auto"/>
-              <w:jc w:val="left"/>
-            </w:pPr>
-            <w:r>
-              <w:t xml:space="preserve">Cómo debe </w:t>
-            </w:r>
-            <w:r>
-              <w:rPr>
-                <w:b/>
-                <w:bCs/>
-              </w:rPr>
-              <w:t xml:space="preserve">sonar</w:t>
-            </w:r>
-            <w:r>
-              <w:t xml:space="preserve"> el texto</w:t>
-            </w:r>
-          </w:p>
-        </w:tc>
-        <w:tc>
-          <w:tcPr>
-            <w:tcW w:type="dxa" w:w="3016"/>
-            <w:shd w:fill="F6F0EF" w:val="clear"/>
-            <w:tcMar>
-              <w:top w:type="dxa" w:w="90"/>
-              <w:left w:type="dxa" w:w="130"/>
-              <w:bottom w:type="dxa" w:w="90"/>
-              <w:right w:type="dxa" w:w="130"/>
-            </w:tcMar>
-          </w:tcPr>
-          <w:p>
-            <w:pPr>
-              <w:spacing w:after="0" w:before="0" w:line="264" w:lineRule="auto"/>
-              <w:jc w:val="left"/>
-            </w:pPr>
-            <w:r>
-              <w:rPr>
-                <w:b/>
-                <w:bCs/>
-              </w:rPr>
-              <w:t xml:space="preserve">Manual de voz y copywriting editorial</w:t>
-            </w:r>
-            <w:r>
-              <w:t xml:space="preserve"> (</w:t>
-            </w:r>
-            <w:r>
-              <w:rPr>
-                <w:rFonts w:ascii="Consolas" w:cs="Consolas" w:eastAsia="Consolas" w:hAnsi="Consolas"/>
-                <w:color w:val="8C2B3D"/>
-                <w:sz w:val="19"/>
-                <w:szCs w:val="19"/>
-                <w:shd w:fill="F6F0EF" w:val="clear"/>
-              </w:rPr>
-              <w:t xml:space="preserve">21</w:t>
-            </w:r>
-            <w:r>
-              <w:t xml:space="preserve">)</w:t>
-            </w:r>
-          </w:p>
-        </w:tc>
-        <w:tc>
-          <w:tcPr>
-            <w:tcW w:type="dxa" w:w="3770"/>
-            <w:shd w:fill="F6F0EF" w:val="clear"/>
-            <w:tcMar>
-              <w:top w:type="dxa" w:w="90"/>
-              <w:left w:type="dxa" w:w="130"/>
-              <w:bottom w:type="dxa" w:w="90"/>
-              <w:right w:type="dxa" w:w="130"/>
-            </w:tcMar>
-          </w:tcPr>
-          <w:p>
-            <w:pPr>
-              <w:spacing w:after="0" w:before="0" w:line="264" w:lineRule="auto"/>
-              <w:jc w:val="left"/>
-            </w:pPr>
-            <w:r>
-              <w:t xml:space="preserve">Atributos de la voz, principios de escritura, léxico permitido y prohibido, llamadas a la acción aprobadas, la grafía </w:t>
-            </w:r>
-            <w:r>
-              <w:rPr>
-                <w:i/>
-                <w:iCs/>
-              </w:rPr>
-              <w:t xml:space="preserve">Buddhismo</w:t>
-            </w:r>
-            <w:r>
-              <w:t xml:space="preserve"> / </w:t>
-            </w:r>
-            <w:r>
-              <w:rPr>
-                <w:i/>
-                <w:iCs/>
-              </w:rPr>
-              <w:t xml:space="preserve">budismo</w:t>
-            </w:r>
-            <w:r>
-              <w:t xml:space="preserve"> y el checklist de revisión editorial</w:t>
-            </w:r>
-          </w:p>
-        </w:tc>
-      </w:tr>
-      <w:tr>
-        <w:tc>
-          <w:tcPr>
-            <w:tcW w:type="dxa" w:w="2387"/>
-            <w:tcMar>
-              <w:top w:type="dxa" w:w="90"/>
-              <w:left w:type="dxa" w:w="130"/>
-              <w:bottom w:type="dxa" w:w="90"/>
-              <w:right w:type="dxa" w:w="130"/>
-            </w:tcMar>
-          </w:tcPr>
-          <w:p>
-            <w:pPr>
-              <w:spacing w:after="0" w:before="0" w:line="264" w:lineRule="auto"/>
-              <w:jc w:val="left"/>
-            </w:pPr>
-            <w:r>
-              <w:t xml:space="preserve">Cómo debe </w:t>
-            </w:r>
-            <w:r>
-              <w:rPr>
-                <w:b/>
-                <w:bCs/>
-              </w:rPr>
-              <w:t xml:space="preserve">estructurarse</w:t>
-            </w:r>
-            <w:r>
-              <w:t xml:space="preserve"> la entrada</w:t>
-            </w:r>
-          </w:p>
-        </w:tc>
-        <w:tc>
-          <w:tcPr>
-            <w:tcW w:type="dxa" w:w="3016"/>
-            <w:tcMar>
-              <w:top w:type="dxa" w:w="90"/>
-              <w:left w:type="dxa" w:w="130"/>
-              <w:bottom w:type="dxa" w:w="90"/>
-              <w:right w:type="dxa" w:w="130"/>
-            </w:tcMar>
-          </w:tcPr>
-          <w:p>
-            <w:pPr>
-              <w:spacing w:after="0" w:before="0" w:line="264" w:lineRule="auto"/>
-              <w:jc w:val="left"/>
-            </w:pPr>
-            <w:r>
-              <w:rPr>
-                <w:b/>
-                <w:bCs/>
-              </w:rPr>
-              <w:t xml:space="preserve">Sistema editorial</w:t>
-            </w:r>
-            <w:r>
-              <w:t xml:space="preserve"> (</w:t>
-            </w:r>
-            <w:r>
-              <w:rPr>
-                <w:rFonts w:ascii="Consolas" w:cs="Consolas" w:eastAsia="Consolas" w:hAnsi="Consolas"/>
-                <w:color w:val="8C2B3D"/>
-                <w:sz w:val="19"/>
-                <w:szCs w:val="19"/>
-                <w:shd w:fill="F6F0EF" w:val="clear"/>
-              </w:rPr>
-              <w:t xml:space="preserve">23</w:t>
-            </w:r>
-            <w:r>
-              <w:t xml:space="preserve">)</w:t>
-            </w:r>
-          </w:p>
-        </w:tc>
-        <w:tc>
-          <w:tcPr>
-            <w:tcW w:type="dxa" w:w="3770"/>
-            <w:tcMar>
-              <w:top w:type="dxa" w:w="90"/>
-              <w:left w:type="dxa" w:w="130"/>
-              <w:bottom w:type="dxa" w:w="90"/>
-              <w:right w:type="dxa" w:w="130"/>
-            </w:tcMar>
-          </w:tcPr>
-          <w:p>
-            <w:pPr>
-              <w:spacing w:after="0" w:before="0" w:line="264" w:lineRule="auto"/>
-              <w:jc w:val="left"/>
-            </w:pPr>
-            <w:r>
-              <w:t xml:space="preserve">Tipos de intención, extensión orientativa según el tipo, estructura con subtítulos, extracto del listado y presentación en listado y en detalle</w:t>
-            </w:r>
-          </w:p>
-        </w:tc>
-      </w:tr>
-    </w:tbl>
-    <w:p>
-      <w:pPr>
-        <w:spacing w:after="120"/>
-      </w:pPr>
-    </w:p>
-    <w:p>
-      <w:r>
-        <w:t xml:space="preserve">Lo único que este brief añade sobre la forma del texto es lo que responde a una razón </w:t>
-      </w:r>
-      <w:r>
-        <w:rPr>
-          <w:b/>
-          <w:bCs/>
-        </w:rPr>
-        <w:t xml:space="preserve">de búsqueda</w:t>
-      </w:r>
-      <w:r>
-        <w:t xml:space="preserve">, y ya está en el §3: título claro, respuesta directa en el primer párrafo y enlaces internos hacia el artículo. No contradice a los documentos anteriores; es la misma recomendación por otro motivo.</w:t>
-      </w:r>
-    </w:p>
-    <w:p>
-      <w:r>
-        <w:rPr>
-          <w:b/>
-          <w:bCs/>
-        </w:rPr>
-        <w:t xml:space="preserve">El punto donde voz y búsqueda se rozan</w:t>
-      </w:r>
-      <w:r>
-        <w:t xml:space="preserve">, por si surge la duda: la comunidad escribe </w:t>
+        <w:t xml:space="preserve">La voz de la comunidad </w:t>
+      </w:r>
+      <w:r>
+        <w:rPr>
+          <w:b/>
+          <w:bCs/>
+        </w:rPr>
+        <w:t xml:space="preserve">ya está definida</w:t>
+      </w:r>
+      <w:r>
+        <w:t xml:space="preserve"> en el </w:t>
+      </w:r>
+      <w:r>
+        <w:rPr>
+          <w:b/>
+          <w:bCs/>
+        </w:rPr>
+        <w:t xml:space="preserve">Manual de voz y copywriting editorial</w:t>
+      </w:r>
+      <w:r>
+        <w:t xml:space="preserve">, y este brief no la repite: hacerlo crearía dos fuentes para la misma regla, y a la primera actualización dejarían de coincidir. Allí están los atributos de la voz, los principios de escritura, el léxico permitido y prohibido, las llamadas a la acción aprobadas, la grafía </w:t>
       </w:r>
       <w:r>
         <w:rPr>
@@ -6337,7 +6373,7 @@
         <w:t xml:space="preserve">Buddhismo</w:t>
       </w:r>
       <w:r>
-        <w:t xml:space="preserve"> con doble d, y quien busca en Google suele escribir </w:t>
+        <w:t xml:space="preserve"> / </w:t>
       </w:r>
       <w:r>
         <w:rPr>
@@ -6347,20 +6383,59 @@
         <w:t xml:space="preserve">budismo</w:t>
       </w:r>
       <w:r>
-        <w:t xml:space="preserve">. El manual (</w:t>
-      </w:r>
-      <w:r>
-        <w:rPr>
-          <w:rFonts w:ascii="Consolas" w:cs="Consolas" w:eastAsia="Consolas" w:hAnsi="Consolas"/>
-          <w:color w:val="8C2B3D"/>
-          <w:sz w:val="19"/>
-          <w:szCs w:val="19"/>
-          <w:shd w:fill="F6F0EF" w:val="clear"/>
-        </w:rPr>
-        <w:t xml:space="preserve">21</w:t>
-      </w:r>
-      <w:r>
-        <w:t xml:space="preserve"> §14) ya resuelve el caso —la voz conserva la doble d, los metadatos pensados para el buscador pueden usar la forma extendida, y nunca se esconden palabras—. No hay que elegir entre sonar como la comunidad y ser encontrable.</w:t>
+        <w:t xml:space="preserve"> y el checklist de revisión editorial.</w:t>
+      </w:r>
+    </w:p>
+    <w:p>
+      <w:r>
+        <w:t xml:space="preserve">Del formato, este brief recoge lo imprescindible en el §5 —tipos de pieza y extensión orientativa—, de modo que no haga falta ningún otro documento para usarlo.</w:t>
+      </w:r>
+    </w:p>
+    <w:p>
+      <w:r>
+        <w:t xml:space="preserve">Lo único que este brief añade sobre la forma del texto es lo que responde a una razón </w:t>
+      </w:r>
+      <w:r>
+        <w:rPr>
+          <w:b/>
+          <w:bCs/>
+        </w:rPr>
+        <w:t xml:space="preserve">de búsqueda</w:t>
+      </w:r>
+      <w:r>
+        <w:t xml:space="preserve">, y ya está en el §3: título claro, respuesta directa en el primer párrafo y enlaces internos hacia el artículo. No contradice a los documentos anteriores; es la misma recomendación por otro motivo.</w:t>
+      </w:r>
+    </w:p>
+    <w:p>
+      <w:r>
+        <w:rPr>
+          <w:b/>
+          <w:bCs/>
+        </w:rPr>
+        <w:t xml:space="preserve">El punto donde voz y búsqueda se rozan</w:t>
+      </w:r>
+      <w:r>
+        <w:t xml:space="preserve">, por si surge la duda: la comunidad escribe </w:t>
+      </w:r>
+      <w:r>
+        <w:rPr>
+          <w:i/>
+          <w:iCs/>
+        </w:rPr>
+        <w:t xml:space="preserve">Buddhismo</w:t>
+      </w:r>
+      <w:r>
+        <w:t xml:space="preserve"> con doble d, y quien busca en Google suele escribir </w:t>
+      </w:r>
+      <w:r>
+        <w:rPr>
+          <w:i/>
+          <w:iCs/>
+        </w:rPr>
+        <w:t xml:space="preserve">budismo</w:t>
+      </w:r>
+      <w:r>
+        <w:t xml:space="preserve">. El manual de voz ya resuelve el caso (§14) —la voz conserva la doble d, los metadatos pensados para el buscador pueden usar la forma extendida, y nunca se esconden palabras—. No hay que elegir entre sonar como la comunidad y ser encontrable.</w:t>
       </w:r>
     </w:p>
     <w:p>

</xml_diff>

<commit_message>
Update SEO audit documentation and editorial brief for clarity and consistency
- Revised the `02-auditoria-seo-tecnica.md` to enhance clarity on technical findings and their implications for content strategy, including updates to the cause and consequences of deployment issues.
- Made minor adjustments to the `24-brief-editorial-blog-y-visibilidad.docx` and other SEO reports to ensure alignment with the latest editorial guidelines and improve overall coherence in documentation.
</commit_message>
<xml_diff>
--- a/docs/24-brief-editorial-blog-y-visibilidad.docx
+++ b/docs/24-brief-editorial-blog-y-visibilidad.docx
@@ -295,7 +295,7 @@
             <w:r>
               <w:t xml:space="preserve">Rafael Figueredo Oropeza — </w:t>
             </w:r>
-            <w:hyperlink w:history="1" r:id="rIdy3th9v_vdvvglw2ukhodv">
+            <w:hyperlink w:history="1" r:id="rIdbqt2ozhy82psx45z1upbd">
               <w:r>
                 <w:rPr>
                   <w:color w:val="8C2B3D"/>
@@ -307,7 +307,7 @@
             <w:r>
               <w:t xml:space="preserve"> · </w:t>
             </w:r>
-            <w:hyperlink w:history="1" r:id="rIdmxeftvwzvyqh9jvtszi_e">
+            <w:hyperlink w:history="1" r:id="rIddtntjbqote9qdzzfd7hqn">
               <w:r>
                 <w:rPr>
                   <w:color w:val="8C2B3D"/>
@@ -441,7 +441,7 @@
       <w:r>
         <w:t xml:space="preserve">El sitio </w:t>
       </w:r>
-      <w:hyperlink w:history="1" r:id="rIdndl_p7u5fa6gc4ycn7vfm">
+      <w:hyperlink w:history="1" r:id="rIdfuts7fbkvdkfthbq8oe7v">
         <w:r>
           <w:rPr>
             <w:color w:val="8C2B3D"/>
@@ -6287,7 +6287,7 @@
       <w:r>
         <w:t xml:space="preserve"> </w:t>
       </w:r>
-      <w:hyperlink w:history="1" r:id="rIdmfi_wxca_me02nrkcikia">
+      <w:hyperlink w:history="1" r:id="rIdk5bd1eckbyy6chefvplip">
         <w:r>
           <w:rPr>
             <w:color w:val="8C2B3D"/>
@@ -6299,7 +6299,7 @@
       <w:r>
         <w:t xml:space="preserve"> · </w:t>
       </w:r>
-      <w:hyperlink w:history="1" r:id="rIdpy_6oxq-rlukb3wfcnh-q">
+      <w:hyperlink w:history="1" r:id="rIdm_ly_88ddmlivdcw_nou6">
         <w:r>
           <w:rPr>
             <w:color w:val="8C2B3D"/>
@@ -6311,7 +6311,7 @@
       <w:r>
         <w:t xml:space="preserve"> · </w:t>
       </w:r>
-      <w:hyperlink w:history="1" r:id="rIdzgdfylj597gwbcbaqto7i">
+      <w:hyperlink w:history="1" r:id="rIdgtmob6enm16-qg0-a6eq8">
         <w:r>
           <w:rPr>
             <w:color w:val="8C2B3D"/>
@@ -6323,7 +6323,7 @@
       <w:r>
         <w:t xml:space="preserve"> · </w:t>
       </w:r>
-      <w:hyperlink w:history="1" r:id="rIdeo65c0uato5dfb-vcvien">
+      <w:hyperlink w:history="1" r:id="rId9_xusisymysacowpf4gj1">
         <w:r>
           <w:rPr>
             <w:color w:val="8C2B3D"/>

</xml_diff>

<commit_message>
Update package-lock.json and editorial documentation for improved clarity and functionality
- Added `docx` as a new development dependency in `package-lock.json` to support document generation.
- Updated the `24-brief-editorial-blog-y-visibilidad.md` to refine the editorial suggestions and clarify the role of the audit in guiding content strategy, ensuring better alignment with the overall documentation.
- Introduced a new `README.md` in the `scripts/build-docx` directory to provide instructions for generating `.docx` files from Markdown sources, enhancing usability for document management.
</commit_message>
<xml_diff>
--- a/docs/24-brief-editorial-blog-y-visibilidad.docx
+++ b/docs/24-brief-editorial-blog-y-visibilidad.docx
@@ -295,7 +295,7 @@
             <w:r>
               <w:t xml:space="preserve">Rafael Figueredo Oropeza — </w:t>
             </w:r>
-            <w:hyperlink w:history="1" r:id="rIdbqt2ozhy82psx45z1upbd">
+            <w:hyperlink w:history="1" r:id="rId1yznug48fpbf74p81sdei">
               <w:r>
                 <w:rPr>
                   <w:color w:val="8C2B3D"/>
@@ -307,7 +307,7 @@
             <w:r>
               <w:t xml:space="preserve"> · </w:t>
             </w:r>
-            <w:hyperlink w:history="1" r:id="rIddtntjbqote9qdzzfd7hqn">
+            <w:hyperlink w:history="1" r:id="rIdd6usq3bdagzwamooifhjz">
               <w:r>
                 <w:rPr>
                   <w:color w:val="8C2B3D"/>
@@ -441,7 +441,7 @@
       <w:r>
         <w:t xml:space="preserve">El sitio </w:t>
       </w:r>
-      <w:hyperlink w:history="1" r:id="rIdfuts7fbkvdkfthbq8oe7v">
+      <w:hyperlink w:history="1" r:id="rIdsnh_ykycbvtzpz-lktuin">
         <w:r>
           <w:rPr>
             <w:color w:val="8C2B3D"/>
@@ -593,14 +593,7 @@
     </w:p>
     <w:p>
       <w:r>
-        <w:rPr>
-          <w:b/>
-          <w:bCs/>
-        </w:rPr>
-        <w:t xml:space="preserve">Sugerencia del audit (referencia, no orden):</w:t>
-      </w:r>
-      <w:r>
-        <w:t xml:space="preserve"> artículos del blog orientados a esas </w:t>
+        <w:t xml:space="preserve">La dirección sugerida: artículos del blog orientados a esas </w:t>
       </w:r>
       <w:r>
         <w:rPr>
@@ -610,14 +603,7 @@
         <w:t xml:space="preserve">brechas</w:t>
       </w:r>
       <w:r>
-        <w:t xml:space="preserve">, no a repetir lo que Inicio y Linaje ya posicionan bien. </w:t>
-      </w:r>
-      <w:r>
-        <w:rPr>
-          <w:b/>
-          <w:bCs/>
-        </w:rPr>
-        <w:t xml:space="preserve">Publicar o no, qué temas y cuándo, lo define la persona encargada de la edición.</w:t>
+        <w:t xml:space="preserve">, no a repetir lo que Inicio y Linaje ya posicionan bien.</w:t>
       </w:r>
     </w:p>
     <w:p>
@@ -3041,17 +3027,7 @@
     </w:p>
     <w:p>
       <w:r>
-        <w:t xml:space="preserve">Eso mide si las sugerencias del audit fueron útiles; </w:t>
-      </w:r>
-      <w:r>
-        <w:rPr>
-          <w:b/>
-          <w:bCs/>
-        </w:rPr>
-        <w:t xml:space="preserve">no califica</w:t>
-      </w:r>
-      <w:r>
-        <w:t xml:space="preserve"> el trabajo editorial.</w:t>
+        <w:t xml:space="preserve">Eso mide si las sugerencias del audit fueron útiles.</w:t>
       </w:r>
     </w:p>
     <w:p>
@@ -3772,7 +3748,7 @@
         <w:pStyle w:val="Heading1"/>
       </w:pPr>
       <w:r>
-        <w:t xml:space="preserve">6. Sugerencia de temas (solo referencia del audit SEO)</w:t>
+        <w:t xml:space="preserve">6. Sugerencia de temas</w:t>
       </w:r>
     </w:p>
     <w:p>
@@ -3787,7 +3763,7 @@
         <w:t xml:space="preserve">dónde el sitio es débil</w:t>
       </w:r>
       <w:r>
-        <w:t xml:space="preserve">. La persona encargada puede ignorarlas, cambiarlas o proponer otras.</w:t>
+        <w:t xml:space="preserve">.</w:t>
       </w:r>
     </w:p>
     <w:p>
@@ -6287,7 +6263,7 @@
       <w:r>
         <w:t xml:space="preserve"> </w:t>
       </w:r>
-      <w:hyperlink w:history="1" r:id="rIdk5bd1eckbyy6chefvplip">
+      <w:hyperlink w:history="1" r:id="rId42s-ksw9p_jce-ex1nc3j">
         <w:r>
           <w:rPr>
             <w:color w:val="8C2B3D"/>
@@ -6299,7 +6275,7 @@
       <w:r>
         <w:t xml:space="preserve"> · </w:t>
       </w:r>
-      <w:hyperlink w:history="1" r:id="rIdm_ly_88ddmlivdcw_nou6">
+      <w:hyperlink w:history="1" r:id="rIdeji2fvohuap2d5d-4inbx">
         <w:r>
           <w:rPr>
             <w:color w:val="8C2B3D"/>
@@ -6311,7 +6287,7 @@
       <w:r>
         <w:t xml:space="preserve"> · </w:t>
       </w:r>
-      <w:hyperlink w:history="1" r:id="rIdgtmob6enm16-qg0-a6eq8">
+      <w:hyperlink w:history="1" r:id="rId62sgmf5ew-if3l7cheq_w">
         <w:r>
           <w:rPr>
             <w:color w:val="8C2B3D"/>
@@ -6323,7 +6299,7 @@
       <w:r>
         <w:t xml:space="preserve"> · </w:t>
       </w:r>
-      <w:hyperlink w:history="1" r:id="rId9_xusisymysacowpf4gj1">
+      <w:hyperlink w:history="1" r:id="rId9ihywglqyk_qy1nymrf0x">
         <w:r>
           <w:rPr>
             <w:color w:val="8C2B3D"/>
@@ -6566,17 +6542,7 @@
               <w:jc w:val="left"/>
             </w:pPr>
             <w:r>
-              <w:t xml:space="preserve">Diagnóstico, sugerencias de temas, explicación del porqué. </w:t>
-            </w:r>
-            <w:r>
-              <w:rPr>
-                <w:b/>
-                <w:bCs/>
-              </w:rPr>
-              <w:t xml:space="preserve">No</w:t>
-            </w:r>
-            <w:r>
-              <w:t xml:space="preserve"> decide qué se publica.</w:t>
+              <w:t xml:space="preserve">Diagnóstico, sugerencias de temas y explicación del porqué</w:t>
             </w:r>
           </w:p>
         </w:tc>
@@ -6784,17 +6750,7 @@
     </w:p>
     <w:p>
       <w:r>
-        <w:t xml:space="preserve">El audit </w:t>
-      </w:r>
-      <w:r>
-        <w:rPr>
-          <w:b/>
-          <w:bCs/>
-        </w:rPr>
-        <w:t xml:space="preserve">solo entrega insumos</w:t>
-      </w:r>
-      <w:r>
-        <w:t xml:space="preserve">. La persona encargada resuelve, si lo considera pertinente:</w:t>
+        <w:t xml:space="preserve">Quedan a criterio de la persona encargada:</w:t>
       </w:r>
     </w:p>
     <w:p>
@@ -6880,11 +6836,6 @@
       </w:r>
     </w:p>
     <w:p>
-      <w:r>
-        <w:t xml:space="preserve">No hay nada que “aprobar” con quien hizo el audit SEO.</w:t>
-      </w:r>
-    </w:p>
-    <w:p>
       <w:pPr>
         <w:pStyle w:val="Heading1"/>
       </w:pPr>
@@ -7142,18 +7093,6 @@
       </w:r>
       <w:r>
         <w:t xml:space="preserve"> aparecen.</w:t>
-      </w:r>
-    </w:p>
-    <w:p>
-      <w:r>
-        <w:rPr>
-          <w:b/>
-          <w:bCs/>
-        </w:rPr>
-        <w:t xml:space="preserve">¿Se puede ignorar todo este brief?</w:t>
-      </w:r>
-      <w:r>
-        <w:t xml:space="preserve"> Sí. Es insumo del audit SEO, no mandato editorial.</w:t>
       </w:r>
     </w:p>
     <w:p>

</xml_diff>

<commit_message>
Update SEO audit and editorial documentation for improved clarity and consistency
- Revised multiple `.docx` files, including `24-brief-editorial-blog-y-visibilidad.docx` and SEO audit reports, to enhance clarity and alignment with editorial guidelines.
- Updated typography settings in `brand.js` to ensure compatibility with Google Docs and improve document readability.
- Adjusted document margins and paragraph spacing in `build.js` to meet editorial standards for visual presentation.
</commit_message>
<xml_diff>
--- a/docs/24-brief-editorial-blog-y-visibilidad.docx
+++ b/docs/24-brief-editorial-blog-y-visibilidad.docx
@@ -76,14 +76,13 @@
       </w:pPr>
       <w:r>
         <w:rPr>
-          <w:rFonts w:ascii="Aptos" w:cs="Aptos" w:eastAsia="Aptos" w:hAnsi="Aptos"/>
-          <w:caps/>
+          <w:rFonts w:ascii="Inter" w:cs="Inter" w:eastAsia="Inter" w:hAnsi="Inter"/>
           <w:color w:val="B27474"/>
           <w:spacing w:val="60"/>
           <w:sz w:val="19"/>
           <w:szCs w:val="19"/>
         </w:rPr>
-        <w:t xml:space="preserve">Comunidad Buddhista</w:t>
+        <w:t xml:space="preserve">COMUNIDAD BUDDHISTA</w:t>
       </w:r>
     </w:p>
     <w:p>
@@ -110,7 +109,7 @@
       </w:pPr>
       <w:r>
         <w:rPr>
-          <w:rFonts w:ascii="Aptos" w:cs="Aptos" w:eastAsia="Aptos" w:hAnsi="Aptos"/>
+          <w:rFonts w:ascii="Inter" w:cs="Inter" w:eastAsia="Inter" w:hAnsi="Inter"/>
           <w:i/>
           <w:iCs/>
           <w:color w:val="3E424B"/>
@@ -150,7 +149,7 @@
       </w:pPr>
       <w:r>
         <w:rPr>
-          <w:rFonts w:ascii="Aptos" w:cs="Aptos" w:eastAsia="Aptos" w:hAnsi="Aptos"/>
+          <w:rFonts w:ascii="Inter" w:cs="Inter" w:eastAsia="Inter" w:hAnsi="Inter"/>
           <w:color w:val="B27474"/>
           <w:sz w:val="19"/>
           <w:szCs w:val="19"/>
@@ -184,7 +183,7 @@
     </w:p>
     <w:tbl>
       <w:tblPr>
-        <w:tblW w:type="dxa" w:w="9173"/>
+        <w:tblW w:type="dxa" w:w="8049"/>
         <w:tblBorders>
           <w:top w:val="single" w:color="D1AEAB" w:sz="4"/>
           <w:left w:val="single" w:color="D1AEAB" w:sz="4"/>
@@ -195,13 +194,13 @@
         </w:tblBorders>
       </w:tblPr>
       <w:tblGrid>
-        <w:gridCol w:w="2568"/>
-        <w:gridCol w:w="6605"/>
+        <w:gridCol w:w="2254"/>
+        <w:gridCol w:w="5795"/>
       </w:tblGrid>
       <w:tr>
         <w:tc>
           <w:tcPr>
-            <w:tcW w:type="dxa" w:w="2568"/>
+            <w:tcW w:type="dxa" w:w="2254"/>
             <w:shd w:fill="F6F0EF" w:val="clear"/>
             <w:tcMar>
               <w:top w:type="dxa" w:w="90"/>
@@ -229,7 +228,7 @@
         </w:tc>
         <w:tc>
           <w:tcPr>
-            <w:tcW w:type="dxa" w:w="6605"/>
+            <w:tcW w:type="dxa" w:w="5795"/>
             <w:tcMar>
               <w:top w:type="dxa" w:w="90"/>
               <w:left w:type="dxa" w:w="130"/>
@@ -251,7 +250,7 @@
       <w:tr>
         <w:tc>
           <w:tcPr>
-            <w:tcW w:type="dxa" w:w="2568"/>
+            <w:tcW w:type="dxa" w:w="2254"/>
             <w:shd w:fill="F6F0EF" w:val="clear"/>
             <w:tcMar>
               <w:top w:type="dxa" w:w="90"/>
@@ -279,7 +278,7 @@
         </w:tc>
         <w:tc>
           <w:tcPr>
-            <w:tcW w:type="dxa" w:w="6605"/>
+            <w:tcW w:type="dxa" w:w="5795"/>
             <w:tcMar>
               <w:top w:type="dxa" w:w="90"/>
               <w:left w:type="dxa" w:w="130"/>
@@ -295,7 +294,7 @@
             <w:r>
               <w:t xml:space="preserve">Rafael Figueredo Oropeza — </w:t>
             </w:r>
-            <w:hyperlink w:history="1" r:id="rId1yznug48fpbf74p81sdei">
+            <w:hyperlink w:history="1" r:id="rIduzqb-lur1yazg_cfpuqvk">
               <w:r>
                 <w:rPr>
                   <w:color w:val="8C2B3D"/>
@@ -307,7 +306,7 @@
             <w:r>
               <w:t xml:space="preserve"> · </w:t>
             </w:r>
-            <w:hyperlink w:history="1" r:id="rIdd6usq3bdagzwamooifhjz">
+            <w:hyperlink w:history="1" r:id="rIdmmkb-2rg3it5k2c8twgvl">
               <w:r>
                 <w:rPr>
                   <w:color w:val="8C2B3D"/>
@@ -325,7 +324,7 @@
       <w:tr>
         <w:tc>
           <w:tcPr>
-            <w:tcW w:type="dxa" w:w="2568"/>
+            <w:tcW w:type="dxa" w:w="2254"/>
             <w:shd w:fill="F6F0EF" w:val="clear"/>
             <w:tcMar>
               <w:top w:type="dxa" w:w="90"/>
@@ -353,7 +352,7 @@
         </w:tc>
         <w:tc>
           <w:tcPr>
-            <w:tcW w:type="dxa" w:w="6605"/>
+            <w:tcW w:type="dxa" w:w="5795"/>
             <w:tcMar>
               <w:top w:type="dxa" w:w="90"/>
               <w:left w:type="dxa" w:w="130"/>
@@ -402,7 +401,7 @@
         <w:pStyle w:val="SmallCapsMuted"/>
       </w:pPr>
       <w:r>
-        <w:t xml:space="preserve">Pulse con el botón derecho sobre el índice y elija «Actualizar campos» para generarlo.</w:t>
+        <w:t xml:space="preserve">Para generar el índice: en Word, clic derecho sobre él y «Actualizar campos». En Google Docs, Insertar › Índice.</w:t>
       </w:r>
     </w:p>
     <w:sdt>
@@ -441,7 +440,7 @@
       <w:r>
         <w:t xml:space="preserve">El sitio </w:t>
       </w:r>
-      <w:hyperlink w:history="1" r:id="rIdsnh_ykycbvtzpz-lktuin">
+      <w:hyperlink w:history="1" r:id="rIdottikahbefnfrxkmo7_x7">
         <w:r>
           <w:rPr>
             <w:color w:val="8C2B3D"/>
@@ -629,7 +628,7 @@
     </w:p>
     <w:tbl>
       <w:tblPr>
-        <w:tblW w:type="dxa" w:w="9173"/>
+        <w:tblW w:type="dxa" w:w="8049"/>
         <w:tblBorders>
           <w:top w:val="single" w:color="D1AEAB" w:sz="4"/>
           <w:left w:val="single" w:color="D1AEAB" w:sz="4"/>
@@ -640,8 +639,8 @@
         </w:tblBorders>
       </w:tblPr>
       <w:tblGrid>
-        <w:gridCol w:w="3318"/>
-        <w:gridCol w:w="5855"/>
+        <w:gridCol w:w="2911"/>
+        <w:gridCol w:w="5138"/>
       </w:tblGrid>
       <w:tr>
         <w:trPr>
@@ -649,7 +648,7 @@
         </w:trPr>
         <w:tc>
           <w:tcPr>
-            <w:tcW w:type="dxa" w:w="3318"/>
+            <w:tcW w:type="dxa" w:w="2911"/>
             <w:shd w:fill="8C2B3D" w:val="clear"/>
             <w:tcMar>
               <w:top w:type="dxa" w:w="90"/>
@@ -677,7 +676,7 @@
         </w:tc>
         <w:tc>
           <w:tcPr>
-            <w:tcW w:type="dxa" w:w="5855"/>
+            <w:tcW w:type="dxa" w:w="5138"/>
             <w:shd w:fill="8C2B3D" w:val="clear"/>
             <w:tcMar>
               <w:top w:type="dxa" w:w="90"/>
@@ -707,7 +706,7 @@
       <w:tr>
         <w:tc>
           <w:tcPr>
-            <w:tcW w:type="dxa" w:w="3318"/>
+            <w:tcW w:type="dxa" w:w="2911"/>
             <w:shd w:fill="F6F0EF" w:val="clear"/>
             <w:tcMar>
               <w:top w:type="dxa" w:w="90"/>
@@ -735,7 +734,7 @@
         </w:tc>
         <w:tc>
           <w:tcPr>
-            <w:tcW w:type="dxa" w:w="5855"/>
+            <w:tcW w:type="dxa" w:w="5138"/>
             <w:shd w:fill="F6F0EF" w:val="clear"/>
             <w:tcMar>
               <w:top w:type="dxa" w:w="90"/>
@@ -765,7 +764,7 @@
       <w:tr>
         <w:tc>
           <w:tcPr>
-            <w:tcW w:type="dxa" w:w="3318"/>
+            <w:tcW w:type="dxa" w:w="2911"/>
             <w:tcMar>
               <w:top w:type="dxa" w:w="90"/>
               <w:left w:type="dxa" w:w="130"/>
@@ -789,7 +788,7 @@
         </w:tc>
         <w:tc>
           <w:tcPr>
-            <w:tcW w:type="dxa" w:w="5855"/>
+            <w:tcW w:type="dxa" w:w="5138"/>
             <w:tcMar>
               <w:top w:type="dxa" w:w="90"/>
               <w:left w:type="dxa" w:w="130"/>
@@ -818,7 +817,7 @@
       <w:tr>
         <w:tc>
           <w:tcPr>
-            <w:tcW w:type="dxa" w:w="3318"/>
+            <w:tcW w:type="dxa" w:w="2911"/>
             <w:shd w:fill="F6F0EF" w:val="clear"/>
             <w:tcMar>
               <w:top w:type="dxa" w:w="90"/>
@@ -843,7 +842,7 @@
         </w:tc>
         <w:tc>
           <w:tcPr>
-            <w:tcW w:type="dxa" w:w="5855"/>
+            <w:tcW w:type="dxa" w:w="5138"/>
             <w:shd w:fill="F6F0EF" w:val="clear"/>
             <w:tcMar>
               <w:top w:type="dxa" w:w="90"/>
@@ -873,7 +872,7 @@
       <w:tr>
         <w:tc>
           <w:tcPr>
-            <w:tcW w:type="dxa" w:w="3318"/>
+            <w:tcW w:type="dxa" w:w="2911"/>
             <w:tcMar>
               <w:top w:type="dxa" w:w="90"/>
               <w:left w:type="dxa" w:w="130"/>
@@ -893,7 +892,7 @@
         </w:tc>
         <w:tc>
           <w:tcPr>
-            <w:tcW w:type="dxa" w:w="5855"/>
+            <w:tcW w:type="dxa" w:w="5138"/>
             <w:tcMar>
               <w:top w:type="dxa" w:w="90"/>
               <w:left w:type="dxa" w:w="130"/>
@@ -970,7 +969,7 @@
     </w:p>
     <w:tbl>
       <w:tblPr>
-        <w:tblW w:type="dxa" w:w="9173"/>
+        <w:tblW w:type="dxa" w:w="8049"/>
         <w:tblBorders>
           <w:top w:val="single" w:color="D1AEAB" w:sz="4"/>
           <w:left w:val="single" w:color="D1AEAB" w:sz="4"/>
@@ -981,8 +980,8 @@
         </w:tblBorders>
       </w:tblPr>
       <w:tblGrid>
-        <w:gridCol w:w="4586"/>
-        <w:gridCol w:w="4587"/>
+        <w:gridCol w:w="4024"/>
+        <w:gridCol w:w="4025"/>
       </w:tblGrid>
       <w:tr>
         <w:trPr>
@@ -990,7 +989,7 @@
         </w:trPr>
         <w:tc>
           <w:tcPr>
-            <w:tcW w:type="dxa" w:w="4586"/>
+            <w:tcW w:type="dxa" w:w="4024"/>
             <w:shd w:fill="8C2B3D" w:val="clear"/>
             <w:tcMar>
               <w:top w:type="dxa" w:w="90"/>
@@ -1018,7 +1017,7 @@
         </w:tc>
         <w:tc>
           <w:tcPr>
-            <w:tcW w:type="dxa" w:w="4587"/>
+            <w:tcW w:type="dxa" w:w="4025"/>
             <w:shd w:fill="8C2B3D" w:val="clear"/>
             <w:tcMar>
               <w:top w:type="dxa" w:w="90"/>
@@ -1048,7 +1047,7 @@
       <w:tr>
         <w:tc>
           <w:tcPr>
-            <w:tcW w:type="dxa" w:w="4586"/>
+            <w:tcW w:type="dxa" w:w="4024"/>
             <w:shd w:fill="F6F0EF" w:val="clear"/>
             <w:tcMar>
               <w:top w:type="dxa" w:w="90"/>
@@ -1076,7 +1075,7 @@
         </w:tc>
         <w:tc>
           <w:tcPr>
-            <w:tcW w:type="dxa" w:w="4587"/>
+            <w:tcW w:type="dxa" w:w="4025"/>
             <w:shd w:fill="F6F0EF" w:val="clear"/>
             <w:tcMar>
               <w:top w:type="dxa" w:w="90"/>
@@ -1106,7 +1105,7 @@
       <w:tr>
         <w:tc>
           <w:tcPr>
-            <w:tcW w:type="dxa" w:w="4586"/>
+            <w:tcW w:type="dxa" w:w="4024"/>
             <w:tcMar>
               <w:top w:type="dxa" w:w="90"/>
               <w:left w:type="dxa" w:w="130"/>
@@ -1140,7 +1139,7 @@
         </w:tc>
         <w:tc>
           <w:tcPr>
-            <w:tcW w:type="dxa" w:w="4587"/>
+            <w:tcW w:type="dxa" w:w="4025"/>
             <w:tcMar>
               <w:top w:type="dxa" w:w="90"/>
               <w:left w:type="dxa" w:w="130"/>
@@ -1169,7 +1168,7 @@
       <w:tr>
         <w:tc>
           <w:tcPr>
-            <w:tcW w:type="dxa" w:w="4586"/>
+            <w:tcW w:type="dxa" w:w="4024"/>
             <w:shd w:fill="F6F0EF" w:val="clear"/>
             <w:tcMar>
               <w:top w:type="dxa" w:w="90"/>
@@ -1207,7 +1206,7 @@
         </w:tc>
         <w:tc>
           <w:tcPr>
-            <w:tcW w:type="dxa" w:w="4587"/>
+            <w:tcW w:type="dxa" w:w="4025"/>
             <w:shd w:fill="F6F0EF" w:val="clear"/>
             <w:tcMar>
               <w:top w:type="dxa" w:w="90"/>
@@ -1237,7 +1236,7 @@
       <w:tr>
         <w:tc>
           <w:tcPr>
-            <w:tcW w:type="dxa" w:w="4586"/>
+            <w:tcW w:type="dxa" w:w="4024"/>
             <w:tcMar>
               <w:top w:type="dxa" w:w="90"/>
               <w:left w:type="dxa" w:w="130"/>
@@ -1264,7 +1263,7 @@
         </w:tc>
         <w:tc>
           <w:tcPr>
-            <w:tcW w:type="dxa" w:w="4587"/>
+            <w:tcW w:type="dxa" w:w="4025"/>
             <w:tcMar>
               <w:top w:type="dxa" w:w="90"/>
               <w:left w:type="dxa" w:w="130"/>
@@ -1293,7 +1292,7 @@
       <w:tr>
         <w:tc>
           <w:tcPr>
-            <w:tcW w:type="dxa" w:w="4586"/>
+            <w:tcW w:type="dxa" w:w="4024"/>
             <w:shd w:fill="F6F0EF" w:val="clear"/>
             <w:tcMar>
               <w:top w:type="dxa" w:w="90"/>
@@ -1314,7 +1313,7 @@
         </w:tc>
         <w:tc>
           <w:tcPr>
-            <w:tcW w:type="dxa" w:w="4587"/>
+            <w:tcW w:type="dxa" w:w="4025"/>
             <w:shd w:fill="F6F0EF" w:val="clear"/>
             <w:tcMar>
               <w:top w:type="dxa" w:w="90"/>
@@ -1565,7 +1564,7 @@
     </w:p>
     <w:tbl>
       <w:tblPr>
-        <w:tblW w:type="dxa" w:w="9173"/>
+        <w:tblW w:type="dxa" w:w="8049"/>
         <w:tblBorders>
           <w:top w:val="single" w:color="D1AEAB" w:sz="4"/>
           <w:left w:val="single" w:color="D1AEAB" w:sz="4"/>
@@ -1576,9 +1575,9 @@
         </w:tblBorders>
       </w:tblPr>
       <w:tblGrid>
-        <w:gridCol w:w="3582"/>
-        <w:gridCol w:w="2184"/>
-        <w:gridCol w:w="3407"/>
+        <w:gridCol w:w="3143"/>
+        <w:gridCol w:w="1916"/>
+        <w:gridCol w:w="2990"/>
       </w:tblGrid>
       <w:tr>
         <w:trPr>
@@ -1586,7 +1585,7 @@
         </w:trPr>
         <w:tc>
           <w:tcPr>
-            <w:tcW w:type="dxa" w:w="3582"/>
+            <w:tcW w:type="dxa" w:w="3143"/>
             <w:shd w:fill="8C2B3D" w:val="clear"/>
             <w:tcMar>
               <w:top w:type="dxa" w:w="90"/>
@@ -1614,7 +1613,7 @@
         </w:tc>
         <w:tc>
           <w:tcPr>
-            <w:tcW w:type="dxa" w:w="2184"/>
+            <w:tcW w:type="dxa" w:w="1916"/>
             <w:shd w:fill="8C2B3D" w:val="clear"/>
             <w:tcMar>
               <w:top w:type="dxa" w:w="90"/>
@@ -1642,7 +1641,7 @@
         </w:tc>
         <w:tc>
           <w:tcPr>
-            <w:tcW w:type="dxa" w:w="3407"/>
+            <w:tcW w:type="dxa" w:w="2990"/>
             <w:shd w:fill="8C2B3D" w:val="clear"/>
             <w:tcMar>
               <w:top w:type="dxa" w:w="90"/>
@@ -1672,7 +1671,7 @@
       <w:tr>
         <w:tc>
           <w:tcPr>
-            <w:tcW w:type="dxa" w:w="3582"/>
+            <w:tcW w:type="dxa" w:w="3143"/>
             <w:shd w:fill="F6F0EF" w:val="clear"/>
             <w:tcMar>
               <w:top w:type="dxa" w:w="90"/>
@@ -1693,7 +1692,7 @@
         </w:tc>
         <w:tc>
           <w:tcPr>
-            <w:tcW w:type="dxa" w:w="2184"/>
+            <w:tcW w:type="dxa" w:w="1916"/>
             <w:shd w:fill="F6F0EF" w:val="clear"/>
             <w:tcMar>
               <w:top w:type="dxa" w:w="90"/>
@@ -1714,7 +1713,7 @@
         </w:tc>
         <w:tc>
           <w:tcPr>
-            <w:tcW w:type="dxa" w:w="3407"/>
+            <w:tcW w:type="dxa" w:w="2990"/>
             <w:shd w:fill="F6F0EF" w:val="clear"/>
             <w:tcMar>
               <w:top w:type="dxa" w:w="90"/>
@@ -1737,7 +1736,7 @@
       <w:tr>
         <w:tc>
           <w:tcPr>
-            <w:tcW w:type="dxa" w:w="3582"/>
+            <w:tcW w:type="dxa" w:w="3143"/>
             <w:tcMar>
               <w:top w:type="dxa" w:w="90"/>
               <w:left w:type="dxa" w:w="130"/>
@@ -1757,7 +1756,7 @@
         </w:tc>
         <w:tc>
           <w:tcPr>
-            <w:tcW w:type="dxa" w:w="2184"/>
+            <w:tcW w:type="dxa" w:w="1916"/>
             <w:tcMar>
               <w:top w:type="dxa" w:w="90"/>
               <w:left w:type="dxa" w:w="130"/>
@@ -1781,7 +1780,7 @@
         </w:tc>
         <w:tc>
           <w:tcPr>
-            <w:tcW w:type="dxa" w:w="3407"/>
+            <w:tcW w:type="dxa" w:w="2990"/>
             <w:tcMar>
               <w:top w:type="dxa" w:w="90"/>
               <w:left w:type="dxa" w:w="130"/>
@@ -1922,7 +1921,7 @@
     </w:p>
     <w:tbl>
       <w:tblPr>
-        <w:tblW w:type="dxa" w:w="9173"/>
+        <w:tblW w:type="dxa" w:w="8049"/>
         <w:tblBorders>
           <w:top w:val="single" w:color="D1AEAB" w:sz="4"/>
           <w:left w:val="single" w:color="D1AEAB" w:sz="4"/>
@@ -1933,9 +1932,9 @@
         </w:tblBorders>
       </w:tblPr>
       <w:tblGrid>
-        <w:gridCol w:w="1196"/>
-        <w:gridCol w:w="3989"/>
-        <w:gridCol w:w="3988"/>
+        <w:gridCol w:w="1050"/>
+        <w:gridCol w:w="3499"/>
+        <w:gridCol w:w="3500"/>
       </w:tblGrid>
       <w:tr>
         <w:trPr>
@@ -1943,7 +1942,7 @@
         </w:trPr>
         <w:tc>
           <w:tcPr>
-            <w:tcW w:type="dxa" w:w="1196"/>
+            <w:tcW w:type="dxa" w:w="1050"/>
             <w:shd w:fill="8C2B3D" w:val="clear"/>
             <w:tcMar>
               <w:top w:type="dxa" w:w="90"/>
@@ -1971,7 +1970,7 @@
         </w:tc>
         <w:tc>
           <w:tcPr>
-            <w:tcW w:type="dxa" w:w="3989"/>
+            <w:tcW w:type="dxa" w:w="3499"/>
             <w:shd w:fill="8C2B3D" w:val="clear"/>
             <w:tcMar>
               <w:top w:type="dxa" w:w="90"/>
@@ -1999,7 +1998,7 @@
         </w:tc>
         <w:tc>
           <w:tcPr>
-            <w:tcW w:type="dxa" w:w="3988"/>
+            <w:tcW w:type="dxa" w:w="3500"/>
             <w:shd w:fill="8C2B3D" w:val="clear"/>
             <w:tcMar>
               <w:top w:type="dxa" w:w="90"/>
@@ -2029,7 +2028,7 @@
       <w:tr>
         <w:tc>
           <w:tcPr>
-            <w:tcW w:type="dxa" w:w="1196"/>
+            <w:tcW w:type="dxa" w:w="1050"/>
             <w:shd w:fill="F6F0EF" w:val="clear"/>
             <w:tcMar>
               <w:top w:type="dxa" w:w="90"/>
@@ -2054,7 +2053,7 @@
         </w:tc>
         <w:tc>
           <w:tcPr>
-            <w:tcW w:type="dxa" w:w="3989"/>
+            <w:tcW w:type="dxa" w:w="3499"/>
             <w:shd w:fill="F6F0EF" w:val="clear"/>
             <w:tcMar>
               <w:top w:type="dxa" w:w="90"/>
@@ -2085,7 +2084,7 @@
         </w:tc>
         <w:tc>
           <w:tcPr>
-            <w:tcW w:type="dxa" w:w="3988"/>
+            <w:tcW w:type="dxa" w:w="3500"/>
             <w:shd w:fill="F6F0EF" w:val="clear"/>
             <w:tcMar>
               <w:top w:type="dxa" w:w="90"/>
@@ -2118,7 +2117,7 @@
       <w:tr>
         <w:tc>
           <w:tcPr>
-            <w:tcW w:type="dxa" w:w="1196"/>
+            <w:tcW w:type="dxa" w:w="1050"/>
             <w:tcMar>
               <w:top w:type="dxa" w:w="90"/>
               <w:left w:type="dxa" w:w="130"/>
@@ -2142,7 +2141,7 @@
         </w:tc>
         <w:tc>
           <w:tcPr>
-            <w:tcW w:type="dxa" w:w="3989"/>
+            <w:tcW w:type="dxa" w:w="3499"/>
             <w:tcMar>
               <w:top w:type="dxa" w:w="90"/>
               <w:left w:type="dxa" w:w="130"/>
@@ -2172,7 +2171,7 @@
         </w:tc>
         <w:tc>
           <w:tcPr>
-            <w:tcW w:type="dxa" w:w="3988"/>
+            <w:tcW w:type="dxa" w:w="3500"/>
             <w:tcMar>
               <w:top w:type="dxa" w:w="90"/>
               <w:left w:type="dxa" w:w="130"/>
@@ -2204,7 +2203,7 @@
       <w:tr>
         <w:tc>
           <w:tcPr>
-            <w:tcW w:type="dxa" w:w="1196"/>
+            <w:tcW w:type="dxa" w:w="1050"/>
             <w:shd w:fill="F6F0EF" w:val="clear"/>
             <w:tcMar>
               <w:top w:type="dxa" w:w="90"/>
@@ -2229,7 +2228,7 @@
         </w:tc>
         <w:tc>
           <w:tcPr>
-            <w:tcW w:type="dxa" w:w="3989"/>
+            <w:tcW w:type="dxa" w:w="3499"/>
             <w:shd w:fill="F6F0EF" w:val="clear"/>
             <w:tcMar>
               <w:top w:type="dxa" w:w="90"/>
@@ -2250,7 +2249,7 @@
         </w:tc>
         <w:tc>
           <w:tcPr>
-            <w:tcW w:type="dxa" w:w="3988"/>
+            <w:tcW w:type="dxa" w:w="3500"/>
             <w:shd w:fill="F6F0EF" w:val="clear"/>
             <w:tcMar>
               <w:top w:type="dxa" w:w="90"/>
@@ -2303,7 +2302,7 @@
       <w:tr>
         <w:tc>
           <w:tcPr>
-            <w:tcW w:type="dxa" w:w="1196"/>
+            <w:tcW w:type="dxa" w:w="1050"/>
             <w:tcMar>
               <w:top w:type="dxa" w:w="90"/>
               <w:left w:type="dxa" w:w="130"/>
@@ -2327,7 +2326,7 @@
         </w:tc>
         <w:tc>
           <w:tcPr>
-            <w:tcW w:type="dxa" w:w="3989"/>
+            <w:tcW w:type="dxa" w:w="3499"/>
             <w:tcMar>
               <w:top w:type="dxa" w:w="90"/>
               <w:left w:type="dxa" w:w="130"/>
@@ -2347,7 +2346,7 @@
         </w:tc>
         <w:tc>
           <w:tcPr>
-            <w:tcW w:type="dxa" w:w="3988"/>
+            <w:tcW w:type="dxa" w:w="3500"/>
             <w:tcMar>
               <w:top w:type="dxa" w:w="90"/>
               <w:left w:type="dxa" w:w="130"/>
@@ -2369,7 +2368,7 @@
       <w:tr>
         <w:tc>
           <w:tcPr>
-            <w:tcW w:type="dxa" w:w="1196"/>
+            <w:tcW w:type="dxa" w:w="1050"/>
             <w:shd w:fill="F6F0EF" w:val="clear"/>
             <w:tcMar>
               <w:top w:type="dxa" w:w="90"/>
@@ -2394,7 +2393,7 @@
         </w:tc>
         <w:tc>
           <w:tcPr>
-            <w:tcW w:type="dxa" w:w="3989"/>
+            <w:tcW w:type="dxa" w:w="3499"/>
             <w:shd w:fill="F6F0EF" w:val="clear"/>
             <w:tcMar>
               <w:top w:type="dxa" w:w="90"/>
@@ -2415,7 +2414,7 @@
         </w:tc>
         <w:tc>
           <w:tcPr>
-            <w:tcW w:type="dxa" w:w="3988"/>
+            <w:tcW w:type="dxa" w:w="3500"/>
             <w:shd w:fill="F6F0EF" w:val="clear"/>
             <w:tcMar>
               <w:top w:type="dxa" w:w="90"/>
@@ -2557,7 +2556,7 @@
     </w:p>
     <w:tbl>
       <w:tblPr>
-        <w:tblW w:type="dxa" w:w="9173"/>
+        <w:tblW w:type="dxa" w:w="8049"/>
         <w:tblBorders>
           <w:top w:val="single" w:color="D1AEAB" w:sz="4"/>
           <w:left w:val="single" w:color="D1AEAB" w:sz="4"/>
@@ -2568,8 +2567,8 @@
         </w:tblBorders>
       </w:tblPr>
       <w:tblGrid>
-        <w:gridCol w:w="4029"/>
-        <w:gridCol w:w="5144"/>
+        <w:gridCol w:w="3536"/>
+        <w:gridCol w:w="4513"/>
       </w:tblGrid>
       <w:tr>
         <w:trPr>
@@ -2577,7 +2576,7 @@
         </w:trPr>
         <w:tc>
           <w:tcPr>
-            <w:tcW w:type="dxa" w:w="4029"/>
+            <w:tcW w:type="dxa" w:w="3536"/>
             <w:shd w:fill="8C2B3D" w:val="clear"/>
             <w:tcMar>
               <w:top w:type="dxa" w:w="90"/>
@@ -2605,7 +2604,7 @@
         </w:tc>
         <w:tc>
           <w:tcPr>
-            <w:tcW w:type="dxa" w:w="5144"/>
+            <w:tcW w:type="dxa" w:w="4513"/>
             <w:shd w:fill="8C2B3D" w:val="clear"/>
             <w:tcMar>
               <w:top w:type="dxa" w:w="90"/>
@@ -2635,7 +2634,7 @@
       <w:tr>
         <w:tc>
           <w:tcPr>
-            <w:tcW w:type="dxa" w:w="4029"/>
+            <w:tcW w:type="dxa" w:w="3536"/>
             <w:shd w:fill="F6F0EF" w:val="clear"/>
             <w:tcMar>
               <w:top w:type="dxa" w:w="90"/>
@@ -2663,7 +2662,7 @@
         </w:tc>
         <w:tc>
           <w:tcPr>
-            <w:tcW w:type="dxa" w:w="5144"/>
+            <w:tcW w:type="dxa" w:w="4513"/>
             <w:shd w:fill="F6F0EF" w:val="clear"/>
             <w:tcMar>
               <w:top w:type="dxa" w:w="90"/>
@@ -2706,7 +2705,7 @@
       <w:tr>
         <w:tc>
           <w:tcPr>
-            <w:tcW w:type="dxa" w:w="4029"/>
+            <w:tcW w:type="dxa" w:w="3536"/>
             <w:tcMar>
               <w:top w:type="dxa" w:w="90"/>
               <w:left w:type="dxa" w:w="130"/>
@@ -2733,7 +2732,7 @@
         </w:tc>
         <w:tc>
           <w:tcPr>
-            <w:tcW w:type="dxa" w:w="5144"/>
+            <w:tcW w:type="dxa" w:w="4513"/>
             <w:tcMar>
               <w:top w:type="dxa" w:w="90"/>
               <w:left w:type="dxa" w:w="130"/>
@@ -2765,7 +2764,7 @@
       <w:tr>
         <w:tc>
           <w:tcPr>
-            <w:tcW w:type="dxa" w:w="4029"/>
+            <w:tcW w:type="dxa" w:w="3536"/>
             <w:shd w:fill="F6F0EF" w:val="clear"/>
             <w:tcMar>
               <w:top w:type="dxa" w:w="90"/>
@@ -2793,7 +2792,7 @@
         </w:tc>
         <w:tc>
           <w:tcPr>
-            <w:tcW w:type="dxa" w:w="5144"/>
+            <w:tcW w:type="dxa" w:w="4513"/>
             <w:shd w:fill="F6F0EF" w:val="clear"/>
             <w:tcMar>
               <w:top w:type="dxa" w:w="90"/>
@@ -2816,7 +2815,7 @@
       <w:tr>
         <w:tc>
           <w:tcPr>
-            <w:tcW w:type="dxa" w:w="4029"/>
+            <w:tcW w:type="dxa" w:w="3536"/>
             <w:tcMar>
               <w:top w:type="dxa" w:w="90"/>
               <w:left w:type="dxa" w:w="130"/>
@@ -2846,7 +2845,7 @@
         </w:tc>
         <w:tc>
           <w:tcPr>
-            <w:tcW w:type="dxa" w:w="5144"/>
+            <w:tcW w:type="dxa" w:w="4513"/>
             <w:tcMar>
               <w:top w:type="dxa" w:w="90"/>
               <w:left w:type="dxa" w:w="130"/>
@@ -3079,7 +3078,7 @@
     </w:p>
     <w:tbl>
       <w:tblPr>
-        <w:tblW w:type="dxa" w:w="9173"/>
+        <w:tblW w:type="dxa" w:w="8049"/>
         <w:tblBorders>
           <w:top w:val="single" w:color="D1AEAB" w:sz="4"/>
           <w:left w:val="single" w:color="D1AEAB" w:sz="4"/>
@@ -3090,9 +3089,9 @@
         </w:tblBorders>
       </w:tblPr>
       <w:tblGrid>
-        <w:gridCol w:w="1452"/>
-        <w:gridCol w:w="3762"/>
-        <w:gridCol w:w="3959"/>
+        <w:gridCol w:w="1274"/>
+        <w:gridCol w:w="3301"/>
+        <w:gridCol w:w="3474"/>
       </w:tblGrid>
       <w:tr>
         <w:trPr>
@@ -3100,7 +3099,7 @@
         </w:trPr>
         <w:tc>
           <w:tcPr>
-            <w:tcW w:type="dxa" w:w="1452"/>
+            <w:tcW w:type="dxa" w:w="1274"/>
             <w:shd w:fill="8C2B3D" w:val="clear"/>
             <w:tcMar>
               <w:top w:type="dxa" w:w="90"/>
@@ -3128,7 +3127,7 @@
         </w:tc>
         <w:tc>
           <w:tcPr>
-            <w:tcW w:type="dxa" w:w="3762"/>
+            <w:tcW w:type="dxa" w:w="3301"/>
             <w:shd w:fill="8C2B3D" w:val="clear"/>
             <w:tcMar>
               <w:top w:type="dxa" w:w="90"/>
@@ -3156,7 +3155,7 @@
         </w:tc>
         <w:tc>
           <w:tcPr>
-            <w:tcW w:type="dxa" w:w="3959"/>
+            <w:tcW w:type="dxa" w:w="3474"/>
             <w:shd w:fill="8C2B3D" w:val="clear"/>
             <w:tcMar>
               <w:top w:type="dxa" w:w="90"/>
@@ -3186,7 +3185,7 @@
       <w:tr>
         <w:tc>
           <w:tcPr>
-            <w:tcW w:type="dxa" w:w="1452"/>
+            <w:tcW w:type="dxa" w:w="1274"/>
             <w:shd w:fill="F6F0EF" w:val="clear"/>
             <w:tcMar>
               <w:top w:type="dxa" w:w="90"/>
@@ -3211,7 +3210,7 @@
         </w:tc>
         <w:tc>
           <w:tcPr>
-            <w:tcW w:type="dxa" w:w="3762"/>
+            <w:tcW w:type="dxa" w:w="3301"/>
             <w:shd w:fill="F6F0EF" w:val="clear"/>
             <w:tcMar>
               <w:top w:type="dxa" w:w="90"/>
@@ -3232,7 +3231,7 @@
         </w:tc>
         <w:tc>
           <w:tcPr>
-            <w:tcW w:type="dxa" w:w="3959"/>
+            <w:tcW w:type="dxa" w:w="3474"/>
             <w:shd w:fill="F6F0EF" w:val="clear"/>
             <w:tcMar>
               <w:top w:type="dxa" w:w="90"/>
@@ -3255,7 +3254,7 @@
       <w:tr>
         <w:tc>
           <w:tcPr>
-            <w:tcW w:type="dxa" w:w="1452"/>
+            <w:tcW w:type="dxa" w:w="1274"/>
             <w:tcMar>
               <w:top w:type="dxa" w:w="90"/>
               <w:left w:type="dxa" w:w="130"/>
@@ -3279,7 +3278,7 @@
         </w:tc>
         <w:tc>
           <w:tcPr>
-            <w:tcW w:type="dxa" w:w="3762"/>
+            <w:tcW w:type="dxa" w:w="3301"/>
             <w:tcMar>
               <w:top w:type="dxa" w:w="90"/>
               <w:left w:type="dxa" w:w="130"/>
@@ -3299,7 +3298,7 @@
         </w:tc>
         <w:tc>
           <w:tcPr>
-            <w:tcW w:type="dxa" w:w="3959"/>
+            <w:tcW w:type="dxa" w:w="3474"/>
             <w:tcMar>
               <w:top w:type="dxa" w:w="90"/>
               <w:left w:type="dxa" w:w="130"/>
@@ -3321,7 +3320,7 @@
       <w:tr>
         <w:tc>
           <w:tcPr>
-            <w:tcW w:type="dxa" w:w="1452"/>
+            <w:tcW w:type="dxa" w:w="1274"/>
             <w:shd w:fill="F6F0EF" w:val="clear"/>
             <w:tcMar>
               <w:top w:type="dxa" w:w="90"/>
@@ -3346,7 +3345,7 @@
         </w:tc>
         <w:tc>
           <w:tcPr>
-            <w:tcW w:type="dxa" w:w="3762"/>
+            <w:tcW w:type="dxa" w:w="3301"/>
             <w:shd w:fill="F6F0EF" w:val="clear"/>
             <w:tcMar>
               <w:top w:type="dxa" w:w="90"/>
@@ -3367,7 +3366,7 @@
         </w:tc>
         <w:tc>
           <w:tcPr>
-            <w:tcW w:type="dxa" w:w="3959"/>
+            <w:tcW w:type="dxa" w:w="3474"/>
             <w:shd w:fill="F6F0EF" w:val="clear"/>
             <w:tcMar>
               <w:top w:type="dxa" w:w="90"/>
@@ -3407,7 +3406,7 @@
     </w:p>
     <w:tbl>
       <w:tblPr>
-        <w:tblW w:type="dxa" w:w="9173"/>
+        <w:tblW w:type="dxa" w:w="8049"/>
         <w:tblBorders>
           <w:top w:val="single" w:color="D1AEAB" w:sz="4"/>
           <w:left w:val="single" w:color="D1AEAB" w:sz="4"/>
@@ -3418,9 +3417,9 @@
         </w:tblBorders>
       </w:tblPr>
       <w:tblGrid>
-        <w:gridCol w:w="3343"/>
-        <w:gridCol w:w="3367"/>
-        <w:gridCol w:w="2463"/>
+        <w:gridCol w:w="2934"/>
+        <w:gridCol w:w="2953"/>
+        <w:gridCol w:w="2162"/>
       </w:tblGrid>
       <w:tr>
         <w:trPr>
@@ -3428,7 +3427,7 @@
         </w:trPr>
         <w:tc>
           <w:tcPr>
-            <w:tcW w:type="dxa" w:w="3343"/>
+            <w:tcW w:type="dxa" w:w="2934"/>
             <w:shd w:fill="8C2B3D" w:val="clear"/>
             <w:tcMar>
               <w:top w:type="dxa" w:w="90"/>
@@ -3456,7 +3455,7 @@
         </w:tc>
         <w:tc>
           <w:tcPr>
-            <w:tcW w:type="dxa" w:w="3367"/>
+            <w:tcW w:type="dxa" w:w="2953"/>
             <w:shd w:fill="8C2B3D" w:val="clear"/>
             <w:tcMar>
               <w:top w:type="dxa" w:w="90"/>
@@ -3484,7 +3483,7 @@
         </w:tc>
         <w:tc>
           <w:tcPr>
-            <w:tcW w:type="dxa" w:w="2463"/>
+            <w:tcW w:type="dxa" w:w="2162"/>
             <w:shd w:fill="8C2B3D" w:val="clear"/>
             <w:tcMar>
               <w:top w:type="dxa" w:w="90"/>
@@ -3514,7 +3513,7 @@
       <w:tr>
         <w:tc>
           <w:tcPr>
-            <w:tcW w:type="dxa" w:w="3343"/>
+            <w:tcW w:type="dxa" w:w="2934"/>
             <w:shd w:fill="F6F0EF" w:val="clear"/>
             <w:tcMar>
               <w:top w:type="dxa" w:w="90"/>
@@ -3535,7 +3534,7 @@
         </w:tc>
         <w:tc>
           <w:tcPr>
-            <w:tcW w:type="dxa" w:w="3367"/>
+            <w:tcW w:type="dxa" w:w="2953"/>
             <w:shd w:fill="F6F0EF" w:val="clear"/>
             <w:tcMar>
               <w:top w:type="dxa" w:w="90"/>
@@ -3556,7 +3555,7 @@
         </w:tc>
         <w:tc>
           <w:tcPr>
-            <w:tcW w:type="dxa" w:w="2463"/>
+            <w:tcW w:type="dxa" w:w="2162"/>
             <w:shd w:fill="F6F0EF" w:val="clear"/>
             <w:tcMar>
               <w:top w:type="dxa" w:w="90"/>
@@ -3579,7 +3578,7 @@
       <w:tr>
         <w:tc>
           <w:tcPr>
-            <w:tcW w:type="dxa" w:w="3343"/>
+            <w:tcW w:type="dxa" w:w="2934"/>
             <w:tcMar>
               <w:top w:type="dxa" w:w="90"/>
               <w:left w:type="dxa" w:w="130"/>
@@ -3599,7 +3598,7 @@
         </w:tc>
         <w:tc>
           <w:tcPr>
-            <w:tcW w:type="dxa" w:w="3367"/>
+            <w:tcW w:type="dxa" w:w="2953"/>
             <w:tcMar>
               <w:top w:type="dxa" w:w="90"/>
               <w:left w:type="dxa" w:w="130"/>
@@ -3619,7 +3618,7 @@
         </w:tc>
         <w:tc>
           <w:tcPr>
-            <w:tcW w:type="dxa" w:w="2463"/>
+            <w:tcW w:type="dxa" w:w="2162"/>
             <w:tcMar>
               <w:top w:type="dxa" w:w="90"/>
               <w:left w:type="dxa" w:w="130"/>
@@ -3641,7 +3640,7 @@
       <w:tr>
         <w:tc>
           <w:tcPr>
-            <w:tcW w:type="dxa" w:w="3343"/>
+            <w:tcW w:type="dxa" w:w="2934"/>
             <w:shd w:fill="F6F0EF" w:val="clear"/>
             <w:tcMar>
               <w:top w:type="dxa" w:w="90"/>
@@ -3662,7 +3661,7 @@
         </w:tc>
         <w:tc>
           <w:tcPr>
-            <w:tcW w:type="dxa" w:w="3367"/>
+            <w:tcW w:type="dxa" w:w="2953"/>
             <w:shd w:fill="F6F0EF" w:val="clear"/>
             <w:tcMar>
               <w:top w:type="dxa" w:w="90"/>
@@ -3683,7 +3682,7 @@
         </w:tc>
         <w:tc>
           <w:tcPr>
-            <w:tcW w:type="dxa" w:w="2463"/>
+            <w:tcW w:type="dxa" w:w="2162"/>
             <w:shd w:fill="F6F0EF" w:val="clear"/>
             <w:tcMar>
               <w:top w:type="dxa" w:w="90"/>
@@ -3811,7 +3810,7 @@
     </w:p>
     <w:tbl>
       <w:tblPr>
-        <w:tblW w:type="dxa" w:w="9173"/>
+        <w:tblW w:type="dxa" w:w="8049"/>
         <w:tblBorders>
           <w:top w:val="single" w:color="D1AEAB" w:sz="4"/>
           <w:left w:val="single" w:color="D1AEAB" w:sz="4"/>
@@ -3822,10 +3821,10 @@
         </w:tblBorders>
       </w:tblPr>
       <w:tblGrid>
-        <w:gridCol w:w="882"/>
-        <w:gridCol w:w="2965"/>
-        <w:gridCol w:w="2549"/>
-        <w:gridCol w:w="2777"/>
+        <w:gridCol w:w="773"/>
+        <w:gridCol w:w="2602"/>
+        <w:gridCol w:w="2236"/>
+        <w:gridCol w:w="2438"/>
       </w:tblGrid>
       <w:tr>
         <w:trPr>
@@ -3833,7 +3832,7 @@
         </w:trPr>
         <w:tc>
           <w:tcPr>
-            <w:tcW w:type="dxa" w:w="882"/>
+            <w:tcW w:type="dxa" w:w="773"/>
             <w:shd w:fill="8C2B3D" w:val="clear"/>
             <w:tcMar>
               <w:top w:type="dxa" w:w="90"/>
@@ -3861,7 +3860,7 @@
         </w:tc>
         <w:tc>
           <w:tcPr>
-            <w:tcW w:type="dxa" w:w="2965"/>
+            <w:tcW w:type="dxa" w:w="2602"/>
             <w:shd w:fill="8C2B3D" w:val="clear"/>
             <w:tcMar>
               <w:top w:type="dxa" w:w="90"/>
@@ -3889,7 +3888,7 @@
         </w:tc>
         <w:tc>
           <w:tcPr>
-            <w:tcW w:type="dxa" w:w="2549"/>
+            <w:tcW w:type="dxa" w:w="2236"/>
             <w:shd w:fill="8C2B3D" w:val="clear"/>
             <w:tcMar>
               <w:top w:type="dxa" w:w="90"/>
@@ -3917,7 +3916,7 @@
         </w:tc>
         <w:tc>
           <w:tcPr>
-            <w:tcW w:type="dxa" w:w="2777"/>
+            <w:tcW w:type="dxa" w:w="2438"/>
             <w:shd w:fill="8C2B3D" w:val="clear"/>
             <w:tcMar>
               <w:top w:type="dxa" w:w="90"/>
@@ -3947,7 +3946,7 @@
       <w:tr>
         <w:tc>
           <w:tcPr>
-            <w:tcW w:type="dxa" w:w="882"/>
+            <w:tcW w:type="dxa" w:w="773"/>
             <w:shd w:fill="F6F0EF" w:val="clear"/>
             <w:tcMar>
               <w:top w:type="dxa" w:w="90"/>
@@ -3972,7 +3971,7 @@
         </w:tc>
         <w:tc>
           <w:tcPr>
-            <w:tcW w:type="dxa" w:w="2965"/>
+            <w:tcW w:type="dxa" w:w="2602"/>
             <w:shd w:fill="F6F0EF" w:val="clear"/>
             <w:tcMar>
               <w:top w:type="dxa" w:w="90"/>
@@ -3993,7 +3992,7 @@
         </w:tc>
         <w:tc>
           <w:tcPr>
-            <w:tcW w:type="dxa" w:w="2549"/>
+            <w:tcW w:type="dxa" w:w="2236"/>
             <w:shd w:fill="F6F0EF" w:val="clear"/>
             <w:tcMar>
               <w:top w:type="dxa" w:w="90"/>
@@ -4014,7 +4013,7 @@
         </w:tc>
         <w:tc>
           <w:tcPr>
-            <w:tcW w:type="dxa" w:w="2777"/>
+            <w:tcW w:type="dxa" w:w="2438"/>
             <w:shd w:fill="F6F0EF" w:val="clear"/>
             <w:tcMar>
               <w:top w:type="dxa" w:w="90"/>
@@ -4054,7 +4053,7 @@
       <w:tr>
         <w:tc>
           <w:tcPr>
-            <w:tcW w:type="dxa" w:w="882"/>
+            <w:tcW w:type="dxa" w:w="773"/>
             <w:tcMar>
               <w:top w:type="dxa" w:w="90"/>
               <w:left w:type="dxa" w:w="130"/>
@@ -4078,7 +4077,7 @@
         </w:tc>
         <w:tc>
           <w:tcPr>
-            <w:tcW w:type="dxa" w:w="2965"/>
+            <w:tcW w:type="dxa" w:w="2602"/>
             <w:tcMar>
               <w:top w:type="dxa" w:w="90"/>
               <w:left w:type="dxa" w:w="130"/>
@@ -4098,7 +4097,7 @@
         </w:tc>
         <w:tc>
           <w:tcPr>
-            <w:tcW w:type="dxa" w:w="2549"/>
+            <w:tcW w:type="dxa" w:w="2236"/>
             <w:tcMar>
               <w:top w:type="dxa" w:w="90"/>
               <w:left w:type="dxa" w:w="130"/>
@@ -4125,7 +4124,7 @@
         </w:tc>
         <w:tc>
           <w:tcPr>
-            <w:tcW w:type="dxa" w:w="2777"/>
+            <w:tcW w:type="dxa" w:w="2438"/>
             <w:tcMar>
               <w:top w:type="dxa" w:w="90"/>
               <w:left w:type="dxa" w:w="130"/>
@@ -4225,7 +4224,7 @@
     </w:p>
     <w:tbl>
       <w:tblPr>
-        <w:tblW w:type="dxa" w:w="9173"/>
+        <w:tblW w:type="dxa" w:w="8049"/>
         <w:tblBorders>
           <w:top w:val="single" w:color="D1AEAB" w:sz="4"/>
           <w:left w:val="single" w:color="D1AEAB" w:sz="4"/>
@@ -4236,10 +4235,10 @@
         </w:tblBorders>
       </w:tblPr>
       <w:tblGrid>
-        <w:gridCol w:w="882"/>
-        <w:gridCol w:w="2922"/>
-        <w:gridCol w:w="2349"/>
-        <w:gridCol w:w="3020"/>
+        <w:gridCol w:w="773"/>
+        <w:gridCol w:w="2565"/>
+        <w:gridCol w:w="2061"/>
+        <w:gridCol w:w="2650"/>
       </w:tblGrid>
       <w:tr>
         <w:trPr>
@@ -4247,7 +4246,7 @@
         </w:trPr>
         <w:tc>
           <w:tcPr>
-            <w:tcW w:type="dxa" w:w="882"/>
+            <w:tcW w:type="dxa" w:w="773"/>
             <w:shd w:fill="8C2B3D" w:val="clear"/>
             <w:tcMar>
               <w:top w:type="dxa" w:w="90"/>
@@ -4275,7 +4274,7 @@
         </w:tc>
         <w:tc>
           <w:tcPr>
-            <w:tcW w:type="dxa" w:w="2922"/>
+            <w:tcW w:type="dxa" w:w="2565"/>
             <w:shd w:fill="8C2B3D" w:val="clear"/>
             <w:tcMar>
               <w:top w:type="dxa" w:w="90"/>
@@ -4303,7 +4302,7 @@
         </w:tc>
         <w:tc>
           <w:tcPr>
-            <w:tcW w:type="dxa" w:w="2349"/>
+            <w:tcW w:type="dxa" w:w="2061"/>
             <w:shd w:fill="8C2B3D" w:val="clear"/>
             <w:tcMar>
               <w:top w:type="dxa" w:w="90"/>
@@ -4331,7 +4330,7 @@
         </w:tc>
         <w:tc>
           <w:tcPr>
-            <w:tcW w:type="dxa" w:w="3020"/>
+            <w:tcW w:type="dxa" w:w="2650"/>
             <w:shd w:fill="8C2B3D" w:val="clear"/>
             <w:tcMar>
               <w:top w:type="dxa" w:w="90"/>
@@ -4361,7 +4360,7 @@
       <w:tr>
         <w:tc>
           <w:tcPr>
-            <w:tcW w:type="dxa" w:w="882"/>
+            <w:tcW w:type="dxa" w:w="773"/>
             <w:shd w:fill="F6F0EF" w:val="clear"/>
             <w:tcMar>
               <w:top w:type="dxa" w:w="90"/>
@@ -4382,7 +4381,7 @@
         </w:tc>
         <w:tc>
           <w:tcPr>
-            <w:tcW w:type="dxa" w:w="2922"/>
+            <w:tcW w:type="dxa" w:w="2565"/>
             <w:shd w:fill="F6F0EF" w:val="clear"/>
             <w:tcMar>
               <w:top w:type="dxa" w:w="90"/>
@@ -4403,7 +4402,7 @@
         </w:tc>
         <w:tc>
           <w:tcPr>
-            <w:tcW w:type="dxa" w:w="2349"/>
+            <w:tcW w:type="dxa" w:w="2061"/>
             <w:shd w:fill="F6F0EF" w:val="clear"/>
             <w:tcMar>
               <w:top w:type="dxa" w:w="90"/>
@@ -4424,7 +4423,7 @@
         </w:tc>
         <w:tc>
           <w:tcPr>
-            <w:tcW w:type="dxa" w:w="3020"/>
+            <w:tcW w:type="dxa" w:w="2650"/>
             <w:shd w:fill="F6F0EF" w:val="clear"/>
             <w:tcMar>
               <w:top w:type="dxa" w:w="90"/>
@@ -4447,7 +4446,7 @@
       <w:tr>
         <w:tc>
           <w:tcPr>
-            <w:tcW w:type="dxa" w:w="882"/>
+            <w:tcW w:type="dxa" w:w="773"/>
             <w:tcMar>
               <w:top w:type="dxa" w:w="90"/>
               <w:left w:type="dxa" w:w="130"/>
@@ -4467,7 +4466,7 @@
         </w:tc>
         <w:tc>
           <w:tcPr>
-            <w:tcW w:type="dxa" w:w="2922"/>
+            <w:tcW w:type="dxa" w:w="2565"/>
             <w:tcMar>
               <w:top w:type="dxa" w:w="90"/>
               <w:left w:type="dxa" w:w="130"/>
@@ -4487,7 +4486,7 @@
         </w:tc>
         <w:tc>
           <w:tcPr>
-            <w:tcW w:type="dxa" w:w="2349"/>
+            <w:tcW w:type="dxa" w:w="2061"/>
             <w:tcMar>
               <w:top w:type="dxa" w:w="90"/>
               <w:left w:type="dxa" w:w="130"/>
@@ -4507,7 +4506,7 @@
         </w:tc>
         <w:tc>
           <w:tcPr>
-            <w:tcW w:type="dxa" w:w="3020"/>
+            <w:tcW w:type="dxa" w:w="2650"/>
             <w:tcMar>
               <w:top w:type="dxa" w:w="90"/>
               <w:left w:type="dxa" w:w="130"/>
@@ -4545,7 +4544,7 @@
       </w:r>
       <w:r>
         <w:rPr>
-          <w:rFonts w:ascii="Consolas" w:cs="Consolas" w:eastAsia="Consolas" w:hAnsi="Consolas"/>
+          <w:rFonts w:ascii="Roboto Mono" w:cs="Roboto Mono" w:eastAsia="Roboto Mono" w:hAnsi="Roboto Mono"/>
           <w:color w:val="8C2B3D"/>
           <w:sz w:val="19"/>
           <w:szCs w:val="19"/>
@@ -4614,7 +4613,7 @@
     </w:p>
     <w:tbl>
       <w:tblPr>
-        <w:tblW w:type="dxa" w:w="9173"/>
+        <w:tblW w:type="dxa" w:w="8049"/>
         <w:tblBorders>
           <w:top w:val="single" w:color="D1AEAB" w:sz="4"/>
           <w:left w:val="single" w:color="D1AEAB" w:sz="4"/>
@@ -4625,10 +4624,10 @@
         </w:tblBorders>
       </w:tblPr>
       <w:tblGrid>
-        <w:gridCol w:w="882"/>
-        <w:gridCol w:w="2356"/>
-        <w:gridCol w:w="2927"/>
-        <w:gridCol w:w="3008"/>
+        <w:gridCol w:w="773"/>
+        <w:gridCol w:w="2067"/>
+        <w:gridCol w:w="2570"/>
+        <w:gridCol w:w="2639"/>
       </w:tblGrid>
       <w:tr>
         <w:trPr>
@@ -4636,7 +4635,7 @@
         </w:trPr>
         <w:tc>
           <w:tcPr>
-            <w:tcW w:type="dxa" w:w="882"/>
+            <w:tcW w:type="dxa" w:w="773"/>
             <w:shd w:fill="8C2B3D" w:val="clear"/>
             <w:tcMar>
               <w:top w:type="dxa" w:w="90"/>
@@ -4664,7 +4663,7 @@
         </w:tc>
         <w:tc>
           <w:tcPr>
-            <w:tcW w:type="dxa" w:w="2356"/>
+            <w:tcW w:type="dxa" w:w="2067"/>
             <w:shd w:fill="8C2B3D" w:val="clear"/>
             <w:tcMar>
               <w:top w:type="dxa" w:w="90"/>
@@ -4692,7 +4691,7 @@
         </w:tc>
         <w:tc>
           <w:tcPr>
-            <w:tcW w:type="dxa" w:w="2927"/>
+            <w:tcW w:type="dxa" w:w="2570"/>
             <w:shd w:fill="8C2B3D" w:val="clear"/>
             <w:tcMar>
               <w:top w:type="dxa" w:w="90"/>
@@ -4720,7 +4719,7 @@
         </w:tc>
         <w:tc>
           <w:tcPr>
-            <w:tcW w:type="dxa" w:w="3008"/>
+            <w:tcW w:type="dxa" w:w="2639"/>
             <w:shd w:fill="8C2B3D" w:val="clear"/>
             <w:tcMar>
               <w:top w:type="dxa" w:w="90"/>
@@ -4750,7 +4749,7 @@
       <w:tr>
         <w:tc>
           <w:tcPr>
-            <w:tcW w:type="dxa" w:w="882"/>
+            <w:tcW w:type="dxa" w:w="773"/>
             <w:shd w:fill="F6F0EF" w:val="clear"/>
             <w:tcMar>
               <w:top w:type="dxa" w:w="90"/>
@@ -4775,7 +4774,7 @@
         </w:tc>
         <w:tc>
           <w:tcPr>
-            <w:tcW w:type="dxa" w:w="2356"/>
+            <w:tcW w:type="dxa" w:w="2067"/>
             <w:shd w:fill="F6F0EF" w:val="clear"/>
             <w:tcMar>
               <w:top w:type="dxa" w:w="90"/>
@@ -4796,7 +4795,7 @@
         </w:tc>
         <w:tc>
           <w:tcPr>
-            <w:tcW w:type="dxa" w:w="2927"/>
+            <w:tcW w:type="dxa" w:w="2570"/>
             <w:shd w:fill="F6F0EF" w:val="clear"/>
             <w:tcMar>
               <w:top w:type="dxa" w:w="90"/>
@@ -4817,7 +4816,7 @@
         </w:tc>
         <w:tc>
           <w:tcPr>
-            <w:tcW w:type="dxa" w:w="3008"/>
+            <w:tcW w:type="dxa" w:w="2639"/>
             <w:shd w:fill="F6F0EF" w:val="clear"/>
             <w:tcMar>
               <w:top w:type="dxa" w:w="90"/>
@@ -4840,7 +4839,7 @@
       <w:tr>
         <w:tc>
           <w:tcPr>
-            <w:tcW w:type="dxa" w:w="882"/>
+            <w:tcW w:type="dxa" w:w="773"/>
             <w:tcMar>
               <w:top w:type="dxa" w:w="90"/>
               <w:left w:type="dxa" w:w="130"/>
@@ -4864,7 +4863,7 @@
         </w:tc>
         <w:tc>
           <w:tcPr>
-            <w:tcW w:type="dxa" w:w="2356"/>
+            <w:tcW w:type="dxa" w:w="2067"/>
             <w:tcMar>
               <w:top w:type="dxa" w:w="90"/>
               <w:left w:type="dxa" w:w="130"/>
@@ -4884,7 +4883,7 @@
         </w:tc>
         <w:tc>
           <w:tcPr>
-            <w:tcW w:type="dxa" w:w="2927"/>
+            <w:tcW w:type="dxa" w:w="2570"/>
             <w:tcMar>
               <w:top w:type="dxa" w:w="90"/>
               <w:left w:type="dxa" w:w="130"/>
@@ -4904,7 +4903,7 @@
         </w:tc>
         <w:tc>
           <w:tcPr>
-            <w:tcW w:type="dxa" w:w="3008"/>
+            <w:tcW w:type="dxa" w:w="2639"/>
             <w:tcMar>
               <w:top w:type="dxa" w:w="90"/>
               <w:left w:type="dxa" w:w="130"/>
@@ -4926,7 +4925,7 @@
       <w:tr>
         <w:tc>
           <w:tcPr>
-            <w:tcW w:type="dxa" w:w="882"/>
+            <w:tcW w:type="dxa" w:w="773"/>
             <w:shd w:fill="F6F0EF" w:val="clear"/>
             <w:tcMar>
               <w:top w:type="dxa" w:w="90"/>
@@ -4951,7 +4950,7 @@
         </w:tc>
         <w:tc>
           <w:tcPr>
-            <w:tcW w:type="dxa" w:w="2356"/>
+            <w:tcW w:type="dxa" w:w="2067"/>
             <w:shd w:fill="F6F0EF" w:val="clear"/>
             <w:tcMar>
               <w:top w:type="dxa" w:w="90"/>
@@ -4972,7 +4971,7 @@
         </w:tc>
         <w:tc>
           <w:tcPr>
-            <w:tcW w:type="dxa" w:w="2927"/>
+            <w:tcW w:type="dxa" w:w="2570"/>
             <w:shd w:fill="F6F0EF" w:val="clear"/>
             <w:tcMar>
               <w:top w:type="dxa" w:w="90"/>
@@ -4993,7 +4992,7 @@
         </w:tc>
         <w:tc>
           <w:tcPr>
-            <w:tcW w:type="dxa" w:w="3008"/>
+            <w:tcW w:type="dxa" w:w="2639"/>
             <w:shd w:fill="F6F0EF" w:val="clear"/>
             <w:tcMar>
               <w:top w:type="dxa" w:w="90"/>
@@ -5016,7 +5015,7 @@
       <w:tr>
         <w:tc>
           <w:tcPr>
-            <w:tcW w:type="dxa" w:w="882"/>
+            <w:tcW w:type="dxa" w:w="773"/>
             <w:tcMar>
               <w:top w:type="dxa" w:w="90"/>
               <w:left w:type="dxa" w:w="130"/>
@@ -5040,7 +5039,7 @@
         </w:tc>
         <w:tc>
           <w:tcPr>
-            <w:tcW w:type="dxa" w:w="2356"/>
+            <w:tcW w:type="dxa" w:w="2067"/>
             <w:tcMar>
               <w:top w:type="dxa" w:w="90"/>
               <w:left w:type="dxa" w:w="130"/>
@@ -5060,7 +5059,7 @@
         </w:tc>
         <w:tc>
           <w:tcPr>
-            <w:tcW w:type="dxa" w:w="2927"/>
+            <w:tcW w:type="dxa" w:w="2570"/>
             <w:tcMar>
               <w:top w:type="dxa" w:w="90"/>
               <w:left w:type="dxa" w:w="130"/>
@@ -5080,7 +5079,7 @@
         </w:tc>
         <w:tc>
           <w:tcPr>
-            <w:tcW w:type="dxa" w:w="3008"/>
+            <w:tcW w:type="dxa" w:w="2639"/>
             <w:tcMar>
               <w:top w:type="dxa" w:w="90"/>
               <w:left w:type="dxa" w:w="130"/>
@@ -5154,7 +5153,7 @@
     </w:p>
     <w:tbl>
       <w:tblPr>
-        <w:tblW w:type="dxa" w:w="9173"/>
+        <w:tblW w:type="dxa" w:w="8049"/>
         <w:tblBorders>
           <w:top w:val="single" w:color="D1AEAB" w:sz="4"/>
           <w:left w:val="single" w:color="D1AEAB" w:sz="4"/>
@@ -5165,10 +5164,10 @@
         </w:tblBorders>
       </w:tblPr>
       <w:tblGrid>
-        <w:gridCol w:w="1454"/>
-        <w:gridCol w:w="1704"/>
-        <w:gridCol w:w="3007"/>
-        <w:gridCol w:w="3008"/>
+        <w:gridCol w:w="1276"/>
+        <w:gridCol w:w="1495"/>
+        <w:gridCol w:w="2639"/>
+        <w:gridCol w:w="2639"/>
       </w:tblGrid>
       <w:tr>
         <w:trPr>
@@ -5176,7 +5175,7 @@
         </w:trPr>
         <w:tc>
           <w:tcPr>
-            <w:tcW w:type="dxa" w:w="1454"/>
+            <w:tcW w:type="dxa" w:w="1276"/>
             <w:shd w:fill="8C2B3D" w:val="clear"/>
             <w:tcMar>
               <w:top w:type="dxa" w:w="90"/>
@@ -5204,7 +5203,7 @@
         </w:tc>
         <w:tc>
           <w:tcPr>
-            <w:tcW w:type="dxa" w:w="1704"/>
+            <w:tcW w:type="dxa" w:w="1495"/>
             <w:shd w:fill="8C2B3D" w:val="clear"/>
             <w:tcMar>
               <w:top w:type="dxa" w:w="90"/>
@@ -5232,7 +5231,7 @@
         </w:tc>
         <w:tc>
           <w:tcPr>
-            <w:tcW w:type="dxa" w:w="3007"/>
+            <w:tcW w:type="dxa" w:w="2639"/>
             <w:shd w:fill="8C2B3D" w:val="clear"/>
             <w:tcMar>
               <w:top w:type="dxa" w:w="90"/>
@@ -5260,7 +5259,7 @@
         </w:tc>
         <w:tc>
           <w:tcPr>
-            <w:tcW w:type="dxa" w:w="3008"/>
+            <w:tcW w:type="dxa" w:w="2639"/>
             <w:shd w:fill="8C2B3D" w:val="clear"/>
             <w:tcMar>
               <w:top w:type="dxa" w:w="90"/>
@@ -5290,7 +5289,7 @@
       <w:tr>
         <w:tc>
           <w:tcPr>
-            <w:tcW w:type="dxa" w:w="1454"/>
+            <w:tcW w:type="dxa" w:w="1276"/>
             <w:shd w:fill="F6F0EF" w:val="clear"/>
             <w:tcMar>
               <w:top w:type="dxa" w:w="90"/>
@@ -5315,7 +5314,7 @@
         </w:tc>
         <w:tc>
           <w:tcPr>
-            <w:tcW w:type="dxa" w:w="1704"/>
+            <w:tcW w:type="dxa" w:w="1495"/>
             <w:shd w:fill="F6F0EF" w:val="clear"/>
             <w:tcMar>
               <w:top w:type="dxa" w:w="90"/>
@@ -5336,7 +5335,7 @@
         </w:tc>
         <w:tc>
           <w:tcPr>
-            <w:tcW w:type="dxa" w:w="3007"/>
+            <w:tcW w:type="dxa" w:w="2639"/>
             <w:shd w:fill="F6F0EF" w:val="clear"/>
             <w:tcMar>
               <w:top w:type="dxa" w:w="90"/>
@@ -5357,7 +5356,7 @@
         </w:tc>
         <w:tc>
           <w:tcPr>
-            <w:tcW w:type="dxa" w:w="3008"/>
+            <w:tcW w:type="dxa" w:w="2639"/>
             <w:shd w:fill="F6F0EF" w:val="clear"/>
             <w:tcMar>
               <w:top w:type="dxa" w:w="90"/>
@@ -5390,7 +5389,7 @@
       <w:tr>
         <w:tc>
           <w:tcPr>
-            <w:tcW w:type="dxa" w:w="1454"/>
+            <w:tcW w:type="dxa" w:w="1276"/>
             <w:tcMar>
               <w:top w:type="dxa" w:w="90"/>
               <w:left w:type="dxa" w:w="130"/>
@@ -5414,7 +5413,7 @@
         </w:tc>
         <w:tc>
           <w:tcPr>
-            <w:tcW w:type="dxa" w:w="1704"/>
+            <w:tcW w:type="dxa" w:w="1495"/>
             <w:tcMar>
               <w:top w:type="dxa" w:w="90"/>
               <w:left w:type="dxa" w:w="130"/>
@@ -5434,7 +5433,7 @@
         </w:tc>
         <w:tc>
           <w:tcPr>
-            <w:tcW w:type="dxa" w:w="3007"/>
+            <w:tcW w:type="dxa" w:w="2639"/>
             <w:tcMar>
               <w:top w:type="dxa" w:w="90"/>
               <w:left w:type="dxa" w:w="130"/>
@@ -5454,7 +5453,7 @@
         </w:tc>
         <w:tc>
           <w:tcPr>
-            <w:tcW w:type="dxa" w:w="3008"/>
+            <w:tcW w:type="dxa" w:w="2639"/>
             <w:tcMar>
               <w:top w:type="dxa" w:w="90"/>
               <w:left w:type="dxa" w:w="130"/>
@@ -5476,7 +5475,7 @@
       <w:tr>
         <w:tc>
           <w:tcPr>
-            <w:tcW w:type="dxa" w:w="1454"/>
+            <w:tcW w:type="dxa" w:w="1276"/>
             <w:shd w:fill="F6F0EF" w:val="clear"/>
             <w:tcMar>
               <w:top w:type="dxa" w:w="90"/>
@@ -5501,7 +5500,7 @@
         </w:tc>
         <w:tc>
           <w:tcPr>
-            <w:tcW w:type="dxa" w:w="1704"/>
+            <w:tcW w:type="dxa" w:w="1495"/>
             <w:shd w:fill="F6F0EF" w:val="clear"/>
             <w:tcMar>
               <w:top w:type="dxa" w:w="90"/>
@@ -5522,7 +5521,7 @@
         </w:tc>
         <w:tc>
           <w:tcPr>
-            <w:tcW w:type="dxa" w:w="3007"/>
+            <w:tcW w:type="dxa" w:w="2639"/>
             <w:shd w:fill="F6F0EF" w:val="clear"/>
             <w:tcMar>
               <w:top w:type="dxa" w:w="90"/>
@@ -5543,7 +5542,7 @@
         </w:tc>
         <w:tc>
           <w:tcPr>
-            <w:tcW w:type="dxa" w:w="3008"/>
+            <w:tcW w:type="dxa" w:w="2639"/>
             <w:shd w:fill="F6F0EF" w:val="clear"/>
             <w:tcMar>
               <w:top w:type="dxa" w:w="90"/>
@@ -5628,7 +5627,7 @@
     </w:p>
     <w:tbl>
       <w:tblPr>
-        <w:tblW w:type="dxa" w:w="9173"/>
+        <w:tblW w:type="dxa" w:w="8049"/>
         <w:tblBorders>
           <w:top w:val="single" w:color="D1AEAB" w:sz="4"/>
           <w:left w:val="single" w:color="D1AEAB" w:sz="4"/>
@@ -5639,9 +5638,9 @@
         </w:tblBorders>
       </w:tblPr>
       <w:tblGrid>
-        <w:gridCol w:w="3484"/>
-        <w:gridCol w:w="2206"/>
-        <w:gridCol w:w="3483"/>
+        <w:gridCol w:w="3056"/>
+        <w:gridCol w:w="1936"/>
+        <w:gridCol w:w="3057"/>
       </w:tblGrid>
       <w:tr>
         <w:trPr>
@@ -5649,7 +5648,7 @@
         </w:trPr>
         <w:tc>
           <w:tcPr>
-            <w:tcW w:type="dxa" w:w="3484"/>
+            <w:tcW w:type="dxa" w:w="3056"/>
             <w:shd w:fill="8C2B3D" w:val="clear"/>
             <w:tcMar>
               <w:top w:type="dxa" w:w="90"/>
@@ -5677,7 +5676,7 @@
         </w:tc>
         <w:tc>
           <w:tcPr>
-            <w:tcW w:type="dxa" w:w="2206"/>
+            <w:tcW w:type="dxa" w:w="1936"/>
             <w:shd w:fill="8C2B3D" w:val="clear"/>
             <w:tcMar>
               <w:top w:type="dxa" w:w="90"/>
@@ -5705,7 +5704,7 @@
         </w:tc>
         <w:tc>
           <w:tcPr>
-            <w:tcW w:type="dxa" w:w="3483"/>
+            <w:tcW w:type="dxa" w:w="3057"/>
             <w:shd w:fill="8C2B3D" w:val="clear"/>
             <w:tcMar>
               <w:top w:type="dxa" w:w="90"/>
@@ -5735,7 +5734,7 @@
       <w:tr>
         <w:tc>
           <w:tcPr>
-            <w:tcW w:type="dxa" w:w="3484"/>
+            <w:tcW w:type="dxa" w:w="3056"/>
             <w:shd w:fill="F6F0EF" w:val="clear"/>
             <w:tcMar>
               <w:top w:type="dxa" w:w="90"/>
@@ -5763,7 +5762,7 @@
         </w:tc>
         <w:tc>
           <w:tcPr>
-            <w:tcW w:type="dxa" w:w="2206"/>
+            <w:tcW w:type="dxa" w:w="1936"/>
             <w:shd w:fill="F6F0EF" w:val="clear"/>
             <w:tcMar>
               <w:top w:type="dxa" w:w="90"/>
@@ -5784,7 +5783,7 @@
         </w:tc>
         <w:tc>
           <w:tcPr>
-            <w:tcW w:type="dxa" w:w="3483"/>
+            <w:tcW w:type="dxa" w:w="3057"/>
             <w:shd w:fill="F6F0EF" w:val="clear"/>
             <w:tcMar>
               <w:top w:type="dxa" w:w="90"/>
@@ -5807,7 +5806,7 @@
       <w:tr>
         <w:tc>
           <w:tcPr>
-            <w:tcW w:type="dxa" w:w="3484"/>
+            <w:tcW w:type="dxa" w:w="3056"/>
             <w:tcMar>
               <w:top w:type="dxa" w:w="90"/>
               <w:left w:type="dxa" w:w="130"/>
@@ -5837,7 +5836,7 @@
         </w:tc>
         <w:tc>
           <w:tcPr>
-            <w:tcW w:type="dxa" w:w="2206"/>
+            <w:tcW w:type="dxa" w:w="1936"/>
             <w:tcMar>
               <w:top w:type="dxa" w:w="90"/>
               <w:left w:type="dxa" w:w="130"/>
@@ -5857,7 +5856,7 @@
         </w:tc>
         <w:tc>
           <w:tcPr>
-            <w:tcW w:type="dxa" w:w="3483"/>
+            <w:tcW w:type="dxa" w:w="3057"/>
             <w:tcMar>
               <w:top w:type="dxa" w:w="90"/>
               <w:left w:type="dxa" w:w="130"/>
@@ -5889,7 +5888,7 @@
       <w:tr>
         <w:tc>
           <w:tcPr>
-            <w:tcW w:type="dxa" w:w="3484"/>
+            <w:tcW w:type="dxa" w:w="3056"/>
             <w:shd w:fill="F6F0EF" w:val="clear"/>
             <w:tcMar>
               <w:top w:type="dxa" w:w="90"/>
@@ -5930,7 +5929,7 @@
         </w:tc>
         <w:tc>
           <w:tcPr>
-            <w:tcW w:type="dxa" w:w="2206"/>
+            <w:tcW w:type="dxa" w:w="1936"/>
             <w:shd w:fill="F6F0EF" w:val="clear"/>
             <w:tcMar>
               <w:top w:type="dxa" w:w="90"/>
@@ -5951,7 +5950,7 @@
         </w:tc>
         <w:tc>
           <w:tcPr>
-            <w:tcW w:type="dxa" w:w="3483"/>
+            <w:tcW w:type="dxa" w:w="3057"/>
             <w:shd w:fill="F6F0EF" w:val="clear"/>
             <w:tcMar>
               <w:top w:type="dxa" w:w="90"/>
@@ -5974,7 +5973,7 @@
       <w:tr>
         <w:tc>
           <w:tcPr>
-            <w:tcW w:type="dxa" w:w="3484"/>
+            <w:tcW w:type="dxa" w:w="3056"/>
             <w:tcMar>
               <w:top w:type="dxa" w:w="90"/>
               <w:left w:type="dxa" w:w="130"/>
@@ -6011,7 +6010,7 @@
         </w:tc>
         <w:tc>
           <w:tcPr>
-            <w:tcW w:type="dxa" w:w="2206"/>
+            <w:tcW w:type="dxa" w:w="1936"/>
             <w:tcMar>
               <w:top w:type="dxa" w:w="90"/>
               <w:left w:type="dxa" w:w="130"/>
@@ -6031,7 +6030,7 @@
         </w:tc>
         <w:tc>
           <w:tcPr>
-            <w:tcW w:type="dxa" w:w="3483"/>
+            <w:tcW w:type="dxa" w:w="3057"/>
             <w:tcMar>
               <w:top w:type="dxa" w:w="90"/>
               <w:left w:type="dxa" w:w="130"/>
@@ -6263,7 +6262,7 @@
       <w:r>
         <w:t xml:space="preserve"> </w:t>
       </w:r>
-      <w:hyperlink w:history="1" r:id="rId42s-ksw9p_jce-ex1nc3j">
+      <w:hyperlink w:history="1" r:id="rIdw15dltq4jkbgjufj6zzuk">
         <w:r>
           <w:rPr>
             <w:color w:val="8C2B3D"/>
@@ -6275,7 +6274,7 @@
       <w:r>
         <w:t xml:space="preserve"> · </w:t>
       </w:r>
-      <w:hyperlink w:history="1" r:id="rIdeji2fvohuap2d5d-4inbx">
+      <w:hyperlink w:history="1" r:id="rIdqm0rrtw9lc02pbabyiw_3">
         <w:r>
           <w:rPr>
             <w:color w:val="8C2B3D"/>
@@ -6287,7 +6286,7 @@
       <w:r>
         <w:t xml:space="preserve"> · </w:t>
       </w:r>
-      <w:hyperlink w:history="1" r:id="rId62sgmf5ew-if3l7cheq_w">
+      <w:hyperlink w:history="1" r:id="rIdbgrqwbrgecwfedvh8ze0m">
         <w:r>
           <w:rPr>
             <w:color w:val="8C2B3D"/>
@@ -6299,7 +6298,7 @@
       <w:r>
         <w:t xml:space="preserve"> · </w:t>
       </w:r>
-      <w:hyperlink w:history="1" r:id="rId9ihywglqyk_qy1nymrf0x">
+      <w:hyperlink w:history="1" r:id="rIdewgb8e4gidt1j1kcardvl">
         <w:r>
           <w:rPr>
             <w:color w:val="8C2B3D"/>
@@ -6424,7 +6423,7 @@
     </w:p>
     <w:tbl>
       <w:tblPr>
-        <w:tblW w:type="dxa" w:w="9173"/>
+        <w:tblW w:type="dxa" w:w="8049"/>
         <w:tblBorders>
           <w:top w:val="single" w:color="D1AEAB" w:sz="4"/>
           <w:left w:val="single" w:color="D1AEAB" w:sz="4"/>
@@ -6435,8 +6434,8 @@
         </w:tblBorders>
       </w:tblPr>
       <w:tblGrid>
-        <w:gridCol w:w="2989"/>
-        <w:gridCol w:w="6184"/>
+        <w:gridCol w:w="2623"/>
+        <w:gridCol w:w="5426"/>
       </w:tblGrid>
       <w:tr>
         <w:trPr>
@@ -6444,7 +6443,7 @@
         </w:trPr>
         <w:tc>
           <w:tcPr>
-            <w:tcW w:type="dxa" w:w="2989"/>
+            <w:tcW w:type="dxa" w:w="2623"/>
             <w:shd w:fill="8C2B3D" w:val="clear"/>
             <w:tcMar>
               <w:top w:type="dxa" w:w="90"/>
@@ -6472,7 +6471,7 @@
         </w:tc>
         <w:tc>
           <w:tcPr>
-            <w:tcW w:type="dxa" w:w="6184"/>
+            <w:tcW w:type="dxa" w:w="5426"/>
             <w:shd w:fill="8C2B3D" w:val="clear"/>
             <w:tcMar>
               <w:top w:type="dxa" w:w="90"/>
@@ -6502,7 +6501,7 @@
       <w:tr>
         <w:tc>
           <w:tcPr>
-            <w:tcW w:type="dxa" w:w="2989"/>
+            <w:tcW w:type="dxa" w:w="2623"/>
             <w:shd w:fill="F6F0EF" w:val="clear"/>
             <w:tcMar>
               <w:top w:type="dxa" w:w="90"/>
@@ -6527,7 +6526,7 @@
         </w:tc>
         <w:tc>
           <w:tcPr>
-            <w:tcW w:type="dxa" w:w="6184"/>
+            <w:tcW w:type="dxa" w:w="5426"/>
             <w:shd w:fill="F6F0EF" w:val="clear"/>
             <w:tcMar>
               <w:top w:type="dxa" w:w="90"/>
@@ -6550,7 +6549,7 @@
       <w:tr>
         <w:tc>
           <w:tcPr>
-            <w:tcW w:type="dxa" w:w="2989"/>
+            <w:tcW w:type="dxa" w:w="2623"/>
             <w:tcMar>
               <w:top w:type="dxa" w:w="90"/>
               <w:left w:type="dxa" w:w="130"/>
@@ -6574,7 +6573,7 @@
         </w:tc>
         <w:tc>
           <w:tcPr>
-            <w:tcW w:type="dxa" w:w="6184"/>
+            <w:tcW w:type="dxa" w:w="5426"/>
             <w:tcMar>
               <w:top w:type="dxa" w:w="90"/>
               <w:left w:type="dxa" w:w="130"/>
@@ -6596,7 +6595,7 @@
       <w:tr>
         <w:tc>
           <w:tcPr>
-            <w:tcW w:type="dxa" w:w="2989"/>
+            <w:tcW w:type="dxa" w:w="2623"/>
             <w:shd w:fill="F6F0EF" w:val="clear"/>
             <w:tcMar>
               <w:top w:type="dxa" w:w="90"/>
@@ -6621,7 +6620,7 @@
         </w:tc>
         <w:tc>
           <w:tcPr>
-            <w:tcW w:type="dxa" w:w="6184"/>
+            <w:tcW w:type="dxa" w:w="5426"/>
             <w:shd w:fill="F6F0EF" w:val="clear"/>
             <w:tcMar>
               <w:top w:type="dxa" w:w="90"/>
@@ -6644,7 +6643,7 @@
       <w:tr>
         <w:tc>
           <w:tcPr>
-            <w:tcW w:type="dxa" w:w="2989"/>
+            <w:tcW w:type="dxa" w:w="2623"/>
             <w:tcMar>
               <w:top w:type="dxa" w:w="90"/>
               <w:left w:type="dxa" w:w="130"/>
@@ -6668,7 +6667,7 @@
         </w:tc>
         <w:tc>
           <w:tcPr>
-            <w:tcW w:type="dxa" w:w="6184"/>
+            <w:tcW w:type="dxa" w:w="5426"/>
             <w:tcMar>
               <w:top w:type="dxa" w:w="90"/>
               <w:left w:type="dxa" w:w="130"/>
@@ -6716,7 +6715,7 @@
       </w:r>
       <w:r>
         <w:rPr>
-          <w:rFonts w:ascii="Consolas" w:cs="Consolas" w:eastAsia="Consolas" w:hAnsi="Consolas"/>
+          <w:rFonts w:ascii="Roboto Mono" w:cs="Roboto Mono" w:eastAsia="Roboto Mono" w:hAnsi="Roboto Mono"/>
           <w:color w:val="8C2B3D"/>
           <w:sz w:val="19"/>
           <w:szCs w:val="19"/>
@@ -7108,7 +7107,7 @@
       </w:r>
       <w:r>
         <w:rPr>
-          <w:rFonts w:ascii="Consolas" w:cs="Consolas" w:eastAsia="Consolas" w:hAnsi="Consolas"/>
+          <w:rFonts w:ascii="Roboto Mono" w:cs="Roboto Mono" w:eastAsia="Roboto Mono" w:hAnsi="Roboto Mono"/>
           <w:color w:val="8C2B3D"/>
           <w:sz w:val="19"/>
           <w:szCs w:val="19"/>
@@ -7131,7 +7130,7 @@
       </w:r>
       <w:r>
         <w:rPr>
-          <w:rFonts w:ascii="Consolas" w:cs="Consolas" w:eastAsia="Consolas" w:hAnsi="Consolas"/>
+          <w:rFonts w:ascii="Roboto Mono" w:cs="Roboto Mono" w:eastAsia="Roboto Mono" w:hAnsi="Roboto Mono"/>
           <w:color w:val="8C2B3D"/>
           <w:sz w:val="19"/>
           <w:szCs w:val="19"/>
@@ -7269,7 +7268,7 @@
       <w:footerReference w:type="default" r:id="rId9"/>
       <w:footerReference w:type="first" r:id="rId10"/>
       <w:pgSz w:w="11909" w:h="16834" w:orient="portrait"/>
-      <w:pgMar w:top="1224" w:right="1368" w:bottom="1224" w:left="1368" w:header="708" w:footer="708" w:gutter="0"/>
+      <w:pgMar w:top="1224" w:right="1930" w:bottom="1224" w:left="1930" w:header="708" w:footer="708" w:gutter="0"/>
       <w:pgNumType/>
       <w:titlePg/>
       <w:docGrid w:linePitch="360"/>
@@ -7327,7 +7326,7 @@
     </w:pPr>
     <w:r>
       <w:rPr>
-        <w:rFonts w:ascii="Aptos" w:cs="Aptos" w:eastAsia="Aptos" w:hAnsi="Aptos"/>
+        <w:rFonts w:ascii="Inter" w:cs="Inter" w:eastAsia="Inter" w:hAnsi="Inter"/>
         <w:color w:val="B27474"/>
         <w:sz w:val="18"/>
         <w:szCs w:val="18"/>
@@ -7336,7 +7335,7 @@
     </w:r>
     <w:r>
       <w:rPr>
-        <w:rFonts w:ascii="Aptos" w:cs="Aptos" w:eastAsia="Aptos" w:hAnsi="Aptos"/>
+        <w:rFonts w:ascii="Inter" w:cs="Inter" w:eastAsia="Inter" w:hAnsi="Inter"/>
         <w:color w:val="B27474"/>
         <w:sz w:val="18"/>
         <w:szCs w:val="18"/>
@@ -7403,7 +7402,7 @@
     </w:pPr>
     <w:r>
       <w:rPr>
-        <w:rFonts w:ascii="Aptos" w:cs="Aptos" w:eastAsia="Aptos" w:hAnsi="Aptos"/>
+        <w:rFonts w:ascii="Inter" w:cs="Inter" w:eastAsia="Inter" w:hAnsi="Inter"/>
         <w:color w:val="B27474"/>
         <w:sz w:val="17"/>
         <w:szCs w:val="17"/>
@@ -7583,7 +7582,7 @@
   <w:docDefaults>
     <w:rPrDefault>
       <w:rPr>
-        <w:rFonts w:ascii="Aptos" w:cs="Aptos" w:eastAsia="Aptos" w:hAnsi="Aptos"/>
+        <w:rFonts w:ascii="Inter" w:cs="Inter" w:eastAsia="Inter" w:hAnsi="Inter"/>
         <w:color w:val="3E424B"/>
         <w:sz w:val="22"/>
         <w:szCs w:val="22"/>
@@ -7591,7 +7590,7 @@
     </w:rPrDefault>
     <w:pPrDefault>
       <w:pPr>
-        <w:spacing w:after="160" w:line="300" w:lineRule="auto"/>
+        <w:spacing w:after="180" w:line="336" w:lineRule="auto"/>
       </w:pPr>
     </w:pPrDefault>
   </w:docDefaults>
@@ -7657,7 +7656,7 @@
       <w:spacing w:after="80" w:before="220"/>
     </w:pPr>
     <w:rPr>
-      <w:rFonts w:ascii="Aptos" w:cs="Aptos" w:eastAsia="Aptos" w:hAnsi="Aptos"/>
+      <w:rFonts w:ascii="Inter" w:cs="Inter" w:eastAsia="Inter" w:hAnsi="Inter"/>
       <w:b/>
       <w:bCs/>
       <w:color w:val="B27474"/>
@@ -7675,7 +7674,7 @@
       <w:spacing w:after="60" w:before="180"/>
     </w:pPr>
     <w:rPr>
-      <w:rFonts w:ascii="Aptos" w:cs="Aptos" w:eastAsia="Aptos" w:hAnsi="Aptos"/>
+      <w:rFonts w:ascii="Inter" w:cs="Inter" w:eastAsia="Inter" w:hAnsi="Inter"/>
       <w:b/>
       <w:bCs/>
       <w:i/>
@@ -7807,10 +7806,10 @@
     <w:basedOn w:val="Normal"/>
     <w:qFormat/>
     <w:pPr>
-      <w:spacing w:after="200" w:line="324" w:lineRule="auto"/>
+      <w:spacing w:after="220" w:line="352" w:lineRule="auto"/>
     </w:pPr>
     <w:rPr>
-      <w:rFonts w:ascii="Aptos" w:cs="Aptos" w:eastAsia="Aptos" w:hAnsi="Aptos"/>
+      <w:rFonts w:ascii="Inter" w:cs="Inter" w:eastAsia="Inter" w:hAnsi="Inter"/>
       <w:color w:val="3E424B"/>
       <w:sz w:val="23"/>
       <w:szCs w:val="23"/>
@@ -7823,7 +7822,7 @@
       <w:spacing w:after="120"/>
     </w:pPr>
     <w:rPr>
-      <w:rFonts w:ascii="Aptos" w:cs="Aptos" w:eastAsia="Aptos" w:hAnsi="Aptos"/>
+      <w:rFonts w:ascii="Inter" w:cs="Inter" w:eastAsia="Inter" w:hAnsi="Inter"/>
       <w:color w:val="B27474"/>
       <w:sz w:val="19"/>
       <w:szCs w:val="19"/>
@@ -7841,7 +7840,7 @@
       <w:ind w:left="340" w:right="200"/>
     </w:pPr>
     <w:rPr>
-      <w:rFonts w:ascii="Aptos" w:cs="Aptos" w:eastAsia="Aptos" w:hAnsi="Aptos"/>
+      <w:rFonts w:ascii="Inter" w:cs="Inter" w:eastAsia="Inter" w:hAnsi="Inter"/>
       <w:color w:val="3E424B"/>
       <w:sz w:val="21"/>
       <w:szCs w:val="21"/>
@@ -7856,7 +7855,7 @@
       <w:ind w:left="200"/>
     </w:pPr>
     <w:rPr>
-      <w:rFonts w:ascii="Consolas" w:cs="Consolas" w:eastAsia="Consolas" w:hAnsi="Consolas"/>
+      <w:rFonts w:ascii="Roboto Mono" w:cs="Roboto Mono" w:eastAsia="Roboto Mono" w:hAnsi="Roboto Mono"/>
       <w:color w:val="3E424B"/>
       <w:sz w:val="18"/>
       <w:szCs w:val="18"/>
@@ -7872,7 +7871,7 @@
       <w:spacing w:after="120" w:before="320" w:line="288" w:lineRule="auto"/>
     </w:pPr>
     <w:rPr>
-      <w:rFonts w:ascii="Aptos" w:cs="Aptos" w:eastAsia="Aptos" w:hAnsi="Aptos"/>
+      <w:rFonts w:ascii="Inter" w:cs="Inter" w:eastAsia="Inter" w:hAnsi="Inter"/>
       <w:i/>
       <w:iCs/>
       <w:color w:val="B27474"/>

</xml_diff>

<commit_message>
Remove outdated `21-manual-voz-contenido.docx` and update `21-manual-voz-copywriting-editorial` files for clarity and consistency. The `.docx` version is regenerated from the Markdown source to include missing sections and ensure alignment with the latest editorial standards. Updated README to reflect the addition of the new manual in the document generation process.
</commit_message>
<xml_diff>
--- a/docs/24-brief-editorial-blog-y-visibilidad.docx
+++ b/docs/24-brief-editorial-blog-y-visibilidad.docx
@@ -294,7 +294,7 @@
             <w:r>
               <w:t xml:space="preserve">Rafael Figueredo Oropeza — </w:t>
             </w:r>
-            <w:hyperlink w:history="1" r:id="rIduzqb-lur1yazg_cfpuqvk">
+            <w:hyperlink w:history="1" r:id="rIdmm4_k1n-ns8udc7rvxix2">
               <w:r>
                 <w:rPr>
                   <w:color w:val="8C2B3D"/>
@@ -306,7 +306,7 @@
             <w:r>
               <w:t xml:space="preserve"> · </w:t>
             </w:r>
-            <w:hyperlink w:history="1" r:id="rIdmmkb-2rg3it5k2c8twgvl">
+            <w:hyperlink w:history="1" r:id="rIdcvfx6i4yzwsb4fwr90tov">
               <w:r>
                 <w:rPr>
                   <w:color w:val="8C2B3D"/>
@@ -440,7 +440,7 @@
       <w:r>
         <w:t xml:space="preserve">El sitio </w:t>
       </w:r>
-      <w:hyperlink w:history="1" r:id="rIdottikahbefnfrxkmo7_x7">
+      <w:hyperlink w:history="1" r:id="rIdzwz4sz-46_aoegsn___d2">
         <w:r>
           <w:rPr>
             <w:color w:val="8C2B3D"/>
@@ -6262,7 +6262,7 @@
       <w:r>
         <w:t xml:space="preserve"> </w:t>
       </w:r>
-      <w:hyperlink w:history="1" r:id="rIdw15dltq4jkbgjufj6zzuk">
+      <w:hyperlink w:history="1" r:id="rId3hxjgnz0oyylt2wznpgf2">
         <w:r>
           <w:rPr>
             <w:color w:val="8C2B3D"/>
@@ -6274,7 +6274,7 @@
       <w:r>
         <w:t xml:space="preserve"> · </w:t>
       </w:r>
-      <w:hyperlink w:history="1" r:id="rIdqm0rrtw9lc02pbabyiw_3">
+      <w:hyperlink w:history="1" r:id="rIdepp8izdtvfwuuqju6ct92">
         <w:r>
           <w:rPr>
             <w:color w:val="8C2B3D"/>
@@ -6286,7 +6286,7 @@
       <w:r>
         <w:t xml:space="preserve"> · </w:t>
       </w:r>
-      <w:hyperlink w:history="1" r:id="rIdbgrqwbrgecwfedvh8ze0m">
+      <w:hyperlink w:history="1" r:id="rIdegxrdh3iryuvukk2vv_d7">
         <w:r>
           <w:rPr>
             <w:color w:val="8C2B3D"/>
@@ -6298,7 +6298,7 @@
       <w:r>
         <w:t xml:space="preserve"> · </w:t>
       </w:r>
-      <w:hyperlink w:history="1" r:id="rIdewgb8e4gidt1j1kcardvl">
+      <w:hyperlink w:history="1" r:id="rId_t6kxewhptjzmhgmfarke">
         <w:r>
           <w:rPr>
             <w:color w:val="8C2B3D"/>

</xml_diff>